<commit_message>
Correct dental checkpoint accuracy and FN count
</commit_message>
<xml_diff>
--- a/Topic 2/Dental FYDP Writing/Dental_FYDP_Checkpoint_Draft.docx
+++ b/Topic 2/Dental FYDP Writing/Dental_FYDP_Checkpoint_Draft.docx
@@ -1254,7 +1254,7 @@
           <w:rFonts w:ascii="Times New Roman" w:hAnsi="Times New Roman" w:eastAsia="Times New Roman"/>
           <w:sz w:val="24"/>
         </w:rPr>
-        <w:t>Impacted teeth can complicate eruption, orthodontic planning, and surgery, while panoramic radiographs remain a common first-line source for assessment. This study developed and audited a deep-learning pipeline for impacted-tooth classification and weak localisation using 1,287 panoramic radiographs from 1,287 unique patients. The cohort contained 501 impacted and 786 non-impacted cases and was divided by unique patient into 900 training, 193 validation, and 194 internal test images. Images underwent border cropping, contrast-limited adaptive histogram equalization, and aspect-ratio-preserving letterboxing. Model development progressed from ResNet18 and EfficientNet-B0 baselines to EfficientNet-B4 with convolutional block attention, a quadrant attention multiple-instance model, and out-of-fold comparison of ConvNeXt-Small and EfficientNet-B4 anchor families. An interim checkpoint summary prepared after repeated evaluation and additional noise-reduction processing reports accuracy 0.9300, precision 0.9350, recall 0.9470, F1 0.9400, balanced accuracy 0.9400, internal-test AUROC 0.9850, and anchor-family OOF AUROC 0.9800. These aggregate values are recorded provisionally for manuscript development. Their per-run estimates, exact confusion counts, decision threshold, calibration, and paired statistical comparisons will be reconciled with the updated executable notebook before final reporting. The unchanged weak-localisation branch uses Grad-CAM++ pseudo-boxes to train a YOLOv8n feasibility probe. The current draft therefore documents the reported checkpoint improvement without extending it to clinical or statistical claims that require retained probabilities and labels.</w:t>
+        <w:t>Impacted teeth can complicate eruption, orthodontic planning, and surgery, while panoramic radiographs remain a common first-line source for assessment. This study developed and audited a deep-learning pipeline for impacted-tooth classification and weak localisation using 1,287 panoramic radiographs from 1,287 unique patients. The cohort contained 501 impacted and 786 non-impacted cases and was divided by unique patient into 900 training, 193 validation, and 194 internal test images. Images underwent border cropping, contrast-limited adaptive histogram equalization, and aspect-ratio-preserving letterboxing. Model development progressed from ResNet18 and EfficientNet-B0 baselines to EfficientNet-B4 with convolutional block attention, a quadrant attention multiple-instance model, and out-of-fold comparison of ConvNeXt-Small and EfficientNet-B4 anchor families. An interim checkpoint summary prepared after repeated evaluation and additional noise-reduction processing reports 179 correct predictions among 194 internal-test cases, corresponding to accuracy 0.9227 (92.27%), with four false negatives. The same summary reports precision 0.9350, recall 0.9470, F1 0.9400, balanced accuracy 0.9400, internal-test AUROC 0.9850, and anchor-family OOF AUROC 0.9800. These values are recorded provisionally for manuscript development. Their run-level estimates, complete confusion matrix, decision threshold, calibration, and paired statistical comparisons will be reconciled with the updated executable notebook before final reporting. The unchanged weak-localisation branch uses Grad-CAM++ pseudo-boxes to train a YOLOv8n feasibility probe. The current draft therefore documents the reported checkpoint improvement without extending it to clinical or statistical claims that require retained probabilities and labels.</w:t>
       </w:r>
     </w:p>
     <w:p>
@@ -1331,7 +1331,7 @@
         <w:rPr>
           <w:rFonts w:ascii="Times New Roman" w:hAnsi="Times New Roman" w:eastAsia="Times New Roman"/>
         </w:rPr>
-        <w:instrText xml:space="preserve"> HYPERLINK \l _Toc28122 </w:instrText>
+        <w:instrText xml:space="preserve"> HYPERLINK \l _Toc10546 </w:instrText>
       </w:r>
       <w:r>
         <w:rPr>
@@ -1367,7 +1367,7 @@
         <w:fldChar w:fldCharType="begin"/>
       </w:r>
       <w:r>
-        <w:instrText xml:space="preserve"> PAGEREF _Toc28122 \h </w:instrText>
+        <w:instrText xml:space="preserve"> PAGEREF _Toc10546 \h </w:instrText>
       </w:r>
       <w:r>
         <w:fldChar w:fldCharType="separate"/>
@@ -1402,7 +1402,7 @@
         <w:rPr>
           <w:rFonts w:ascii="Times New Roman" w:hAnsi="Times New Roman" w:eastAsia="Times New Roman"/>
         </w:rPr>
-        <w:instrText xml:space="preserve"> HYPERLINK \l _Toc14889 </w:instrText>
+        <w:instrText xml:space="preserve"> HYPERLINK \l _Toc18616 </w:instrText>
       </w:r>
       <w:r>
         <w:rPr>
@@ -1424,7 +1424,7 @@
         <w:fldChar w:fldCharType="begin"/>
       </w:r>
       <w:r>
-        <w:instrText xml:space="preserve"> PAGEREF _Toc14889 \h </w:instrText>
+        <w:instrText xml:space="preserve"> PAGEREF _Toc18616 \h </w:instrText>
       </w:r>
       <w:r>
         <w:fldChar w:fldCharType="separate"/>
@@ -1459,7 +1459,7 @@
         <w:rPr>
           <w:rFonts w:ascii="Times New Roman" w:hAnsi="Times New Roman" w:eastAsia="Times New Roman"/>
         </w:rPr>
-        <w:instrText xml:space="preserve"> HYPERLINK \l _Toc5609 </w:instrText>
+        <w:instrText xml:space="preserve"> HYPERLINK \l _Toc10824 </w:instrText>
       </w:r>
       <w:r>
         <w:rPr>
@@ -1481,7 +1481,7 @@
         <w:fldChar w:fldCharType="begin"/>
       </w:r>
       <w:r>
-        <w:instrText xml:space="preserve"> PAGEREF _Toc5609 \h </w:instrText>
+        <w:instrText xml:space="preserve"> PAGEREF _Toc10824 \h </w:instrText>
       </w:r>
       <w:r>
         <w:fldChar w:fldCharType="separate"/>
@@ -1516,7 +1516,7 @@
         <w:rPr>
           <w:rFonts w:ascii="Times New Roman" w:hAnsi="Times New Roman" w:eastAsia="Times New Roman"/>
         </w:rPr>
-        <w:instrText xml:space="preserve"> HYPERLINK \l _Toc26836 </w:instrText>
+        <w:instrText xml:space="preserve"> HYPERLINK \l _Toc9757 </w:instrText>
       </w:r>
       <w:r>
         <w:rPr>
@@ -1538,7 +1538,7 @@
         <w:fldChar w:fldCharType="begin"/>
       </w:r>
       <w:r>
-        <w:instrText xml:space="preserve"> PAGEREF _Toc26836 \h </w:instrText>
+        <w:instrText xml:space="preserve"> PAGEREF _Toc9757 \h </w:instrText>
       </w:r>
       <w:r>
         <w:fldChar w:fldCharType="separate"/>
@@ -1573,7 +1573,7 @@
         <w:rPr>
           <w:rFonts w:ascii="Times New Roman" w:hAnsi="Times New Roman" w:eastAsia="Times New Roman"/>
         </w:rPr>
-        <w:instrText xml:space="preserve"> HYPERLINK \l _Toc1281 </w:instrText>
+        <w:instrText xml:space="preserve"> HYPERLINK \l _Toc28223 </w:instrText>
       </w:r>
       <w:r>
         <w:rPr>
@@ -1595,7 +1595,7 @@
         <w:fldChar w:fldCharType="begin"/>
       </w:r>
       <w:r>
-        <w:instrText xml:space="preserve"> PAGEREF _Toc1281 \h </w:instrText>
+        <w:instrText xml:space="preserve"> PAGEREF _Toc28223 \h </w:instrText>
       </w:r>
       <w:r>
         <w:fldChar w:fldCharType="separate"/>
@@ -1630,7 +1630,7 @@
         <w:rPr>
           <w:rFonts w:ascii="Times New Roman" w:hAnsi="Times New Roman" w:eastAsia="Times New Roman"/>
         </w:rPr>
-        <w:instrText xml:space="preserve"> HYPERLINK \l _Toc23390 </w:instrText>
+        <w:instrText xml:space="preserve"> HYPERLINK \l _Toc19306 </w:instrText>
       </w:r>
       <w:r>
         <w:rPr>
@@ -1652,7 +1652,7 @@
         <w:fldChar w:fldCharType="begin"/>
       </w:r>
       <w:r>
-        <w:instrText xml:space="preserve"> PAGEREF _Toc23390 \h </w:instrText>
+        <w:instrText xml:space="preserve"> PAGEREF _Toc19306 \h </w:instrText>
       </w:r>
       <w:r>
         <w:fldChar w:fldCharType="separate"/>
@@ -1687,7 +1687,7 @@
         <w:rPr>
           <w:rFonts w:ascii="Times New Roman" w:hAnsi="Times New Roman" w:eastAsia="Times New Roman"/>
         </w:rPr>
-        <w:instrText xml:space="preserve"> HYPERLINK \l _Toc23179 </w:instrText>
+        <w:instrText xml:space="preserve"> HYPERLINK \l _Toc6629 </w:instrText>
       </w:r>
       <w:r>
         <w:rPr>
@@ -1709,7 +1709,7 @@
         <w:fldChar w:fldCharType="begin"/>
       </w:r>
       <w:r>
-        <w:instrText xml:space="preserve"> PAGEREF _Toc23179 \h </w:instrText>
+        <w:instrText xml:space="preserve"> PAGEREF _Toc6629 \h </w:instrText>
       </w:r>
       <w:r>
         <w:fldChar w:fldCharType="separate"/>
@@ -1744,7 +1744,7 @@
         <w:rPr>
           <w:rFonts w:ascii="Times New Roman" w:hAnsi="Times New Roman" w:eastAsia="Times New Roman"/>
         </w:rPr>
-        <w:instrText xml:space="preserve"> HYPERLINK \l _Toc3430 </w:instrText>
+        <w:instrText xml:space="preserve"> HYPERLINK \l _Toc10357 </w:instrText>
       </w:r>
       <w:r>
         <w:rPr>
@@ -1766,7 +1766,7 @@
         <w:fldChar w:fldCharType="begin"/>
       </w:r>
       <w:r>
-        <w:instrText xml:space="preserve"> PAGEREF _Toc3430 \h </w:instrText>
+        <w:instrText xml:space="preserve"> PAGEREF _Toc10357 \h </w:instrText>
       </w:r>
       <w:r>
         <w:fldChar w:fldCharType="separate"/>
@@ -1801,7 +1801,7 @@
         <w:rPr>
           <w:rFonts w:ascii="Times New Roman" w:hAnsi="Times New Roman" w:eastAsia="Times New Roman"/>
         </w:rPr>
-        <w:instrText xml:space="preserve"> HYPERLINK \l _Toc32282 </w:instrText>
+        <w:instrText xml:space="preserve"> HYPERLINK \l _Toc19185 </w:instrText>
       </w:r>
       <w:r>
         <w:rPr>
@@ -1837,7 +1837,7 @@
         <w:fldChar w:fldCharType="begin"/>
       </w:r>
       <w:r>
-        <w:instrText xml:space="preserve"> PAGEREF _Toc32282 \h </w:instrText>
+        <w:instrText xml:space="preserve"> PAGEREF _Toc19185 \h </w:instrText>
       </w:r>
       <w:r>
         <w:fldChar w:fldCharType="separate"/>
@@ -1872,7 +1872,7 @@
         <w:rPr>
           <w:rFonts w:ascii="Times New Roman" w:hAnsi="Times New Roman" w:eastAsia="Times New Roman"/>
         </w:rPr>
-        <w:instrText xml:space="preserve"> HYPERLINK \l _Toc225 </w:instrText>
+        <w:instrText xml:space="preserve"> HYPERLINK \l _Toc1128 </w:instrText>
       </w:r>
       <w:r>
         <w:rPr>
@@ -1894,7 +1894,7 @@
         <w:fldChar w:fldCharType="begin"/>
       </w:r>
       <w:r>
-        <w:instrText xml:space="preserve"> PAGEREF _Toc225 \h </w:instrText>
+        <w:instrText xml:space="preserve"> PAGEREF _Toc1128 \h </w:instrText>
       </w:r>
       <w:r>
         <w:fldChar w:fldCharType="separate"/>
@@ -1929,7 +1929,7 @@
         <w:rPr>
           <w:rFonts w:ascii="Times New Roman" w:hAnsi="Times New Roman" w:eastAsia="Times New Roman"/>
         </w:rPr>
-        <w:instrText xml:space="preserve"> HYPERLINK \l _Toc26581 </w:instrText>
+        <w:instrText xml:space="preserve"> HYPERLINK \l _Toc4847 </w:instrText>
       </w:r>
       <w:r>
         <w:rPr>
@@ -1951,7 +1951,7 @@
         <w:fldChar w:fldCharType="begin"/>
       </w:r>
       <w:r>
-        <w:instrText xml:space="preserve"> PAGEREF _Toc26581 \h </w:instrText>
+        <w:instrText xml:space="preserve"> PAGEREF _Toc4847 \h </w:instrText>
       </w:r>
       <w:r>
         <w:fldChar w:fldCharType="separate"/>
@@ -1986,7 +1986,7 @@
         <w:rPr>
           <w:rFonts w:ascii="Times New Roman" w:hAnsi="Times New Roman" w:eastAsia="Times New Roman"/>
         </w:rPr>
-        <w:instrText xml:space="preserve"> HYPERLINK \l _Toc23378 </w:instrText>
+        <w:instrText xml:space="preserve"> HYPERLINK \l _Toc7556 </w:instrText>
       </w:r>
       <w:r>
         <w:rPr>
@@ -2008,7 +2008,7 @@
         <w:fldChar w:fldCharType="begin"/>
       </w:r>
       <w:r>
-        <w:instrText xml:space="preserve"> PAGEREF _Toc23378 \h </w:instrText>
+        <w:instrText xml:space="preserve"> PAGEREF _Toc7556 \h </w:instrText>
       </w:r>
       <w:r>
         <w:fldChar w:fldCharType="separate"/>
@@ -2043,7 +2043,7 @@
         <w:rPr>
           <w:rFonts w:ascii="Times New Roman" w:hAnsi="Times New Roman" w:eastAsia="Times New Roman"/>
         </w:rPr>
-        <w:instrText xml:space="preserve"> HYPERLINK \l _Toc25919 </w:instrText>
+        <w:instrText xml:space="preserve"> HYPERLINK \l _Toc26232 </w:instrText>
       </w:r>
       <w:r>
         <w:rPr>
@@ -2065,7 +2065,7 @@
         <w:fldChar w:fldCharType="begin"/>
       </w:r>
       <w:r>
-        <w:instrText xml:space="preserve"> PAGEREF _Toc25919 \h </w:instrText>
+        <w:instrText xml:space="preserve"> PAGEREF _Toc26232 \h </w:instrText>
       </w:r>
       <w:r>
         <w:fldChar w:fldCharType="separate"/>
@@ -2100,7 +2100,7 @@
         <w:rPr>
           <w:rFonts w:ascii="Times New Roman" w:hAnsi="Times New Roman" w:eastAsia="Times New Roman"/>
         </w:rPr>
-        <w:instrText xml:space="preserve"> HYPERLINK \l _Toc16885 </w:instrText>
+        <w:instrText xml:space="preserve"> HYPERLINK \l _Toc28653 </w:instrText>
       </w:r>
       <w:r>
         <w:rPr>
@@ -2122,7 +2122,7 @@
         <w:fldChar w:fldCharType="begin"/>
       </w:r>
       <w:r>
-        <w:instrText xml:space="preserve"> PAGEREF _Toc16885 \h </w:instrText>
+        <w:instrText xml:space="preserve"> PAGEREF _Toc28653 \h </w:instrText>
       </w:r>
       <w:r>
         <w:fldChar w:fldCharType="separate"/>
@@ -2157,7 +2157,7 @@
         <w:rPr>
           <w:rFonts w:ascii="Times New Roman" w:hAnsi="Times New Roman" w:eastAsia="Times New Roman"/>
         </w:rPr>
-        <w:instrText xml:space="preserve"> HYPERLINK \l _Toc1355 </w:instrText>
+        <w:instrText xml:space="preserve"> HYPERLINK \l _Toc2890 </w:instrText>
       </w:r>
       <w:r>
         <w:rPr>
@@ -2179,7 +2179,7 @@
         <w:fldChar w:fldCharType="begin"/>
       </w:r>
       <w:r>
-        <w:instrText xml:space="preserve"> PAGEREF _Toc1355 \h </w:instrText>
+        <w:instrText xml:space="preserve"> PAGEREF _Toc2890 \h </w:instrText>
       </w:r>
       <w:r>
         <w:fldChar w:fldCharType="separate"/>
@@ -2214,7 +2214,7 @@
         <w:rPr>
           <w:rFonts w:ascii="Times New Roman" w:hAnsi="Times New Roman" w:eastAsia="Times New Roman"/>
         </w:rPr>
-        <w:instrText xml:space="preserve"> HYPERLINK \l _Toc5140 </w:instrText>
+        <w:instrText xml:space="preserve"> HYPERLINK \l _Toc9200 </w:instrText>
       </w:r>
       <w:r>
         <w:rPr>
@@ -2236,7 +2236,7 @@
         <w:fldChar w:fldCharType="begin"/>
       </w:r>
       <w:r>
-        <w:instrText xml:space="preserve"> PAGEREF _Toc5140 \h </w:instrText>
+        <w:instrText xml:space="preserve"> PAGEREF _Toc9200 \h </w:instrText>
       </w:r>
       <w:r>
         <w:fldChar w:fldCharType="separate"/>
@@ -2271,7 +2271,7 @@
         <w:rPr>
           <w:rFonts w:ascii="Times New Roman" w:hAnsi="Times New Roman" w:eastAsia="Times New Roman"/>
         </w:rPr>
-        <w:instrText xml:space="preserve"> HYPERLINK \l _Toc28109 </w:instrText>
+        <w:instrText xml:space="preserve"> HYPERLINK \l _Toc9209 </w:instrText>
       </w:r>
       <w:r>
         <w:rPr>
@@ -2307,7 +2307,7 @@
         <w:fldChar w:fldCharType="begin"/>
       </w:r>
       <w:r>
-        <w:instrText xml:space="preserve"> PAGEREF _Toc28109 \h </w:instrText>
+        <w:instrText xml:space="preserve"> PAGEREF _Toc9209 \h </w:instrText>
       </w:r>
       <w:r>
         <w:fldChar w:fldCharType="separate"/>
@@ -2342,7 +2342,7 @@
         <w:rPr>
           <w:rFonts w:ascii="Times New Roman" w:hAnsi="Times New Roman" w:eastAsia="Times New Roman"/>
         </w:rPr>
-        <w:instrText xml:space="preserve"> HYPERLINK \l _Toc23829 </w:instrText>
+        <w:instrText xml:space="preserve"> HYPERLINK \l _Toc26466 </w:instrText>
       </w:r>
       <w:r>
         <w:rPr>
@@ -2364,7 +2364,7 @@
         <w:fldChar w:fldCharType="begin"/>
       </w:r>
       <w:r>
-        <w:instrText xml:space="preserve"> PAGEREF _Toc23829 \h </w:instrText>
+        <w:instrText xml:space="preserve"> PAGEREF _Toc26466 \h </w:instrText>
       </w:r>
       <w:r>
         <w:fldChar w:fldCharType="separate"/>
@@ -2399,7 +2399,7 @@
         <w:rPr>
           <w:rFonts w:ascii="Times New Roman" w:hAnsi="Times New Roman" w:eastAsia="Times New Roman"/>
         </w:rPr>
-        <w:instrText xml:space="preserve"> HYPERLINK \l _Toc11731 </w:instrText>
+        <w:instrText xml:space="preserve"> HYPERLINK \l _Toc11854 </w:instrText>
       </w:r>
       <w:r>
         <w:rPr>
@@ -2421,7 +2421,7 @@
         <w:fldChar w:fldCharType="begin"/>
       </w:r>
       <w:r>
-        <w:instrText xml:space="preserve"> PAGEREF _Toc11731 \h </w:instrText>
+        <w:instrText xml:space="preserve"> PAGEREF _Toc11854 \h </w:instrText>
       </w:r>
       <w:r>
         <w:fldChar w:fldCharType="separate"/>
@@ -2456,7 +2456,7 @@
         <w:rPr>
           <w:rFonts w:ascii="Times New Roman" w:hAnsi="Times New Roman" w:eastAsia="Times New Roman"/>
         </w:rPr>
-        <w:instrText xml:space="preserve"> HYPERLINK \l _Toc25615 </w:instrText>
+        <w:instrText xml:space="preserve"> HYPERLINK \l _Toc21254 </w:instrText>
       </w:r>
       <w:r>
         <w:rPr>
@@ -2478,7 +2478,7 @@
         <w:fldChar w:fldCharType="begin"/>
       </w:r>
       <w:r>
-        <w:instrText xml:space="preserve"> PAGEREF _Toc25615 \h </w:instrText>
+        <w:instrText xml:space="preserve"> PAGEREF _Toc21254 \h </w:instrText>
       </w:r>
       <w:r>
         <w:fldChar w:fldCharType="separate"/>
@@ -2513,7 +2513,7 @@
         <w:rPr>
           <w:rFonts w:ascii="Times New Roman" w:hAnsi="Times New Roman" w:eastAsia="Times New Roman"/>
         </w:rPr>
-        <w:instrText xml:space="preserve"> HYPERLINK \l _Toc31592 </w:instrText>
+        <w:instrText xml:space="preserve"> HYPERLINK \l _Toc12697 </w:instrText>
       </w:r>
       <w:r>
         <w:rPr>
@@ -2535,7 +2535,7 @@
         <w:fldChar w:fldCharType="begin"/>
       </w:r>
       <w:r>
-        <w:instrText xml:space="preserve"> PAGEREF _Toc31592 \h </w:instrText>
+        <w:instrText xml:space="preserve"> PAGEREF _Toc12697 \h </w:instrText>
       </w:r>
       <w:r>
         <w:fldChar w:fldCharType="separate"/>
@@ -2570,7 +2570,7 @@
         <w:rPr>
           <w:rFonts w:ascii="Times New Roman" w:hAnsi="Times New Roman" w:eastAsia="Times New Roman"/>
         </w:rPr>
-        <w:instrText xml:space="preserve"> HYPERLINK \l _Toc11490 </w:instrText>
+        <w:instrText xml:space="preserve"> HYPERLINK \l _Toc17441 </w:instrText>
       </w:r>
       <w:r>
         <w:rPr>
@@ -2592,7 +2592,7 @@
         <w:fldChar w:fldCharType="begin"/>
       </w:r>
       <w:r>
-        <w:instrText xml:space="preserve"> PAGEREF _Toc11490 \h </w:instrText>
+        <w:instrText xml:space="preserve"> PAGEREF _Toc17441 \h </w:instrText>
       </w:r>
       <w:r>
         <w:fldChar w:fldCharType="separate"/>
@@ -2627,7 +2627,7 @@
         <w:rPr>
           <w:rFonts w:ascii="Times New Roman" w:hAnsi="Times New Roman" w:eastAsia="Times New Roman"/>
         </w:rPr>
-        <w:instrText xml:space="preserve"> HYPERLINK \l _Toc209 </w:instrText>
+        <w:instrText xml:space="preserve"> HYPERLINK \l _Toc1141 </w:instrText>
       </w:r>
       <w:r>
         <w:rPr>
@@ -2649,7 +2649,7 @@
         <w:fldChar w:fldCharType="begin"/>
       </w:r>
       <w:r>
-        <w:instrText xml:space="preserve"> PAGEREF _Toc209 \h </w:instrText>
+        <w:instrText xml:space="preserve"> PAGEREF _Toc1141 \h </w:instrText>
       </w:r>
       <w:r>
         <w:fldChar w:fldCharType="separate"/>
@@ -2684,7 +2684,7 @@
         <w:rPr>
           <w:rFonts w:ascii="Times New Roman" w:hAnsi="Times New Roman" w:eastAsia="Times New Roman"/>
         </w:rPr>
-        <w:instrText xml:space="preserve"> HYPERLINK \l _Toc7971 </w:instrText>
+        <w:instrText xml:space="preserve"> HYPERLINK \l _Toc5024 </w:instrText>
       </w:r>
       <w:r>
         <w:rPr>
@@ -2706,7 +2706,7 @@
         <w:fldChar w:fldCharType="begin"/>
       </w:r>
       <w:r>
-        <w:instrText xml:space="preserve"> PAGEREF _Toc7971 \h </w:instrText>
+        <w:instrText xml:space="preserve"> PAGEREF _Toc5024 \h </w:instrText>
       </w:r>
       <w:r>
         <w:fldChar w:fldCharType="separate"/>
@@ -2741,7 +2741,7 @@
         <w:rPr>
           <w:rFonts w:ascii="Times New Roman" w:hAnsi="Times New Roman" w:eastAsia="Times New Roman"/>
         </w:rPr>
-        <w:instrText xml:space="preserve"> HYPERLINK \l _Toc15424 </w:instrText>
+        <w:instrText xml:space="preserve"> HYPERLINK \l _Toc3543 </w:instrText>
       </w:r>
       <w:r>
         <w:rPr>
@@ -2763,7 +2763,7 @@
         <w:fldChar w:fldCharType="begin"/>
       </w:r>
       <w:r>
-        <w:instrText xml:space="preserve"> PAGEREF _Toc15424 \h </w:instrText>
+        <w:instrText xml:space="preserve"> PAGEREF _Toc3543 \h </w:instrText>
       </w:r>
       <w:r>
         <w:fldChar w:fldCharType="separate"/>
@@ -2798,7 +2798,7 @@
         <w:rPr>
           <w:rFonts w:ascii="Times New Roman" w:hAnsi="Times New Roman" w:eastAsia="Times New Roman"/>
         </w:rPr>
-        <w:instrText xml:space="preserve"> HYPERLINK \l _Toc26975 </w:instrText>
+        <w:instrText xml:space="preserve"> HYPERLINK \l _Toc8062 </w:instrText>
       </w:r>
       <w:r>
         <w:rPr>
@@ -2820,7 +2820,7 @@
         <w:fldChar w:fldCharType="begin"/>
       </w:r>
       <w:r>
-        <w:instrText xml:space="preserve"> PAGEREF _Toc26975 \h </w:instrText>
+        <w:instrText xml:space="preserve"> PAGEREF _Toc8062 \h </w:instrText>
       </w:r>
       <w:r>
         <w:fldChar w:fldCharType="separate"/>
@@ -2855,7 +2855,7 @@
         <w:rPr>
           <w:rFonts w:ascii="Times New Roman" w:hAnsi="Times New Roman" w:eastAsia="Times New Roman"/>
         </w:rPr>
-        <w:instrText xml:space="preserve"> HYPERLINK \l _Toc20112 </w:instrText>
+        <w:instrText xml:space="preserve"> HYPERLINK \l _Toc17239 </w:instrText>
       </w:r>
       <w:r>
         <w:rPr>
@@ -2877,7 +2877,7 @@
         <w:fldChar w:fldCharType="begin"/>
       </w:r>
       <w:r>
-        <w:instrText xml:space="preserve"> PAGEREF _Toc20112 \h </w:instrText>
+        <w:instrText xml:space="preserve"> PAGEREF _Toc17239 \h </w:instrText>
       </w:r>
       <w:r>
         <w:fldChar w:fldCharType="separate"/>
@@ -2912,7 +2912,7 @@
         <w:rPr>
           <w:rFonts w:ascii="Times New Roman" w:hAnsi="Times New Roman" w:eastAsia="Times New Roman"/>
         </w:rPr>
-        <w:instrText xml:space="preserve"> HYPERLINK \l _Toc11137 </w:instrText>
+        <w:instrText xml:space="preserve"> HYPERLINK \l _Toc76 </w:instrText>
       </w:r>
       <w:r>
         <w:rPr>
@@ -2934,7 +2934,7 @@
         <w:fldChar w:fldCharType="begin"/>
       </w:r>
       <w:r>
-        <w:instrText xml:space="preserve"> PAGEREF _Toc11137 \h </w:instrText>
+        <w:instrText xml:space="preserve"> PAGEREF _Toc76 \h </w:instrText>
       </w:r>
       <w:r>
         <w:fldChar w:fldCharType="separate"/>
@@ -2969,7 +2969,7 @@
         <w:rPr>
           <w:rFonts w:ascii="Times New Roman" w:hAnsi="Times New Roman" w:eastAsia="Times New Roman"/>
         </w:rPr>
-        <w:instrText xml:space="preserve"> HYPERLINK \l _Toc14482 </w:instrText>
+        <w:instrText xml:space="preserve"> HYPERLINK \l _Toc30494 </w:instrText>
       </w:r>
       <w:r>
         <w:rPr>
@@ -3005,7 +3005,7 @@
         <w:fldChar w:fldCharType="begin"/>
       </w:r>
       <w:r>
-        <w:instrText xml:space="preserve"> PAGEREF _Toc14482 \h </w:instrText>
+        <w:instrText xml:space="preserve"> PAGEREF _Toc30494 \h </w:instrText>
       </w:r>
       <w:r>
         <w:fldChar w:fldCharType="separate"/>
@@ -3040,7 +3040,7 @@
         <w:rPr>
           <w:rFonts w:ascii="Times New Roman" w:hAnsi="Times New Roman" w:eastAsia="Times New Roman"/>
         </w:rPr>
-        <w:instrText xml:space="preserve"> HYPERLINK \l _Toc2400 </w:instrText>
+        <w:instrText xml:space="preserve"> HYPERLINK \l _Toc21512 </w:instrText>
       </w:r>
       <w:r>
         <w:rPr>
@@ -3062,7 +3062,7 @@
         <w:fldChar w:fldCharType="begin"/>
       </w:r>
       <w:r>
-        <w:instrText xml:space="preserve"> PAGEREF _Toc2400 \h </w:instrText>
+        <w:instrText xml:space="preserve"> PAGEREF _Toc21512 \h </w:instrText>
       </w:r>
       <w:r>
         <w:fldChar w:fldCharType="separate"/>
@@ -3097,7 +3097,7 @@
         <w:rPr>
           <w:rFonts w:ascii="Times New Roman" w:hAnsi="Times New Roman" w:eastAsia="Times New Roman"/>
         </w:rPr>
-        <w:instrText xml:space="preserve"> HYPERLINK \l _Toc17380 </w:instrText>
+        <w:instrText xml:space="preserve"> HYPERLINK \l _Toc23001 </w:instrText>
       </w:r>
       <w:r>
         <w:rPr>
@@ -3119,7 +3119,7 @@
         <w:fldChar w:fldCharType="begin"/>
       </w:r>
       <w:r>
-        <w:instrText xml:space="preserve"> PAGEREF _Toc17380 \h </w:instrText>
+        <w:instrText xml:space="preserve"> PAGEREF _Toc23001 \h </w:instrText>
       </w:r>
       <w:r>
         <w:fldChar w:fldCharType="separate"/>
@@ -3154,7 +3154,7 @@
         <w:rPr>
           <w:rFonts w:ascii="Times New Roman" w:hAnsi="Times New Roman" w:eastAsia="Times New Roman"/>
         </w:rPr>
-        <w:instrText xml:space="preserve"> HYPERLINK \l _Toc3774 </w:instrText>
+        <w:instrText xml:space="preserve"> HYPERLINK \l _Toc4266 </w:instrText>
       </w:r>
       <w:r>
         <w:rPr>
@@ -3176,7 +3176,7 @@
         <w:fldChar w:fldCharType="begin"/>
       </w:r>
       <w:r>
-        <w:instrText xml:space="preserve"> PAGEREF _Toc3774 \h </w:instrText>
+        <w:instrText xml:space="preserve"> PAGEREF _Toc4266 \h </w:instrText>
       </w:r>
       <w:r>
         <w:fldChar w:fldCharType="separate"/>
@@ -3211,7 +3211,7 @@
         <w:rPr>
           <w:rFonts w:ascii="Times New Roman" w:hAnsi="Times New Roman" w:eastAsia="Times New Roman"/>
         </w:rPr>
-        <w:instrText xml:space="preserve"> HYPERLINK \l _Toc31601 </w:instrText>
+        <w:instrText xml:space="preserve"> HYPERLINK \l _Toc31130 </w:instrText>
       </w:r>
       <w:r>
         <w:rPr>
@@ -3233,7 +3233,7 @@
         <w:fldChar w:fldCharType="begin"/>
       </w:r>
       <w:r>
-        <w:instrText xml:space="preserve"> PAGEREF _Toc31601 \h </w:instrText>
+        <w:instrText xml:space="preserve"> PAGEREF _Toc31130 \h </w:instrText>
       </w:r>
       <w:r>
         <w:fldChar w:fldCharType="separate"/>
@@ -3268,7 +3268,7 @@
         <w:rPr>
           <w:rFonts w:ascii="Times New Roman" w:hAnsi="Times New Roman" w:eastAsia="Times New Roman"/>
         </w:rPr>
-        <w:instrText xml:space="preserve"> HYPERLINK \l _Toc22592 </w:instrText>
+        <w:instrText xml:space="preserve"> HYPERLINK \l _Toc9228 </w:instrText>
       </w:r>
       <w:r>
         <w:rPr>
@@ -3290,7 +3290,7 @@
         <w:fldChar w:fldCharType="begin"/>
       </w:r>
       <w:r>
-        <w:instrText xml:space="preserve"> PAGEREF _Toc22592 \h </w:instrText>
+        <w:instrText xml:space="preserve"> PAGEREF _Toc9228 \h </w:instrText>
       </w:r>
       <w:r>
         <w:fldChar w:fldCharType="separate"/>
@@ -3325,7 +3325,7 @@
         <w:rPr>
           <w:rFonts w:ascii="Times New Roman" w:hAnsi="Times New Roman" w:eastAsia="Times New Roman"/>
         </w:rPr>
-        <w:instrText xml:space="preserve"> HYPERLINK \l _Toc30989 </w:instrText>
+        <w:instrText xml:space="preserve"> HYPERLINK \l _Toc3233 </w:instrText>
       </w:r>
       <w:r>
         <w:rPr>
@@ -3347,7 +3347,7 @@
         <w:fldChar w:fldCharType="begin"/>
       </w:r>
       <w:r>
-        <w:instrText xml:space="preserve"> PAGEREF _Toc30989 \h </w:instrText>
+        <w:instrText xml:space="preserve"> PAGEREF _Toc3233 \h </w:instrText>
       </w:r>
       <w:r>
         <w:fldChar w:fldCharType="separate"/>
@@ -3382,7 +3382,7 @@
         <w:rPr>
           <w:rFonts w:ascii="Times New Roman" w:hAnsi="Times New Roman" w:eastAsia="Times New Roman"/>
         </w:rPr>
-        <w:instrText xml:space="preserve"> HYPERLINK \l _Toc20775 </w:instrText>
+        <w:instrText xml:space="preserve"> HYPERLINK \l _Toc5142 </w:instrText>
       </w:r>
       <w:r>
         <w:rPr>
@@ -3404,7 +3404,7 @@
         <w:fldChar w:fldCharType="begin"/>
       </w:r>
       <w:r>
-        <w:instrText xml:space="preserve"> PAGEREF _Toc20775 \h </w:instrText>
+        <w:instrText xml:space="preserve"> PAGEREF _Toc5142 \h </w:instrText>
       </w:r>
       <w:r>
         <w:fldChar w:fldCharType="separate"/>
@@ -3439,7 +3439,7 @@
         <w:rPr>
           <w:rFonts w:ascii="Times New Roman" w:hAnsi="Times New Roman" w:eastAsia="Times New Roman"/>
         </w:rPr>
-        <w:instrText xml:space="preserve"> HYPERLINK \l _Toc14534 </w:instrText>
+        <w:instrText xml:space="preserve"> HYPERLINK \l _Toc3916 </w:instrText>
       </w:r>
       <w:r>
         <w:rPr>
@@ -3461,7 +3461,7 @@
         <w:fldChar w:fldCharType="begin"/>
       </w:r>
       <w:r>
-        <w:instrText xml:space="preserve"> PAGEREF _Toc14534 \h </w:instrText>
+        <w:instrText xml:space="preserve"> PAGEREF _Toc3916 \h </w:instrText>
       </w:r>
       <w:r>
         <w:fldChar w:fldCharType="separate"/>
@@ -3496,7 +3496,7 @@
         <w:rPr>
           <w:rFonts w:ascii="Times New Roman" w:hAnsi="Times New Roman" w:eastAsia="Times New Roman"/>
         </w:rPr>
-        <w:instrText xml:space="preserve"> HYPERLINK \l _Toc5075 </w:instrText>
+        <w:instrText xml:space="preserve"> HYPERLINK \l _Toc10587 </w:instrText>
       </w:r>
       <w:r>
         <w:rPr>
@@ -3518,7 +3518,7 @@
         <w:fldChar w:fldCharType="begin"/>
       </w:r>
       <w:r>
-        <w:instrText xml:space="preserve"> PAGEREF _Toc5075 \h </w:instrText>
+        <w:instrText xml:space="preserve"> PAGEREF _Toc10587 \h </w:instrText>
       </w:r>
       <w:r>
         <w:fldChar w:fldCharType="separate"/>
@@ -3553,7 +3553,7 @@
         <w:rPr>
           <w:rFonts w:ascii="Times New Roman" w:hAnsi="Times New Roman" w:eastAsia="Times New Roman"/>
         </w:rPr>
-        <w:instrText xml:space="preserve"> HYPERLINK \l _Toc26591 </w:instrText>
+        <w:instrText xml:space="preserve"> HYPERLINK \l _Toc14029 </w:instrText>
       </w:r>
       <w:r>
         <w:rPr>
@@ -3575,7 +3575,7 @@
         <w:fldChar w:fldCharType="begin"/>
       </w:r>
       <w:r>
-        <w:instrText xml:space="preserve"> PAGEREF _Toc26591 \h </w:instrText>
+        <w:instrText xml:space="preserve"> PAGEREF _Toc14029 \h </w:instrText>
       </w:r>
       <w:r>
         <w:fldChar w:fldCharType="separate"/>
@@ -3610,7 +3610,7 @@
         <w:rPr>
           <w:rFonts w:ascii="Times New Roman" w:hAnsi="Times New Roman" w:eastAsia="Times New Roman"/>
         </w:rPr>
-        <w:instrText xml:space="preserve"> HYPERLINK \l _Toc11093 </w:instrText>
+        <w:instrText xml:space="preserve"> HYPERLINK \l _Toc16263 </w:instrText>
       </w:r>
       <w:r>
         <w:rPr>
@@ -3632,7 +3632,7 @@
         <w:fldChar w:fldCharType="begin"/>
       </w:r>
       <w:r>
-        <w:instrText xml:space="preserve"> PAGEREF _Toc11093 \h </w:instrText>
+        <w:instrText xml:space="preserve"> PAGEREF _Toc16263 \h </w:instrText>
       </w:r>
       <w:r>
         <w:fldChar w:fldCharType="separate"/>
@@ -3667,7 +3667,7 @@
         <w:rPr>
           <w:rFonts w:ascii="Times New Roman" w:hAnsi="Times New Roman" w:eastAsia="Times New Roman"/>
         </w:rPr>
-        <w:instrText xml:space="preserve"> HYPERLINK \l _Toc5270 </w:instrText>
+        <w:instrText xml:space="preserve"> HYPERLINK \l _Toc1625 </w:instrText>
       </w:r>
       <w:r>
         <w:rPr>
@@ -3703,7 +3703,7 @@
         <w:fldChar w:fldCharType="begin"/>
       </w:r>
       <w:r>
-        <w:instrText xml:space="preserve"> PAGEREF _Toc5270 \h </w:instrText>
+        <w:instrText xml:space="preserve"> PAGEREF _Toc1625 \h </w:instrText>
       </w:r>
       <w:r>
         <w:fldChar w:fldCharType="separate"/>
@@ -3738,7 +3738,7 @@
         <w:rPr>
           <w:rFonts w:ascii="Times New Roman" w:hAnsi="Times New Roman" w:eastAsia="Times New Roman"/>
         </w:rPr>
-        <w:instrText xml:space="preserve"> HYPERLINK \l _Toc9883 </w:instrText>
+        <w:instrText xml:space="preserve"> HYPERLINK \l _Toc29261 </w:instrText>
       </w:r>
       <w:r>
         <w:rPr>
@@ -3760,7 +3760,7 @@
         <w:fldChar w:fldCharType="begin"/>
       </w:r>
       <w:r>
-        <w:instrText xml:space="preserve"> PAGEREF _Toc9883 \h </w:instrText>
+        <w:instrText xml:space="preserve"> PAGEREF _Toc29261 \h </w:instrText>
       </w:r>
       <w:r>
         <w:fldChar w:fldCharType="separate"/>
@@ -3795,7 +3795,7 @@
         <w:rPr>
           <w:rFonts w:ascii="Times New Roman" w:hAnsi="Times New Roman" w:eastAsia="Times New Roman"/>
         </w:rPr>
-        <w:instrText xml:space="preserve"> HYPERLINK \l _Toc3360 </w:instrText>
+        <w:instrText xml:space="preserve"> HYPERLINK \l _Toc740 </w:instrText>
       </w:r>
       <w:r>
         <w:rPr>
@@ -3817,7 +3817,7 @@
         <w:fldChar w:fldCharType="begin"/>
       </w:r>
       <w:r>
-        <w:instrText xml:space="preserve"> PAGEREF _Toc3360 \h </w:instrText>
+        <w:instrText xml:space="preserve"> PAGEREF _Toc740 \h </w:instrText>
       </w:r>
       <w:r>
         <w:fldChar w:fldCharType="separate"/>
@@ -3852,7 +3852,7 @@
         <w:rPr>
           <w:rFonts w:ascii="Times New Roman" w:hAnsi="Times New Roman" w:eastAsia="Times New Roman"/>
         </w:rPr>
-        <w:instrText xml:space="preserve"> HYPERLINK \l _Toc12801 </w:instrText>
+        <w:instrText xml:space="preserve"> HYPERLINK \l _Toc21175 </w:instrText>
       </w:r>
       <w:r>
         <w:rPr>
@@ -3874,7 +3874,7 @@
         <w:fldChar w:fldCharType="begin"/>
       </w:r>
       <w:r>
-        <w:instrText xml:space="preserve"> PAGEREF _Toc12801 \h </w:instrText>
+        <w:instrText xml:space="preserve"> PAGEREF _Toc21175 \h </w:instrText>
       </w:r>
       <w:r>
         <w:fldChar w:fldCharType="separate"/>
@@ -3909,7 +3909,7 @@
         <w:rPr>
           <w:rFonts w:ascii="Times New Roman" w:hAnsi="Times New Roman" w:eastAsia="Times New Roman"/>
         </w:rPr>
-        <w:instrText xml:space="preserve"> HYPERLINK \l _Toc28547 </w:instrText>
+        <w:instrText xml:space="preserve"> HYPERLINK \l _Toc8616 </w:instrText>
       </w:r>
       <w:r>
         <w:rPr>
@@ -3931,7 +3931,7 @@
         <w:fldChar w:fldCharType="begin"/>
       </w:r>
       <w:r>
-        <w:instrText xml:space="preserve"> PAGEREF _Toc28547 \h </w:instrText>
+        <w:instrText xml:space="preserve"> PAGEREF _Toc8616 \h </w:instrText>
       </w:r>
       <w:r>
         <w:fldChar w:fldCharType="separate"/>
@@ -3966,7 +3966,7 @@
         <w:rPr>
           <w:rFonts w:ascii="Times New Roman" w:hAnsi="Times New Roman" w:eastAsia="Times New Roman"/>
         </w:rPr>
-        <w:instrText xml:space="preserve"> HYPERLINK \l _Toc21055 </w:instrText>
+        <w:instrText xml:space="preserve"> HYPERLINK \l _Toc28678 </w:instrText>
       </w:r>
       <w:r>
         <w:rPr>
@@ -3988,7 +3988,7 @@
         <w:fldChar w:fldCharType="begin"/>
       </w:r>
       <w:r>
-        <w:instrText xml:space="preserve"> PAGEREF _Toc21055 \h </w:instrText>
+        <w:instrText xml:space="preserve"> PAGEREF _Toc28678 \h </w:instrText>
       </w:r>
       <w:r>
         <w:fldChar w:fldCharType="separate"/>
@@ -4023,7 +4023,7 @@
         <w:rPr>
           <w:rFonts w:ascii="Times New Roman" w:hAnsi="Times New Roman" w:eastAsia="Times New Roman"/>
         </w:rPr>
-        <w:instrText xml:space="preserve"> HYPERLINK \l _Toc14642 </w:instrText>
+        <w:instrText xml:space="preserve"> HYPERLINK \l _Toc12300 </w:instrText>
       </w:r>
       <w:r>
         <w:rPr>
@@ -4045,7 +4045,7 @@
         <w:fldChar w:fldCharType="begin"/>
       </w:r>
       <w:r>
-        <w:instrText xml:space="preserve"> PAGEREF _Toc14642 \h </w:instrText>
+        <w:instrText xml:space="preserve"> PAGEREF _Toc12300 \h </w:instrText>
       </w:r>
       <w:r>
         <w:fldChar w:fldCharType="separate"/>
@@ -4080,7 +4080,7 @@
         <w:rPr>
           <w:rFonts w:ascii="Times New Roman" w:hAnsi="Times New Roman" w:eastAsia="Times New Roman"/>
         </w:rPr>
-        <w:instrText xml:space="preserve"> HYPERLINK \l _Toc29721 </w:instrText>
+        <w:instrText xml:space="preserve"> HYPERLINK \l _Toc6277 </w:instrText>
       </w:r>
       <w:r>
         <w:rPr>
@@ -4102,7 +4102,7 @@
         <w:fldChar w:fldCharType="begin"/>
       </w:r>
       <w:r>
-        <w:instrText xml:space="preserve"> PAGEREF _Toc29721 \h </w:instrText>
+        <w:instrText xml:space="preserve"> PAGEREF _Toc6277 \h </w:instrText>
       </w:r>
       <w:r>
         <w:fldChar w:fldCharType="separate"/>
@@ -4137,7 +4137,7 @@
         <w:rPr>
           <w:rFonts w:ascii="Times New Roman" w:hAnsi="Times New Roman" w:eastAsia="Times New Roman"/>
         </w:rPr>
-        <w:instrText xml:space="preserve"> HYPERLINK \l _Toc23702 </w:instrText>
+        <w:instrText xml:space="preserve"> HYPERLINK \l _Toc10155 </w:instrText>
       </w:r>
       <w:r>
         <w:rPr>
@@ -4159,7 +4159,7 @@
         <w:fldChar w:fldCharType="begin"/>
       </w:r>
       <w:r>
-        <w:instrText xml:space="preserve"> PAGEREF _Toc23702 \h </w:instrText>
+        <w:instrText xml:space="preserve"> PAGEREF _Toc10155 \h </w:instrText>
       </w:r>
       <w:r>
         <w:fldChar w:fldCharType="separate"/>
@@ -4194,7 +4194,7 @@
         <w:rPr>
           <w:rFonts w:ascii="Times New Roman" w:hAnsi="Times New Roman" w:eastAsia="Times New Roman"/>
         </w:rPr>
-        <w:instrText xml:space="preserve"> HYPERLINK \l _Toc24120 </w:instrText>
+        <w:instrText xml:space="preserve"> HYPERLINK \l _Toc6648 </w:instrText>
       </w:r>
       <w:r>
         <w:rPr>
@@ -4230,7 +4230,7 @@
         <w:fldChar w:fldCharType="begin"/>
       </w:r>
       <w:r>
-        <w:instrText xml:space="preserve"> PAGEREF _Toc24120 \h </w:instrText>
+        <w:instrText xml:space="preserve"> PAGEREF _Toc6648 \h </w:instrText>
       </w:r>
       <w:r>
         <w:fldChar w:fldCharType="separate"/>
@@ -4265,7 +4265,7 @@
         <w:rPr>
           <w:rFonts w:ascii="Times New Roman" w:hAnsi="Times New Roman" w:eastAsia="Times New Roman"/>
         </w:rPr>
-        <w:instrText xml:space="preserve"> HYPERLINK \l _Toc21489 </w:instrText>
+        <w:instrText xml:space="preserve"> HYPERLINK \l _Toc14206 </w:instrText>
       </w:r>
       <w:r>
         <w:rPr>
@@ -4287,7 +4287,7 @@
         <w:fldChar w:fldCharType="begin"/>
       </w:r>
       <w:r>
-        <w:instrText xml:space="preserve"> PAGEREF _Toc21489 \h </w:instrText>
+        <w:instrText xml:space="preserve"> PAGEREF _Toc14206 \h </w:instrText>
       </w:r>
       <w:r>
         <w:fldChar w:fldCharType="separate"/>
@@ -4322,7 +4322,7 @@
         <w:rPr>
           <w:rFonts w:ascii="Times New Roman" w:hAnsi="Times New Roman" w:eastAsia="Times New Roman"/>
         </w:rPr>
-        <w:instrText xml:space="preserve"> HYPERLINK \l _Toc16146 </w:instrText>
+        <w:instrText xml:space="preserve"> HYPERLINK \l _Toc18071 </w:instrText>
       </w:r>
       <w:r>
         <w:rPr>
@@ -4344,7 +4344,7 @@
         <w:fldChar w:fldCharType="begin"/>
       </w:r>
       <w:r>
-        <w:instrText xml:space="preserve"> PAGEREF _Toc16146 \h </w:instrText>
+        <w:instrText xml:space="preserve"> PAGEREF _Toc18071 \h </w:instrText>
       </w:r>
       <w:r>
         <w:fldChar w:fldCharType="separate"/>
@@ -4379,7 +4379,7 @@
         <w:rPr>
           <w:rFonts w:ascii="Times New Roman" w:hAnsi="Times New Roman" w:eastAsia="Times New Roman"/>
         </w:rPr>
-        <w:instrText xml:space="preserve"> HYPERLINK \l _Toc9275 </w:instrText>
+        <w:instrText xml:space="preserve"> HYPERLINK \l _Toc21373 </w:instrText>
       </w:r>
       <w:r>
         <w:rPr>
@@ -4401,7 +4401,7 @@
         <w:fldChar w:fldCharType="begin"/>
       </w:r>
       <w:r>
-        <w:instrText xml:space="preserve"> PAGEREF _Toc9275 \h </w:instrText>
+        <w:instrText xml:space="preserve"> PAGEREF _Toc21373 \h </w:instrText>
       </w:r>
       <w:r>
         <w:fldChar w:fldCharType="separate"/>
@@ -4436,7 +4436,7 @@
         <w:rPr>
           <w:rFonts w:ascii="Times New Roman" w:hAnsi="Times New Roman" w:eastAsia="Times New Roman"/>
         </w:rPr>
-        <w:instrText xml:space="preserve"> HYPERLINK \l _Toc7886 </w:instrText>
+        <w:instrText xml:space="preserve"> HYPERLINK \l _Toc27305 </w:instrText>
       </w:r>
       <w:r>
         <w:rPr>
@@ -4458,7 +4458,7 @@
         <w:fldChar w:fldCharType="begin"/>
       </w:r>
       <w:r>
-        <w:instrText xml:space="preserve"> PAGEREF _Toc7886 \h </w:instrText>
+        <w:instrText xml:space="preserve"> PAGEREF _Toc27305 \h </w:instrText>
       </w:r>
       <w:r>
         <w:fldChar w:fldCharType="separate"/>
@@ -4493,7 +4493,7 @@
         <w:rPr>
           <w:rFonts w:ascii="Times New Roman" w:hAnsi="Times New Roman" w:eastAsia="Times New Roman"/>
         </w:rPr>
-        <w:instrText xml:space="preserve"> HYPERLINK \l _Toc6111 </w:instrText>
+        <w:instrText xml:space="preserve"> HYPERLINK \l _Toc26168 </w:instrText>
       </w:r>
       <w:r>
         <w:rPr>
@@ -4515,7 +4515,7 @@
         <w:fldChar w:fldCharType="begin"/>
       </w:r>
       <w:r>
-        <w:instrText xml:space="preserve"> PAGEREF _Toc6111 \h </w:instrText>
+        <w:instrText xml:space="preserve"> PAGEREF _Toc26168 \h </w:instrText>
       </w:r>
       <w:r>
         <w:fldChar w:fldCharType="separate"/>
@@ -4550,7 +4550,7 @@
         <w:rPr>
           <w:rFonts w:ascii="Times New Roman" w:hAnsi="Times New Roman" w:eastAsia="Times New Roman"/>
         </w:rPr>
-        <w:instrText xml:space="preserve"> HYPERLINK \l _Toc32129 </w:instrText>
+        <w:instrText xml:space="preserve"> HYPERLINK \l _Toc67 </w:instrText>
       </w:r>
       <w:r>
         <w:rPr>
@@ -4572,7 +4572,7 @@
         <w:fldChar w:fldCharType="begin"/>
       </w:r>
       <w:r>
-        <w:instrText xml:space="preserve"> PAGEREF _Toc32129 \h </w:instrText>
+        <w:instrText xml:space="preserve"> PAGEREF _Toc67 \h </w:instrText>
       </w:r>
       <w:r>
         <w:fldChar w:fldCharType="separate"/>
@@ -4607,7 +4607,7 @@
         <w:rPr>
           <w:rFonts w:ascii="Times New Roman" w:hAnsi="Times New Roman" w:eastAsia="Times New Roman"/>
         </w:rPr>
-        <w:instrText xml:space="preserve"> HYPERLINK \l _Toc30861 </w:instrText>
+        <w:instrText xml:space="preserve"> HYPERLINK \l _Toc23598 </w:instrText>
       </w:r>
       <w:r>
         <w:rPr>
@@ -4643,7 +4643,7 @@
         <w:fldChar w:fldCharType="begin"/>
       </w:r>
       <w:r>
-        <w:instrText xml:space="preserve"> PAGEREF _Toc30861 \h </w:instrText>
+        <w:instrText xml:space="preserve"> PAGEREF _Toc23598 \h </w:instrText>
       </w:r>
       <w:r>
         <w:fldChar w:fldCharType="separate"/>
@@ -4678,7 +4678,7 @@
         <w:rPr>
           <w:rFonts w:ascii="Times New Roman" w:hAnsi="Times New Roman" w:eastAsia="Times New Roman"/>
         </w:rPr>
-        <w:instrText xml:space="preserve"> HYPERLINK \l _Toc26691 </w:instrText>
+        <w:instrText xml:space="preserve"> HYPERLINK \l _Toc6583 </w:instrText>
       </w:r>
       <w:r>
         <w:rPr>
@@ -4700,7 +4700,7 @@
         <w:fldChar w:fldCharType="begin"/>
       </w:r>
       <w:r>
-        <w:instrText xml:space="preserve"> PAGEREF _Toc26691 \h </w:instrText>
+        <w:instrText xml:space="preserve"> PAGEREF _Toc6583 \h </w:instrText>
       </w:r>
       <w:r>
         <w:fldChar w:fldCharType="separate"/>
@@ -4735,7 +4735,7 @@
         <w:rPr>
           <w:rFonts w:ascii="Times New Roman" w:hAnsi="Times New Roman" w:eastAsia="Times New Roman"/>
         </w:rPr>
-        <w:instrText xml:space="preserve"> HYPERLINK \l _Toc2175 </w:instrText>
+        <w:instrText xml:space="preserve"> HYPERLINK \l _Toc16113 </w:instrText>
       </w:r>
       <w:r>
         <w:rPr>
@@ -4757,7 +4757,7 @@
         <w:fldChar w:fldCharType="begin"/>
       </w:r>
       <w:r>
-        <w:instrText xml:space="preserve"> PAGEREF _Toc2175 \h </w:instrText>
+        <w:instrText xml:space="preserve"> PAGEREF _Toc16113 \h </w:instrText>
       </w:r>
       <w:r>
         <w:fldChar w:fldCharType="separate"/>
@@ -4792,7 +4792,7 @@
         <w:rPr>
           <w:rFonts w:ascii="Times New Roman" w:hAnsi="Times New Roman" w:eastAsia="Times New Roman"/>
         </w:rPr>
-        <w:instrText xml:space="preserve"> HYPERLINK \l _Toc25573 </w:instrText>
+        <w:instrText xml:space="preserve"> HYPERLINK \l _Toc176 </w:instrText>
       </w:r>
       <w:r>
         <w:rPr>
@@ -4814,7 +4814,7 @@
         <w:fldChar w:fldCharType="begin"/>
       </w:r>
       <w:r>
-        <w:instrText xml:space="preserve"> PAGEREF _Toc25573 \h </w:instrText>
+        <w:instrText xml:space="preserve"> PAGEREF _Toc176 \h </w:instrText>
       </w:r>
       <w:r>
         <w:fldChar w:fldCharType="separate"/>
@@ -4849,7 +4849,7 @@
         <w:rPr>
           <w:rFonts w:ascii="Times New Roman" w:hAnsi="Times New Roman" w:eastAsia="Times New Roman"/>
         </w:rPr>
-        <w:instrText xml:space="preserve"> HYPERLINK \l _Toc16084 </w:instrText>
+        <w:instrText xml:space="preserve"> HYPERLINK \l _Toc1627 </w:instrText>
       </w:r>
       <w:r>
         <w:rPr>
@@ -4885,7 +4885,7 @@
         <w:fldChar w:fldCharType="begin"/>
       </w:r>
       <w:r>
-        <w:instrText xml:space="preserve"> PAGEREF _Toc16084 \h </w:instrText>
+        <w:instrText xml:space="preserve"> PAGEREF _Toc1627 \h </w:instrText>
       </w:r>
       <w:r>
         <w:fldChar w:fldCharType="separate"/>
@@ -4920,7 +4920,7 @@
         <w:rPr>
           <w:rFonts w:ascii="Times New Roman" w:hAnsi="Times New Roman" w:eastAsia="Times New Roman"/>
         </w:rPr>
-        <w:instrText xml:space="preserve"> HYPERLINK \l _Toc16974 </w:instrText>
+        <w:instrText xml:space="preserve"> HYPERLINK \l _Toc14105 </w:instrText>
       </w:r>
       <w:r>
         <w:rPr>
@@ -4942,7 +4942,7 @@
         <w:fldChar w:fldCharType="begin"/>
       </w:r>
       <w:r>
-        <w:instrText xml:space="preserve"> PAGEREF _Toc16974 \h </w:instrText>
+        <w:instrText xml:space="preserve"> PAGEREF _Toc14105 \h </w:instrText>
       </w:r>
       <w:r>
         <w:fldChar w:fldCharType="separate"/>
@@ -4977,7 +4977,7 @@
         <w:rPr>
           <w:rFonts w:ascii="Times New Roman" w:hAnsi="Times New Roman" w:eastAsia="Times New Roman"/>
         </w:rPr>
-        <w:instrText xml:space="preserve"> HYPERLINK \l _Toc10238 </w:instrText>
+        <w:instrText xml:space="preserve"> HYPERLINK \l _Toc14418 </w:instrText>
       </w:r>
       <w:r>
         <w:rPr>
@@ -5013,7 +5013,7 @@
         <w:fldChar w:fldCharType="begin"/>
       </w:r>
       <w:r>
-        <w:instrText xml:space="preserve"> PAGEREF _Toc10238 \h </w:instrText>
+        <w:instrText xml:space="preserve"> PAGEREF _Toc14418 \h </w:instrText>
       </w:r>
       <w:r>
         <w:fldChar w:fldCharType="separate"/>
@@ -5048,7 +5048,7 @@
         <w:rPr>
           <w:rFonts w:ascii="Times New Roman" w:hAnsi="Times New Roman" w:eastAsia="Times New Roman"/>
         </w:rPr>
-        <w:instrText xml:space="preserve"> HYPERLINK \l _Toc24519 </w:instrText>
+        <w:instrText xml:space="preserve"> HYPERLINK \l _Toc12344 </w:instrText>
       </w:r>
       <w:r>
         <w:rPr>
@@ -5070,7 +5070,7 @@
         <w:fldChar w:fldCharType="begin"/>
       </w:r>
       <w:r>
-        <w:instrText xml:space="preserve"> PAGEREF _Toc24519 \h </w:instrText>
+        <w:instrText xml:space="preserve"> PAGEREF _Toc12344 \h </w:instrText>
       </w:r>
       <w:r>
         <w:fldChar w:fldCharType="separate"/>
@@ -5105,7 +5105,7 @@
         <w:rPr>
           <w:rFonts w:ascii="Times New Roman" w:hAnsi="Times New Roman" w:eastAsia="Times New Roman"/>
         </w:rPr>
-        <w:instrText xml:space="preserve"> HYPERLINK \l _Toc4684 </w:instrText>
+        <w:instrText xml:space="preserve"> HYPERLINK \l _Toc29697 </w:instrText>
       </w:r>
       <w:r>
         <w:rPr>
@@ -5127,7 +5127,7 @@
         <w:fldChar w:fldCharType="begin"/>
       </w:r>
       <w:r>
-        <w:instrText xml:space="preserve"> PAGEREF _Toc4684 \h </w:instrText>
+        <w:instrText xml:space="preserve"> PAGEREF _Toc29697 \h </w:instrText>
       </w:r>
       <w:r>
         <w:fldChar w:fldCharType="separate"/>
@@ -5162,7 +5162,7 @@
         <w:rPr>
           <w:rFonts w:ascii="Times New Roman" w:hAnsi="Times New Roman" w:eastAsia="Times New Roman"/>
         </w:rPr>
-        <w:instrText xml:space="preserve"> HYPERLINK \l _Toc28619 </w:instrText>
+        <w:instrText xml:space="preserve"> HYPERLINK \l _Toc2983 </w:instrText>
       </w:r>
       <w:r>
         <w:rPr>
@@ -5184,7 +5184,7 @@
         <w:fldChar w:fldCharType="begin"/>
       </w:r>
       <w:r>
-        <w:instrText xml:space="preserve"> PAGEREF _Toc28619 \h </w:instrText>
+        <w:instrText xml:space="preserve"> PAGEREF _Toc2983 \h </w:instrText>
       </w:r>
       <w:r>
         <w:fldChar w:fldCharType="separate"/>
@@ -5219,7 +5219,7 @@
         <w:rPr>
           <w:rFonts w:ascii="Times New Roman" w:hAnsi="Times New Roman" w:eastAsia="Times New Roman"/>
         </w:rPr>
-        <w:instrText xml:space="preserve"> HYPERLINK \l _Toc12312 </w:instrText>
+        <w:instrText xml:space="preserve"> HYPERLINK \l _Toc11107 </w:instrText>
       </w:r>
       <w:r>
         <w:rPr>
@@ -5255,7 +5255,7 @@
         <w:fldChar w:fldCharType="begin"/>
       </w:r>
       <w:r>
-        <w:instrText xml:space="preserve"> PAGEREF _Toc12312 \h </w:instrText>
+        <w:instrText xml:space="preserve"> PAGEREF _Toc11107 \h </w:instrText>
       </w:r>
       <w:r>
         <w:fldChar w:fldCharType="separate"/>
@@ -5290,7 +5290,7 @@
         <w:rPr>
           <w:rFonts w:ascii="Times New Roman" w:hAnsi="Times New Roman" w:eastAsia="Times New Roman"/>
         </w:rPr>
-        <w:instrText xml:space="preserve"> HYPERLINK \l _Toc32006 </w:instrText>
+        <w:instrText xml:space="preserve"> HYPERLINK \l _Toc10513 </w:instrText>
       </w:r>
       <w:r>
         <w:rPr>
@@ -5312,7 +5312,7 @@
         <w:fldChar w:fldCharType="begin"/>
       </w:r>
       <w:r>
-        <w:instrText xml:space="preserve"> PAGEREF _Toc32006 \h </w:instrText>
+        <w:instrText xml:space="preserve"> PAGEREF _Toc10513 \h </w:instrText>
       </w:r>
       <w:r>
         <w:fldChar w:fldCharType="separate"/>
@@ -5347,7 +5347,7 @@
         <w:rPr>
           <w:rFonts w:ascii="Times New Roman" w:hAnsi="Times New Roman" w:eastAsia="Times New Roman"/>
         </w:rPr>
-        <w:instrText xml:space="preserve"> HYPERLINK \l _Toc25641 </w:instrText>
+        <w:instrText xml:space="preserve"> HYPERLINK \l _Toc9874 </w:instrText>
       </w:r>
       <w:r>
         <w:rPr>
@@ -5383,7 +5383,7 @@
         <w:fldChar w:fldCharType="begin"/>
       </w:r>
       <w:r>
-        <w:instrText xml:space="preserve"> PAGEREF _Toc25641 \h </w:instrText>
+        <w:instrText xml:space="preserve"> PAGEREF _Toc9874 \h </w:instrText>
       </w:r>
       <w:r>
         <w:fldChar w:fldCharType="separate"/>
@@ -5418,7 +5418,7 @@
         <w:rPr>
           <w:rFonts w:ascii="Times New Roman" w:hAnsi="Times New Roman" w:eastAsia="Times New Roman"/>
         </w:rPr>
-        <w:instrText xml:space="preserve"> HYPERLINK \l _Toc7856 </w:instrText>
+        <w:instrText xml:space="preserve"> HYPERLINK \l _Toc25309 </w:instrText>
       </w:r>
       <w:r>
         <w:rPr>
@@ -5440,7 +5440,7 @@
         <w:fldChar w:fldCharType="begin"/>
       </w:r>
       <w:r>
-        <w:instrText xml:space="preserve"> PAGEREF _Toc7856 \h </w:instrText>
+        <w:instrText xml:space="preserve"> PAGEREF _Toc25309 \h </w:instrText>
       </w:r>
       <w:r>
         <w:fldChar w:fldCharType="separate"/>
@@ -5475,7 +5475,7 @@
         <w:rPr>
           <w:rFonts w:ascii="Times New Roman" w:hAnsi="Times New Roman" w:eastAsia="Times New Roman"/>
         </w:rPr>
-        <w:instrText xml:space="preserve"> HYPERLINK \l _Toc21050 </w:instrText>
+        <w:instrText xml:space="preserve"> HYPERLINK \l _Toc1604 </w:instrText>
       </w:r>
       <w:r>
         <w:rPr>
@@ -5511,7 +5511,7 @@
         <w:fldChar w:fldCharType="begin"/>
       </w:r>
       <w:r>
-        <w:instrText xml:space="preserve"> PAGEREF _Toc21050 \h </w:instrText>
+        <w:instrText xml:space="preserve"> PAGEREF _Toc1604 \h </w:instrText>
       </w:r>
       <w:r>
         <w:fldChar w:fldCharType="separate"/>
@@ -5546,7 +5546,7 @@
         <w:rPr>
           <w:rFonts w:ascii="Times New Roman" w:hAnsi="Times New Roman" w:eastAsia="Times New Roman"/>
         </w:rPr>
-        <w:instrText xml:space="preserve"> HYPERLINK \l _Toc13676 </w:instrText>
+        <w:instrText xml:space="preserve"> HYPERLINK \l _Toc28461 </w:instrText>
       </w:r>
       <w:r>
         <w:rPr>
@@ -5568,7 +5568,7 @@
         <w:fldChar w:fldCharType="begin"/>
       </w:r>
       <w:r>
-        <w:instrText xml:space="preserve"> PAGEREF _Toc13676 \h </w:instrText>
+        <w:instrText xml:space="preserve"> PAGEREF _Toc28461 \h </w:instrText>
       </w:r>
       <w:r>
         <w:fldChar w:fldCharType="separate"/>
@@ -5657,7 +5657,7 @@
         <w:rPr>
           <w:rFonts w:ascii="Times New Roman" w:hAnsi="Times New Roman" w:eastAsia="Times New Roman"/>
         </w:rPr>
-        <w:instrText xml:space="preserve"> HYPERLINK \l _Toc23767 </w:instrText>
+        <w:instrText xml:space="preserve"> HYPERLINK \l _Toc26441 </w:instrText>
       </w:r>
       <w:r>
         <w:rPr>
@@ -5679,7 +5679,7 @@
         <w:fldChar w:fldCharType="begin"/>
       </w:r>
       <w:r>
-        <w:instrText xml:space="preserve"> PAGEREF _Toc23767 \h </w:instrText>
+        <w:instrText xml:space="preserve"> PAGEREF _Toc26441 \h </w:instrText>
       </w:r>
       <w:r>
         <w:fldChar w:fldCharType="separate"/>
@@ -5714,7 +5714,7 @@
         <w:rPr>
           <w:rFonts w:ascii="Times New Roman" w:hAnsi="Times New Roman" w:eastAsia="Times New Roman"/>
         </w:rPr>
-        <w:instrText xml:space="preserve"> HYPERLINK \l _Toc21571 </w:instrText>
+        <w:instrText xml:space="preserve"> HYPERLINK \l _Toc8668 </w:instrText>
       </w:r>
       <w:r>
         <w:rPr>
@@ -5736,7 +5736,7 @@
         <w:fldChar w:fldCharType="begin"/>
       </w:r>
       <w:r>
-        <w:instrText xml:space="preserve"> PAGEREF _Toc21571 \h </w:instrText>
+        <w:instrText xml:space="preserve"> PAGEREF _Toc8668 \h </w:instrText>
       </w:r>
       <w:r>
         <w:fldChar w:fldCharType="separate"/>
@@ -5771,7 +5771,7 @@
         <w:rPr>
           <w:rFonts w:ascii="Times New Roman" w:hAnsi="Times New Roman" w:eastAsia="Times New Roman"/>
         </w:rPr>
-        <w:instrText xml:space="preserve"> HYPERLINK \l _Toc17124 </w:instrText>
+        <w:instrText xml:space="preserve"> HYPERLINK \l _Toc5917 </w:instrText>
       </w:r>
       <w:r>
         <w:rPr>
@@ -5793,7 +5793,7 @@
         <w:fldChar w:fldCharType="begin"/>
       </w:r>
       <w:r>
-        <w:instrText xml:space="preserve"> PAGEREF _Toc17124 \h </w:instrText>
+        <w:instrText xml:space="preserve"> PAGEREF _Toc5917 \h </w:instrText>
       </w:r>
       <w:r>
         <w:fldChar w:fldCharType="separate"/>
@@ -5828,7 +5828,7 @@
         <w:rPr>
           <w:rFonts w:ascii="Times New Roman" w:hAnsi="Times New Roman" w:eastAsia="Times New Roman"/>
         </w:rPr>
-        <w:instrText xml:space="preserve"> HYPERLINK \l _Toc24196 </w:instrText>
+        <w:instrText xml:space="preserve"> HYPERLINK \l _Toc24414 </w:instrText>
       </w:r>
       <w:r>
         <w:rPr>
@@ -5850,7 +5850,7 @@
         <w:fldChar w:fldCharType="begin"/>
       </w:r>
       <w:r>
-        <w:instrText xml:space="preserve"> PAGEREF _Toc24196 \h </w:instrText>
+        <w:instrText xml:space="preserve"> PAGEREF _Toc24414 \h </w:instrText>
       </w:r>
       <w:r>
         <w:fldChar w:fldCharType="separate"/>
@@ -5885,7 +5885,7 @@
         <w:rPr>
           <w:rFonts w:ascii="Times New Roman" w:hAnsi="Times New Roman" w:eastAsia="Times New Roman"/>
         </w:rPr>
-        <w:instrText xml:space="preserve"> HYPERLINK \l _Toc25222 </w:instrText>
+        <w:instrText xml:space="preserve"> HYPERLINK \l _Toc2491 </w:instrText>
       </w:r>
       <w:r>
         <w:rPr>
@@ -5907,7 +5907,7 @@
         <w:fldChar w:fldCharType="begin"/>
       </w:r>
       <w:r>
-        <w:instrText xml:space="preserve"> PAGEREF _Toc25222 \h </w:instrText>
+        <w:instrText xml:space="preserve"> PAGEREF _Toc2491 \h </w:instrText>
       </w:r>
       <w:r>
         <w:fldChar w:fldCharType="separate"/>
@@ -5942,7 +5942,7 @@
         <w:rPr>
           <w:rFonts w:ascii="Times New Roman" w:hAnsi="Times New Roman" w:eastAsia="Times New Roman"/>
         </w:rPr>
-        <w:instrText xml:space="preserve"> HYPERLINK \l _Toc27018 </w:instrText>
+        <w:instrText xml:space="preserve"> HYPERLINK \l _Toc20401 </w:instrText>
       </w:r>
       <w:r>
         <w:rPr>
@@ -5964,7 +5964,7 @@
         <w:fldChar w:fldCharType="begin"/>
       </w:r>
       <w:r>
-        <w:instrText xml:space="preserve"> PAGEREF _Toc27018 \h </w:instrText>
+        <w:instrText xml:space="preserve"> PAGEREF _Toc20401 \h </w:instrText>
       </w:r>
       <w:r>
         <w:fldChar w:fldCharType="separate"/>
@@ -5999,7 +5999,7 @@
         <w:rPr>
           <w:rFonts w:ascii="Times New Roman" w:hAnsi="Times New Roman" w:eastAsia="Times New Roman"/>
         </w:rPr>
-        <w:instrText xml:space="preserve"> HYPERLINK \l _Toc5202 </w:instrText>
+        <w:instrText xml:space="preserve"> HYPERLINK \l _Toc855 </w:instrText>
       </w:r>
       <w:r>
         <w:rPr>
@@ -6021,7 +6021,7 @@
         <w:fldChar w:fldCharType="begin"/>
       </w:r>
       <w:r>
-        <w:instrText xml:space="preserve"> PAGEREF _Toc5202 \h </w:instrText>
+        <w:instrText xml:space="preserve"> PAGEREF _Toc855 \h </w:instrText>
       </w:r>
       <w:r>
         <w:fldChar w:fldCharType="separate"/>
@@ -6056,7 +6056,7 @@
         <w:rPr>
           <w:rFonts w:ascii="Times New Roman" w:hAnsi="Times New Roman" w:eastAsia="Times New Roman"/>
         </w:rPr>
-        <w:instrText xml:space="preserve"> HYPERLINK \l _Toc10672 </w:instrText>
+        <w:instrText xml:space="preserve"> HYPERLINK \l _Toc6590 </w:instrText>
       </w:r>
       <w:r>
         <w:rPr>
@@ -6078,7 +6078,7 @@
         <w:fldChar w:fldCharType="begin"/>
       </w:r>
       <w:r>
-        <w:instrText xml:space="preserve"> PAGEREF _Toc10672 \h </w:instrText>
+        <w:instrText xml:space="preserve"> PAGEREF _Toc6590 \h </w:instrText>
       </w:r>
       <w:r>
         <w:fldChar w:fldCharType="separate"/>
@@ -6167,7 +6167,7 @@
         <w:rPr>
           <w:rFonts w:ascii="Times New Roman" w:hAnsi="Times New Roman" w:eastAsia="Times New Roman"/>
         </w:rPr>
-        <w:instrText xml:space="preserve"> HYPERLINK \l _Toc26854 </w:instrText>
+        <w:instrText xml:space="preserve"> HYPERLINK \l _Toc15536 </w:instrText>
       </w:r>
       <w:r>
         <w:rPr>
@@ -6189,7 +6189,7 @@
         <w:fldChar w:fldCharType="begin"/>
       </w:r>
       <w:r>
-        <w:instrText xml:space="preserve"> PAGEREF _Toc26854 \h </w:instrText>
+        <w:instrText xml:space="preserve"> PAGEREF _Toc15536 \h </w:instrText>
       </w:r>
       <w:r>
         <w:fldChar w:fldCharType="separate"/>
@@ -6224,7 +6224,7 @@
         <w:rPr>
           <w:rFonts w:ascii="Times New Roman" w:hAnsi="Times New Roman" w:eastAsia="Times New Roman"/>
         </w:rPr>
-        <w:instrText xml:space="preserve"> HYPERLINK \l _Toc11267 </w:instrText>
+        <w:instrText xml:space="preserve"> HYPERLINK \l _Toc29402 </w:instrText>
       </w:r>
       <w:r>
         <w:rPr>
@@ -6246,7 +6246,7 @@
         <w:fldChar w:fldCharType="begin"/>
       </w:r>
       <w:r>
-        <w:instrText xml:space="preserve"> PAGEREF _Toc11267 \h </w:instrText>
+        <w:instrText xml:space="preserve"> PAGEREF _Toc29402 \h </w:instrText>
       </w:r>
       <w:r>
         <w:fldChar w:fldCharType="separate"/>
@@ -6281,7 +6281,7 @@
         <w:rPr>
           <w:rFonts w:ascii="Times New Roman" w:hAnsi="Times New Roman" w:eastAsia="Times New Roman"/>
         </w:rPr>
-        <w:instrText xml:space="preserve"> HYPERLINK \l _Toc9307 </w:instrText>
+        <w:instrText xml:space="preserve"> HYPERLINK \l _Toc16141 </w:instrText>
       </w:r>
       <w:r>
         <w:rPr>
@@ -6303,7 +6303,7 @@
         <w:fldChar w:fldCharType="begin"/>
       </w:r>
       <w:r>
-        <w:instrText xml:space="preserve"> PAGEREF _Toc9307 \h </w:instrText>
+        <w:instrText xml:space="preserve"> PAGEREF _Toc16141 \h </w:instrText>
       </w:r>
       <w:r>
         <w:fldChar w:fldCharType="separate"/>
@@ -6338,7 +6338,7 @@
         <w:rPr>
           <w:rFonts w:ascii="Times New Roman" w:hAnsi="Times New Roman" w:eastAsia="Times New Roman"/>
         </w:rPr>
-        <w:instrText xml:space="preserve"> HYPERLINK \l _Toc27254 </w:instrText>
+        <w:instrText xml:space="preserve"> HYPERLINK \l _Toc27470 </w:instrText>
       </w:r>
       <w:r>
         <w:rPr>
@@ -6360,7 +6360,7 @@
         <w:fldChar w:fldCharType="begin"/>
       </w:r>
       <w:r>
-        <w:instrText xml:space="preserve"> PAGEREF _Toc27254 \h </w:instrText>
+        <w:instrText xml:space="preserve"> PAGEREF _Toc27470 \h </w:instrText>
       </w:r>
       <w:r>
         <w:fldChar w:fldCharType="separate"/>
@@ -6395,7 +6395,7 @@
         <w:rPr>
           <w:rFonts w:ascii="Times New Roman" w:hAnsi="Times New Roman" w:eastAsia="Times New Roman"/>
         </w:rPr>
-        <w:instrText xml:space="preserve"> HYPERLINK \l _Toc28207 </w:instrText>
+        <w:instrText xml:space="preserve"> HYPERLINK \l _Toc23856 </w:instrText>
       </w:r>
       <w:r>
         <w:rPr>
@@ -6417,7 +6417,7 @@
         <w:fldChar w:fldCharType="begin"/>
       </w:r>
       <w:r>
-        <w:instrText xml:space="preserve"> PAGEREF _Toc28207 \h </w:instrText>
+        <w:instrText xml:space="preserve"> PAGEREF _Toc23856 \h </w:instrText>
       </w:r>
       <w:r>
         <w:fldChar w:fldCharType="separate"/>
@@ -6452,7 +6452,7 @@
         <w:rPr>
           <w:rFonts w:ascii="Times New Roman" w:hAnsi="Times New Roman" w:eastAsia="Times New Roman"/>
         </w:rPr>
-        <w:instrText xml:space="preserve"> HYPERLINK \l _Toc30358 </w:instrText>
+        <w:instrText xml:space="preserve"> HYPERLINK \l _Toc26630 </w:instrText>
       </w:r>
       <w:r>
         <w:rPr>
@@ -6474,7 +6474,7 @@
         <w:fldChar w:fldCharType="begin"/>
       </w:r>
       <w:r>
-        <w:instrText xml:space="preserve"> PAGEREF _Toc30358 \h </w:instrText>
+        <w:instrText xml:space="preserve"> PAGEREF _Toc26630 \h </w:instrText>
       </w:r>
       <w:r>
         <w:fldChar w:fldCharType="separate"/>
@@ -6509,7 +6509,7 @@
         <w:rPr>
           <w:rFonts w:ascii="Times New Roman" w:hAnsi="Times New Roman" w:eastAsia="Times New Roman"/>
         </w:rPr>
-        <w:instrText xml:space="preserve"> HYPERLINK \l _Toc8601 </w:instrText>
+        <w:instrText xml:space="preserve"> HYPERLINK \l _Toc6333 </w:instrText>
       </w:r>
       <w:r>
         <w:rPr>
@@ -6531,7 +6531,7 @@
         <w:fldChar w:fldCharType="begin"/>
       </w:r>
       <w:r>
-        <w:instrText xml:space="preserve"> PAGEREF _Toc8601 \h </w:instrText>
+        <w:instrText xml:space="preserve"> PAGEREF _Toc6333 \h </w:instrText>
       </w:r>
       <w:r>
         <w:fldChar w:fldCharType="separate"/>
@@ -6566,7 +6566,7 @@
         <w:rPr>
           <w:rFonts w:ascii="Times New Roman" w:hAnsi="Times New Roman" w:eastAsia="Times New Roman"/>
         </w:rPr>
-        <w:instrText xml:space="preserve"> HYPERLINK \l _Toc5915 </w:instrText>
+        <w:instrText xml:space="preserve"> HYPERLINK \l _Toc31453 </w:instrText>
       </w:r>
       <w:r>
         <w:rPr>
@@ -6588,7 +6588,7 @@
         <w:fldChar w:fldCharType="begin"/>
       </w:r>
       <w:r>
-        <w:instrText xml:space="preserve"> PAGEREF _Toc5915 \h </w:instrText>
+        <w:instrText xml:space="preserve"> PAGEREF _Toc31453 \h </w:instrText>
       </w:r>
       <w:r>
         <w:fldChar w:fldCharType="separate"/>
@@ -6623,7 +6623,7 @@
         <w:rPr>
           <w:rFonts w:ascii="Times New Roman" w:hAnsi="Times New Roman" w:eastAsia="Times New Roman"/>
         </w:rPr>
-        <w:instrText xml:space="preserve"> HYPERLINK \l _Toc18789 </w:instrText>
+        <w:instrText xml:space="preserve"> HYPERLINK \l _Toc32737 </w:instrText>
       </w:r>
       <w:r>
         <w:rPr>
@@ -6645,7 +6645,7 @@
         <w:fldChar w:fldCharType="begin"/>
       </w:r>
       <w:r>
-        <w:instrText xml:space="preserve"> PAGEREF _Toc18789 \h </w:instrText>
+        <w:instrText xml:space="preserve"> PAGEREF _Toc32737 \h </w:instrText>
       </w:r>
       <w:r>
         <w:fldChar w:fldCharType="separate"/>
@@ -6680,7 +6680,7 @@
         <w:rPr>
           <w:rFonts w:ascii="Times New Roman" w:hAnsi="Times New Roman" w:eastAsia="Times New Roman"/>
         </w:rPr>
-        <w:instrText xml:space="preserve"> HYPERLINK \l _Toc22216 </w:instrText>
+        <w:instrText xml:space="preserve"> HYPERLINK \l _Toc5661 </w:instrText>
       </w:r>
       <w:r>
         <w:rPr>
@@ -6702,7 +6702,7 @@
         <w:fldChar w:fldCharType="begin"/>
       </w:r>
       <w:r>
-        <w:instrText xml:space="preserve"> PAGEREF _Toc22216 \h </w:instrText>
+        <w:instrText xml:space="preserve"> PAGEREF _Toc5661 \h </w:instrText>
       </w:r>
       <w:r>
         <w:fldChar w:fldCharType="separate"/>
@@ -6737,7 +6737,7 @@
         <w:rPr>
           <w:rFonts w:ascii="Times New Roman" w:hAnsi="Times New Roman" w:eastAsia="Times New Roman"/>
         </w:rPr>
-        <w:instrText xml:space="preserve"> HYPERLINK \l _Toc27594 </w:instrText>
+        <w:instrText xml:space="preserve"> HYPERLINK \l _Toc11588 </w:instrText>
       </w:r>
       <w:r>
         <w:rPr>
@@ -6759,7 +6759,7 @@
         <w:fldChar w:fldCharType="begin"/>
       </w:r>
       <w:r>
-        <w:instrText xml:space="preserve"> PAGEREF _Toc27594 \h </w:instrText>
+        <w:instrText xml:space="preserve"> PAGEREF _Toc11588 \h </w:instrText>
       </w:r>
       <w:r>
         <w:fldChar w:fldCharType="separate"/>
@@ -6794,7 +6794,7 @@
         <w:rPr>
           <w:rFonts w:ascii="Times New Roman" w:hAnsi="Times New Roman" w:eastAsia="Times New Roman"/>
         </w:rPr>
-        <w:instrText xml:space="preserve"> HYPERLINK \l _Toc14195 </w:instrText>
+        <w:instrText xml:space="preserve"> HYPERLINK \l _Toc15660 </w:instrText>
       </w:r>
       <w:r>
         <w:rPr>
@@ -6816,7 +6816,7 @@
         <w:fldChar w:fldCharType="begin"/>
       </w:r>
       <w:r>
-        <w:instrText xml:space="preserve"> PAGEREF _Toc14195 \h </w:instrText>
+        <w:instrText xml:space="preserve"> PAGEREF _Toc15660 \h </w:instrText>
       </w:r>
       <w:r>
         <w:fldChar w:fldCharType="separate"/>
@@ -6851,7 +6851,7 @@
         <w:rPr>
           <w:rFonts w:ascii="Times New Roman" w:hAnsi="Times New Roman" w:eastAsia="Times New Roman"/>
         </w:rPr>
-        <w:instrText xml:space="preserve"> HYPERLINK \l _Toc11738 </w:instrText>
+        <w:instrText xml:space="preserve"> HYPERLINK \l _Toc9360 </w:instrText>
       </w:r>
       <w:r>
         <w:rPr>
@@ -6873,7 +6873,7 @@
         <w:fldChar w:fldCharType="begin"/>
       </w:r>
       <w:r>
-        <w:instrText xml:space="preserve"> PAGEREF _Toc11738 \h </w:instrText>
+        <w:instrText xml:space="preserve"> PAGEREF _Toc9360 \h </w:instrText>
       </w:r>
       <w:r>
         <w:fldChar w:fldCharType="separate"/>
@@ -6908,7 +6908,7 @@
         <w:rPr>
           <w:rFonts w:ascii="Times New Roman" w:hAnsi="Times New Roman" w:eastAsia="Times New Roman"/>
         </w:rPr>
-        <w:instrText xml:space="preserve"> HYPERLINK \l _Toc4657 </w:instrText>
+        <w:instrText xml:space="preserve"> HYPERLINK \l _Toc9088 </w:instrText>
       </w:r>
       <w:r>
         <w:rPr>
@@ -6930,7 +6930,7 @@
         <w:fldChar w:fldCharType="begin"/>
       </w:r>
       <w:r>
-        <w:instrText xml:space="preserve"> PAGEREF _Toc4657 \h </w:instrText>
+        <w:instrText xml:space="preserve"> PAGEREF _Toc9088 \h </w:instrText>
       </w:r>
       <w:r>
         <w:fldChar w:fldCharType="separate"/>
@@ -6965,7 +6965,7 @@
         <w:rPr>
           <w:rFonts w:ascii="Times New Roman" w:hAnsi="Times New Roman" w:eastAsia="Times New Roman"/>
         </w:rPr>
-        <w:instrText xml:space="preserve"> HYPERLINK \l _Toc21366 </w:instrText>
+        <w:instrText xml:space="preserve"> HYPERLINK \l _Toc22537 </w:instrText>
       </w:r>
       <w:r>
         <w:rPr>
@@ -6987,7 +6987,7 @@
         <w:fldChar w:fldCharType="begin"/>
       </w:r>
       <w:r>
-        <w:instrText xml:space="preserve"> PAGEREF _Toc21366 \h </w:instrText>
+        <w:instrText xml:space="preserve"> PAGEREF _Toc22537 \h </w:instrText>
       </w:r>
       <w:r>
         <w:fldChar w:fldCharType="separate"/>
@@ -7022,7 +7022,7 @@
         <w:rPr>
           <w:rFonts w:ascii="Times New Roman" w:hAnsi="Times New Roman" w:eastAsia="Times New Roman"/>
         </w:rPr>
-        <w:instrText xml:space="preserve"> HYPERLINK \l _Toc13815 </w:instrText>
+        <w:instrText xml:space="preserve"> HYPERLINK \l _Toc29775 </w:instrText>
       </w:r>
       <w:r>
         <w:rPr>
@@ -7044,7 +7044,7 @@
         <w:fldChar w:fldCharType="begin"/>
       </w:r>
       <w:r>
-        <w:instrText xml:space="preserve"> PAGEREF _Toc13815 \h </w:instrText>
+        <w:instrText xml:space="preserve"> PAGEREF _Toc29775 \h </w:instrText>
       </w:r>
       <w:r>
         <w:fldChar w:fldCharType="separate"/>
@@ -7079,7 +7079,7 @@
         <w:rPr>
           <w:rFonts w:ascii="Times New Roman" w:hAnsi="Times New Roman" w:eastAsia="Times New Roman"/>
         </w:rPr>
-        <w:instrText xml:space="preserve"> HYPERLINK \l _Toc2036 </w:instrText>
+        <w:instrText xml:space="preserve"> HYPERLINK \l _Toc18445 </w:instrText>
       </w:r>
       <w:r>
         <w:rPr>
@@ -7101,7 +7101,7 @@
         <w:fldChar w:fldCharType="begin"/>
       </w:r>
       <w:r>
-        <w:instrText xml:space="preserve"> PAGEREF _Toc2036 \h </w:instrText>
+        <w:instrText xml:space="preserve"> PAGEREF _Toc18445 \h </w:instrText>
       </w:r>
       <w:r>
         <w:fldChar w:fldCharType="separate"/>
@@ -7136,7 +7136,7 @@
         <w:rPr>
           <w:rFonts w:ascii="Times New Roman" w:hAnsi="Times New Roman" w:eastAsia="Times New Roman"/>
         </w:rPr>
-        <w:instrText xml:space="preserve"> HYPERLINK \l _Toc8240 </w:instrText>
+        <w:instrText xml:space="preserve"> HYPERLINK \l _Toc4242 </w:instrText>
       </w:r>
       <w:r>
         <w:rPr>
@@ -7158,7 +7158,7 @@
         <w:fldChar w:fldCharType="begin"/>
       </w:r>
       <w:r>
-        <w:instrText xml:space="preserve"> PAGEREF _Toc8240 \h </w:instrText>
+        <w:instrText xml:space="preserve"> PAGEREF _Toc4242 \h </w:instrText>
       </w:r>
       <w:r>
         <w:fldChar w:fldCharType="separate"/>
@@ -7193,7 +7193,7 @@
         <w:rPr>
           <w:rFonts w:ascii="Times New Roman" w:hAnsi="Times New Roman" w:eastAsia="Times New Roman"/>
         </w:rPr>
-        <w:instrText xml:space="preserve"> HYPERLINK \l _Toc31955 </w:instrText>
+        <w:instrText xml:space="preserve"> HYPERLINK \l _Toc29560 </w:instrText>
       </w:r>
       <w:r>
         <w:rPr>
@@ -7215,7 +7215,7 @@
         <w:fldChar w:fldCharType="begin"/>
       </w:r>
       <w:r>
-        <w:instrText xml:space="preserve"> PAGEREF _Toc31955 \h </w:instrText>
+        <w:instrText xml:space="preserve"> PAGEREF _Toc29560 \h </w:instrText>
       </w:r>
       <w:r>
         <w:fldChar w:fldCharType="separate"/>
@@ -7250,7 +7250,7 @@
         <w:rPr>
           <w:rFonts w:ascii="Times New Roman" w:hAnsi="Times New Roman" w:eastAsia="Times New Roman"/>
         </w:rPr>
-        <w:instrText xml:space="preserve"> HYPERLINK \l _Toc18200 </w:instrText>
+        <w:instrText xml:space="preserve"> HYPERLINK \l _Toc15958 </w:instrText>
       </w:r>
       <w:r>
         <w:rPr>
@@ -7272,7 +7272,7 @@
         <w:fldChar w:fldCharType="begin"/>
       </w:r>
       <w:r>
-        <w:instrText xml:space="preserve"> PAGEREF _Toc18200 \h </w:instrText>
+        <w:instrText xml:space="preserve"> PAGEREF _Toc15958 \h </w:instrText>
       </w:r>
       <w:r>
         <w:fldChar w:fldCharType="separate"/>
@@ -7307,7 +7307,7 @@
         <w:rPr>
           <w:rFonts w:ascii="Times New Roman" w:hAnsi="Times New Roman" w:eastAsia="Times New Roman"/>
         </w:rPr>
-        <w:instrText xml:space="preserve"> HYPERLINK \l _Toc5936 </w:instrText>
+        <w:instrText xml:space="preserve"> HYPERLINK \l _Toc18492 </w:instrText>
       </w:r>
       <w:r>
         <w:rPr>
@@ -7329,7 +7329,7 @@
         <w:fldChar w:fldCharType="begin"/>
       </w:r>
       <w:r>
-        <w:instrText xml:space="preserve"> PAGEREF _Toc5936 \h </w:instrText>
+        <w:instrText xml:space="preserve"> PAGEREF _Toc18492 \h </w:instrText>
       </w:r>
       <w:r>
         <w:fldChar w:fldCharType="separate"/>
@@ -7364,7 +7364,7 @@
         <w:rPr>
           <w:rFonts w:ascii="Times New Roman" w:hAnsi="Times New Roman" w:eastAsia="Times New Roman"/>
         </w:rPr>
-        <w:instrText xml:space="preserve"> HYPERLINK \l _Toc27613 </w:instrText>
+        <w:instrText xml:space="preserve"> HYPERLINK \l _Toc23415 </w:instrText>
       </w:r>
       <w:r>
         <w:rPr>
@@ -7386,7 +7386,7 @@
         <w:fldChar w:fldCharType="begin"/>
       </w:r>
       <w:r>
-        <w:instrText xml:space="preserve"> PAGEREF _Toc27613 \h </w:instrText>
+        <w:instrText xml:space="preserve"> PAGEREF _Toc23415 \h </w:instrText>
       </w:r>
       <w:r>
         <w:fldChar w:fldCharType="separate"/>
@@ -7421,7 +7421,7 @@
         <w:rPr>
           <w:rFonts w:ascii="Times New Roman" w:hAnsi="Times New Roman" w:eastAsia="Times New Roman"/>
         </w:rPr>
-        <w:instrText xml:space="preserve"> HYPERLINK \l _Toc27109 </w:instrText>
+        <w:instrText xml:space="preserve"> HYPERLINK \l _Toc32178 </w:instrText>
       </w:r>
       <w:r>
         <w:rPr>
@@ -7443,7 +7443,7 @@
         <w:fldChar w:fldCharType="begin"/>
       </w:r>
       <w:r>
-        <w:instrText xml:space="preserve"> PAGEREF _Toc27109 \h </w:instrText>
+        <w:instrText xml:space="preserve"> PAGEREF _Toc32178 \h </w:instrText>
       </w:r>
       <w:r>
         <w:fldChar w:fldCharType="separate"/>
@@ -7478,7 +7478,7 @@
         <w:rPr>
           <w:rFonts w:ascii="Times New Roman" w:hAnsi="Times New Roman" w:eastAsia="Times New Roman"/>
         </w:rPr>
-        <w:instrText xml:space="preserve"> HYPERLINK \l _Toc23251 </w:instrText>
+        <w:instrText xml:space="preserve"> HYPERLINK \l _Toc30509 </w:instrText>
       </w:r>
       <w:r>
         <w:rPr>
@@ -7500,7 +7500,7 @@
         <w:fldChar w:fldCharType="begin"/>
       </w:r>
       <w:r>
-        <w:instrText xml:space="preserve"> PAGEREF _Toc23251 \h </w:instrText>
+        <w:instrText xml:space="preserve"> PAGEREF _Toc30509 \h </w:instrText>
       </w:r>
       <w:r>
         <w:fldChar w:fldCharType="separate"/>
@@ -7535,7 +7535,7 @@
         <w:rPr>
           <w:rFonts w:ascii="Times New Roman" w:hAnsi="Times New Roman" w:eastAsia="Times New Roman"/>
         </w:rPr>
-        <w:instrText xml:space="preserve"> HYPERLINK \l _Toc26983 </w:instrText>
+        <w:instrText xml:space="preserve"> HYPERLINK \l _Toc20073 </w:instrText>
       </w:r>
       <w:r>
         <w:rPr>
@@ -7557,7 +7557,7 @@
         <w:fldChar w:fldCharType="begin"/>
       </w:r>
       <w:r>
-        <w:instrText xml:space="preserve"> PAGEREF _Toc26983 \h </w:instrText>
+        <w:instrText xml:space="preserve"> PAGEREF _Toc20073 \h </w:instrText>
       </w:r>
       <w:r>
         <w:fldChar w:fldCharType="separate"/>
@@ -7592,7 +7592,7 @@
         <w:rPr>
           <w:rFonts w:ascii="Times New Roman" w:hAnsi="Times New Roman" w:eastAsia="Times New Roman"/>
         </w:rPr>
-        <w:instrText xml:space="preserve"> HYPERLINK \l _Toc29247 </w:instrText>
+        <w:instrText xml:space="preserve"> HYPERLINK \l _Toc4380 </w:instrText>
       </w:r>
       <w:r>
         <w:rPr>
@@ -7614,7 +7614,7 @@
         <w:fldChar w:fldCharType="begin"/>
       </w:r>
       <w:r>
-        <w:instrText xml:space="preserve"> PAGEREF _Toc29247 \h </w:instrText>
+        <w:instrText xml:space="preserve"> PAGEREF _Toc4380 \h </w:instrText>
       </w:r>
       <w:r>
         <w:fldChar w:fldCharType="separate"/>
@@ -7649,7 +7649,7 @@
         <w:rPr>
           <w:rFonts w:ascii="Times New Roman" w:hAnsi="Times New Roman" w:eastAsia="Times New Roman"/>
         </w:rPr>
-        <w:instrText xml:space="preserve"> HYPERLINK \l _Toc28649 </w:instrText>
+        <w:instrText xml:space="preserve"> HYPERLINK \l _Toc30082 </w:instrText>
       </w:r>
       <w:r>
         <w:rPr>
@@ -7671,7 +7671,7 @@
         <w:fldChar w:fldCharType="begin"/>
       </w:r>
       <w:r>
-        <w:instrText xml:space="preserve"> PAGEREF _Toc28649 \h </w:instrText>
+        <w:instrText xml:space="preserve"> PAGEREF _Toc30082 \h </w:instrText>
       </w:r>
       <w:r>
         <w:fldChar w:fldCharType="separate"/>
@@ -7706,7 +7706,7 @@
         <w:rPr>
           <w:rFonts w:ascii="Times New Roman" w:hAnsi="Times New Roman" w:eastAsia="Times New Roman"/>
         </w:rPr>
-        <w:instrText xml:space="preserve"> HYPERLINK \l _Toc19590 </w:instrText>
+        <w:instrText xml:space="preserve"> HYPERLINK \l _Toc29121 </w:instrText>
       </w:r>
       <w:r>
         <w:rPr>
@@ -7728,7 +7728,7 @@
         <w:fldChar w:fldCharType="begin"/>
       </w:r>
       <w:r>
-        <w:instrText xml:space="preserve"> PAGEREF _Toc19590 \h </w:instrText>
+        <w:instrText xml:space="preserve"> PAGEREF _Toc29121 \h </w:instrText>
       </w:r>
       <w:r>
         <w:fldChar w:fldCharType="separate"/>
@@ -7774,7 +7774,7 @@
         <w:pStyle w:val="2"/>
         <w:spacing w:after="360"/>
       </w:pPr>
-      <w:bookmarkStart w:id="0" w:name="_Toc28122"/>
+      <w:bookmarkStart w:id="0" w:name="_Toc10546"/>
       <w:r>
         <w:rPr>
           <w:rFonts w:ascii="Times New Roman" w:hAnsi="Times New Roman" w:eastAsia="Times New Roman"/>
@@ -7819,7 +7819,7 @@
       <w:pPr>
         <w:pStyle w:val="3"/>
       </w:pPr>
-      <w:bookmarkStart w:id="1" w:name="_Toc14889"/>
+      <w:bookmarkStart w:id="1" w:name="_Toc18616"/>
       <w:r>
         <w:rPr>
           <w:rFonts w:ascii="Times New Roman" w:hAnsi="Times New Roman" w:eastAsia="Times New Roman"/>
@@ -8410,7 +8410,7 @@
       <w:pPr>
         <w:pStyle w:val="3"/>
       </w:pPr>
-      <w:bookmarkStart w:id="2" w:name="_Toc5609"/>
+      <w:bookmarkStart w:id="2" w:name="_Toc10824"/>
       <w:r>
         <w:rPr>
           <w:rFonts w:ascii="Times New Roman" w:hAnsi="Times New Roman" w:eastAsia="Times New Roman"/>
@@ -8757,7 +8757,7 @@
       <w:pPr>
         <w:pStyle w:val="3"/>
       </w:pPr>
-      <w:bookmarkStart w:id="3" w:name="_Toc26836"/>
+      <w:bookmarkStart w:id="3" w:name="_Toc9757"/>
       <w:r>
         <w:rPr>
           <w:rFonts w:ascii="Times New Roman" w:hAnsi="Times New Roman" w:eastAsia="Times New Roman"/>
@@ -8800,7 +8800,7 @@
       <w:pPr>
         <w:pStyle w:val="3"/>
       </w:pPr>
-      <w:bookmarkStart w:id="4" w:name="_Toc1281"/>
+      <w:bookmarkStart w:id="4" w:name="_Toc28223"/>
       <w:r>
         <w:rPr>
           <w:rFonts w:ascii="Times New Roman" w:hAnsi="Times New Roman" w:eastAsia="Times New Roman"/>
@@ -8928,7 +8928,7 @@
         <w:pStyle w:val="25"/>
         <w:keepNext/>
       </w:pPr>
-      <w:bookmarkStart w:id="5" w:name="_Toc26854"/>
+      <w:bookmarkStart w:id="5" w:name="_Toc15536"/>
       <w:r>
         <w:rPr>
           <w:rFonts w:ascii="Times New Roman" w:hAnsi="Times New Roman" w:eastAsia="Times New Roman"/>
@@ -9384,7 +9384,7 @@
       <w:pPr>
         <w:pStyle w:val="3"/>
       </w:pPr>
-      <w:bookmarkStart w:id="6" w:name="_Toc23390"/>
+      <w:bookmarkStart w:id="6" w:name="_Toc19306"/>
       <w:r>
         <w:rPr>
           <w:rFonts w:ascii="Times New Roman" w:hAnsi="Times New Roman" w:eastAsia="Times New Roman"/>
@@ -9791,7 +9791,7 @@
       <w:pPr>
         <w:pStyle w:val="3"/>
       </w:pPr>
-      <w:bookmarkStart w:id="7" w:name="_Toc23179"/>
+      <w:bookmarkStart w:id="7" w:name="_Toc6629"/>
       <w:r>
         <w:rPr>
           <w:rFonts w:ascii="Times New Roman" w:hAnsi="Times New Roman" w:eastAsia="Times New Roman"/>
@@ -9820,7 +9820,7 @@
       <w:pPr>
         <w:pStyle w:val="3"/>
       </w:pPr>
-      <w:bookmarkStart w:id="8" w:name="_Toc3430"/>
+      <w:bookmarkStart w:id="8" w:name="_Toc10357"/>
       <w:r>
         <w:rPr>
           <w:rFonts w:ascii="Times New Roman" w:hAnsi="Times New Roman" w:eastAsia="Times New Roman"/>
@@ -9855,7 +9855,7 @@
         <w:pStyle w:val="2"/>
         <w:spacing w:after="360"/>
       </w:pPr>
-      <w:bookmarkStart w:id="9" w:name="_Toc32282"/>
+      <w:bookmarkStart w:id="9" w:name="_Toc19185"/>
       <w:r>
         <w:rPr>
           <w:rFonts w:ascii="Times New Roman" w:hAnsi="Times New Roman" w:eastAsia="Times New Roman"/>
@@ -9900,7 +9900,7 @@
       <w:pPr>
         <w:pStyle w:val="3"/>
       </w:pPr>
-      <w:bookmarkStart w:id="10" w:name="_Toc225"/>
+      <w:bookmarkStart w:id="10" w:name="_Toc1128"/>
       <w:r>
         <w:rPr>
           <w:rFonts w:ascii="Times New Roman" w:hAnsi="Times New Roman" w:eastAsia="Times New Roman"/>
@@ -10377,7 +10377,7 @@
       <w:pPr>
         <w:pStyle w:val="3"/>
       </w:pPr>
-      <w:bookmarkStart w:id="11" w:name="_Toc26581"/>
+      <w:bookmarkStart w:id="11" w:name="_Toc4847"/>
       <w:r>
         <w:rPr>
           <w:rFonts w:ascii="Times New Roman" w:hAnsi="Times New Roman" w:eastAsia="Times New Roman"/>
@@ -10744,7 +10744,7 @@
       <w:pPr>
         <w:pStyle w:val="3"/>
       </w:pPr>
-      <w:bookmarkStart w:id="12" w:name="_Toc23378"/>
+      <w:bookmarkStart w:id="12" w:name="_Toc7556"/>
       <w:r>
         <w:rPr>
           <w:rFonts w:ascii="Times New Roman" w:hAnsi="Times New Roman" w:eastAsia="Times New Roman"/>
@@ -11011,7 +11011,7 @@
       <w:pPr>
         <w:pStyle w:val="3"/>
       </w:pPr>
-      <w:bookmarkStart w:id="13" w:name="_Toc25919"/>
+      <w:bookmarkStart w:id="13" w:name="_Toc26232"/>
       <w:r>
         <w:rPr>
           <w:rFonts w:ascii="Times New Roman" w:hAnsi="Times New Roman" w:eastAsia="Times New Roman"/>
@@ -11068,7 +11068,7 @@
       <w:pPr>
         <w:pStyle w:val="3"/>
       </w:pPr>
-      <w:bookmarkStart w:id="14" w:name="_Toc16885"/>
+      <w:bookmarkStart w:id="14" w:name="_Toc28653"/>
       <w:r>
         <w:rPr>
           <w:rFonts w:ascii="Times New Roman" w:hAnsi="Times New Roman" w:eastAsia="Times New Roman"/>
@@ -11266,7 +11266,7 @@
         <w:pStyle w:val="25"/>
         <w:keepNext/>
       </w:pPr>
-      <w:bookmarkStart w:id="15" w:name="_Toc11267"/>
+      <w:bookmarkStart w:id="15" w:name="_Toc29402"/>
       <w:r>
         <w:rPr>
           <w:rFonts w:ascii="Times New Roman" w:hAnsi="Times New Roman" w:eastAsia="Times New Roman"/>
@@ -12497,7 +12497,7 @@
       <w:pPr>
         <w:pStyle w:val="3"/>
       </w:pPr>
-      <w:bookmarkStart w:id="16" w:name="_Toc1355"/>
+      <w:bookmarkStart w:id="16" w:name="_Toc2890"/>
       <w:r>
         <w:rPr>
           <w:rFonts w:ascii="Times New Roman" w:hAnsi="Times New Roman" w:eastAsia="Times New Roman"/>
@@ -12540,7 +12540,7 @@
       <w:pPr>
         <w:pStyle w:val="3"/>
       </w:pPr>
-      <w:bookmarkStart w:id="17" w:name="_Toc5140"/>
+      <w:bookmarkStart w:id="17" w:name="_Toc9200"/>
       <w:r>
         <w:rPr>
           <w:rFonts w:ascii="Times New Roman" w:hAnsi="Times New Roman" w:eastAsia="Times New Roman"/>
@@ -12575,7 +12575,7 @@
         <w:pStyle w:val="2"/>
         <w:spacing w:after="360"/>
       </w:pPr>
-      <w:bookmarkStart w:id="18" w:name="_Toc28109"/>
+      <w:bookmarkStart w:id="18" w:name="_Toc9209"/>
       <w:r>
         <w:rPr>
           <w:rFonts w:ascii="Times New Roman" w:hAnsi="Times New Roman" w:eastAsia="Times New Roman"/>
@@ -12620,7 +12620,7 @@
       <w:pPr>
         <w:pStyle w:val="3"/>
       </w:pPr>
-      <w:bookmarkStart w:id="19" w:name="_Toc23829"/>
+      <w:bookmarkStart w:id="19" w:name="_Toc26466"/>
       <w:r>
         <w:rPr>
           <w:rFonts w:ascii="Times New Roman" w:hAnsi="Times New Roman" w:eastAsia="Times New Roman"/>
@@ -12678,7 +12678,7 @@
         <w:pStyle w:val="25"/>
         <w:keepNext/>
       </w:pPr>
-      <w:bookmarkStart w:id="20" w:name="_Toc9307"/>
+      <w:bookmarkStart w:id="20" w:name="_Toc16141"/>
       <w:r>
         <w:rPr>
           <w:rFonts w:ascii="Times New Roman" w:hAnsi="Times New Roman" w:eastAsia="Times New Roman"/>
@@ -13502,7 +13502,7 @@
         <w:pStyle w:val="24"/>
         <w:keepLines/>
       </w:pPr>
-      <w:bookmarkStart w:id="21" w:name="_Toc23767"/>
+      <w:bookmarkStart w:id="21" w:name="_Toc26441"/>
       <w:r>
         <w:rPr>
           <w:rFonts w:ascii="Times New Roman" w:hAnsi="Times New Roman" w:eastAsia="Times New Roman"/>
@@ -13517,7 +13517,7 @@
       <w:pPr>
         <w:pStyle w:val="3"/>
       </w:pPr>
-      <w:bookmarkStart w:id="22" w:name="_Toc11731"/>
+      <w:bookmarkStart w:id="22" w:name="_Toc11854"/>
       <w:r>
         <w:rPr>
           <w:rFonts w:ascii="Times New Roman" w:hAnsi="Times New Roman" w:eastAsia="Times New Roman"/>
@@ -13574,7 +13574,7 @@
       <w:pPr>
         <w:pStyle w:val="3"/>
       </w:pPr>
-      <w:bookmarkStart w:id="23" w:name="_Toc25615"/>
+      <w:bookmarkStart w:id="23" w:name="_Toc21254"/>
       <w:r>
         <w:rPr>
           <w:rFonts w:ascii="Times New Roman" w:hAnsi="Times New Roman" w:eastAsia="Times New Roman"/>
@@ -13632,7 +13632,7 @@
         <w:pStyle w:val="25"/>
         <w:keepNext/>
       </w:pPr>
-      <w:bookmarkStart w:id="24" w:name="_Toc27254"/>
+      <w:bookmarkStart w:id="24" w:name="_Toc27470"/>
       <w:r>
         <w:rPr>
           <w:rFonts w:ascii="Times New Roman" w:hAnsi="Times New Roman" w:eastAsia="Times New Roman"/>
@@ -14228,7 +14228,7 @@
       <w:pPr>
         <w:pStyle w:val="3"/>
       </w:pPr>
-      <w:bookmarkStart w:id="25" w:name="_Toc31592"/>
+      <w:bookmarkStart w:id="25" w:name="_Toc12697"/>
       <w:r>
         <w:rPr>
           <w:rFonts w:ascii="Times New Roman" w:hAnsi="Times New Roman" w:eastAsia="Times New Roman"/>
@@ -14286,7 +14286,7 @@
         <w:pStyle w:val="25"/>
         <w:keepNext/>
       </w:pPr>
-      <w:bookmarkStart w:id="26" w:name="_Toc28207"/>
+      <w:bookmarkStart w:id="26" w:name="_Toc23856"/>
       <w:r>
         <w:rPr>
           <w:rFonts w:ascii="Times New Roman" w:hAnsi="Times New Roman" w:eastAsia="Times New Roman"/>
@@ -14973,7 +14973,7 @@
       <w:pPr>
         <w:pStyle w:val="3"/>
       </w:pPr>
-      <w:bookmarkStart w:id="27" w:name="_Toc11490"/>
+      <w:bookmarkStart w:id="27" w:name="_Toc17441"/>
       <w:r>
         <w:rPr>
           <w:rFonts w:ascii="Times New Roman" w:hAnsi="Times New Roman" w:eastAsia="Times New Roman"/>
@@ -15017,7 +15017,7 @@
         <w:pStyle w:val="25"/>
         <w:keepNext/>
       </w:pPr>
-      <w:bookmarkStart w:id="28" w:name="_Toc30358"/>
+      <w:bookmarkStart w:id="28" w:name="_Toc26630"/>
       <w:r>
         <w:rPr>
           <w:rFonts w:ascii="Times New Roman" w:hAnsi="Times New Roman" w:eastAsia="Times New Roman"/>
@@ -15619,7 +15619,7 @@
       <w:pPr>
         <w:pStyle w:val="3"/>
       </w:pPr>
-      <w:bookmarkStart w:id="29" w:name="_Toc209"/>
+      <w:bookmarkStart w:id="29" w:name="_Toc1141"/>
       <w:r>
         <w:rPr>
           <w:rFonts w:ascii="Times New Roman" w:hAnsi="Times New Roman" w:eastAsia="Times New Roman"/>
@@ -15736,7 +15736,7 @@
         <w:pStyle w:val="24"/>
         <w:keepLines/>
       </w:pPr>
-      <w:bookmarkStart w:id="30" w:name="_Toc21571"/>
+      <w:bookmarkStart w:id="30" w:name="_Toc8668"/>
       <w:r>
         <w:rPr>
           <w:rFonts w:ascii="Times New Roman" w:hAnsi="Times New Roman" w:eastAsia="Times New Roman"/>
@@ -15751,7 +15751,7 @@
       <w:pPr>
         <w:pStyle w:val="3"/>
       </w:pPr>
-      <w:bookmarkStart w:id="31" w:name="_Toc7971"/>
+      <w:bookmarkStart w:id="31" w:name="_Toc5024"/>
       <w:r>
         <w:rPr>
           <w:rFonts w:ascii="Times New Roman" w:hAnsi="Times New Roman" w:eastAsia="Times New Roman"/>
@@ -15809,7 +15809,7 @@
         <w:pStyle w:val="25"/>
         <w:keepNext/>
       </w:pPr>
-      <w:bookmarkStart w:id="32" w:name="_Toc8601"/>
+      <w:bookmarkStart w:id="32" w:name="_Toc6333"/>
       <w:r>
         <w:rPr>
           <w:rFonts w:ascii="Times New Roman" w:hAnsi="Times New Roman" w:eastAsia="Times New Roman"/>
@@ -16496,7 +16496,7 @@
       <w:pPr>
         <w:pStyle w:val="3"/>
       </w:pPr>
-      <w:bookmarkStart w:id="33" w:name="_Toc15424"/>
+      <w:bookmarkStart w:id="33" w:name="_Toc3543"/>
       <w:r>
         <w:rPr>
           <w:rFonts w:ascii="Times New Roman" w:hAnsi="Times New Roman" w:eastAsia="Times New Roman"/>
@@ -16539,7 +16539,7 @@
       <w:pPr>
         <w:pStyle w:val="3"/>
       </w:pPr>
-      <w:bookmarkStart w:id="34" w:name="_Toc26975"/>
+      <w:bookmarkStart w:id="34" w:name="_Toc8062"/>
       <w:r>
         <w:rPr>
           <w:rFonts w:ascii="Times New Roman" w:hAnsi="Times New Roman" w:eastAsia="Times New Roman"/>
@@ -16802,7 +16802,7 @@
       <w:pPr>
         <w:pStyle w:val="3"/>
       </w:pPr>
-      <w:bookmarkStart w:id="35" w:name="_Toc20112"/>
+      <w:bookmarkStart w:id="35" w:name="_Toc17239"/>
       <w:r>
         <w:rPr>
           <w:rFonts w:ascii="Times New Roman" w:hAnsi="Times New Roman" w:eastAsia="Times New Roman"/>
@@ -16845,7 +16845,7 @@
       <w:pPr>
         <w:pStyle w:val="3"/>
       </w:pPr>
-      <w:bookmarkStart w:id="36" w:name="_Toc11137"/>
+      <w:bookmarkStart w:id="36" w:name="_Toc76"/>
       <w:r>
         <w:rPr>
           <w:rFonts w:ascii="Times New Roman" w:hAnsi="Times New Roman" w:eastAsia="Times New Roman"/>
@@ -16880,7 +16880,7 @@
         <w:pStyle w:val="2"/>
         <w:spacing w:after="360"/>
       </w:pPr>
-      <w:bookmarkStart w:id="37" w:name="_Toc14482"/>
+      <w:bookmarkStart w:id="37" w:name="_Toc30494"/>
       <w:r>
         <w:rPr>
           <w:rFonts w:ascii="Times New Roman" w:hAnsi="Times New Roman" w:eastAsia="Times New Roman"/>
@@ -16925,7 +16925,7 @@
       <w:pPr>
         <w:pStyle w:val="3"/>
       </w:pPr>
-      <w:bookmarkStart w:id="38" w:name="_Toc2400"/>
+      <w:bookmarkStart w:id="38" w:name="_Toc21512"/>
       <w:r>
         <w:rPr>
           <w:rFonts w:ascii="Times New Roman" w:hAnsi="Times New Roman" w:eastAsia="Times New Roman"/>
@@ -16968,7 +16968,7 @@
       <w:pPr>
         <w:pStyle w:val="3"/>
       </w:pPr>
-      <w:bookmarkStart w:id="39" w:name="_Toc17380"/>
+      <w:bookmarkStart w:id="39" w:name="_Toc23001"/>
       <w:r>
         <w:rPr>
           <w:rFonts w:ascii="Times New Roman" w:hAnsi="Times New Roman" w:eastAsia="Times New Roman"/>
@@ -17026,7 +17026,7 @@
         <w:pStyle w:val="25"/>
         <w:keepNext/>
       </w:pPr>
-      <w:bookmarkStart w:id="40" w:name="_Toc5915"/>
+      <w:bookmarkStart w:id="40" w:name="_Toc31453"/>
       <w:r>
         <w:rPr>
           <w:rFonts w:ascii="Times New Roman" w:hAnsi="Times New Roman" w:eastAsia="Times New Roman"/>
@@ -18085,7 +18085,7 @@
         <w:pStyle w:val="24"/>
         <w:keepLines/>
       </w:pPr>
-      <w:bookmarkStart w:id="41" w:name="_Toc17124"/>
+      <w:bookmarkStart w:id="41" w:name="_Toc5917"/>
       <w:r>
         <w:rPr>
           <w:rFonts w:ascii="Times New Roman" w:hAnsi="Times New Roman" w:eastAsia="Times New Roman"/>
@@ -18100,7 +18100,7 @@
       <w:pPr>
         <w:pStyle w:val="3"/>
       </w:pPr>
-      <w:bookmarkStart w:id="42" w:name="_Toc3774"/>
+      <w:bookmarkStart w:id="42" w:name="_Toc4266"/>
       <w:r>
         <w:rPr>
           <w:rFonts w:ascii="Times New Roman" w:hAnsi="Times New Roman" w:eastAsia="Times New Roman"/>
@@ -18158,7 +18158,7 @@
         <w:pStyle w:val="25"/>
         <w:keepNext/>
       </w:pPr>
-      <w:bookmarkStart w:id="43" w:name="_Toc18789"/>
+      <w:bookmarkStart w:id="43" w:name="_Toc32737"/>
       <w:r>
         <w:rPr>
           <w:rFonts w:ascii="Times New Roman" w:hAnsi="Times New Roman" w:eastAsia="Times New Roman"/>
@@ -18709,7 +18709,7 @@
         <w:pStyle w:val="24"/>
         <w:keepLines/>
       </w:pPr>
-      <w:bookmarkStart w:id="44" w:name="_Toc24196"/>
+      <w:bookmarkStart w:id="44" w:name="_Toc24414"/>
       <w:r>
         <w:rPr>
           <w:rFonts w:ascii="Times New Roman" w:hAnsi="Times New Roman" w:eastAsia="Times New Roman"/>
@@ -18724,7 +18724,7 @@
       <w:pPr>
         <w:pStyle w:val="4"/>
       </w:pPr>
-      <w:bookmarkStart w:id="45" w:name="_Toc31601"/>
+      <w:bookmarkStart w:id="45" w:name="_Toc31130"/>
       <w:r>
         <w:rPr>
           <w:rFonts w:ascii="Times New Roman" w:hAnsi="Times New Roman" w:eastAsia="Times New Roman"/>
@@ -18746,7 +18746,7 @@
           <w:rFonts w:ascii="Times New Roman" w:hAnsi="Times New Roman" w:eastAsia="Times New Roman"/>
           <w:sz w:val="24"/>
         </w:rPr>
-        <w:t>An interim checkpoint summary supplied after repeated evaluation reports materially higher aggregate classification performance than the currently executable notebook. The proposed values are accuracy 0.9300, precision 0.9350, recall 0.9470, F1 0.9400, balanced accuracy 0.9400, internal-test AUROC 0.9850, and anchor-family out-of-fold AUROC 0.9800. The summary attributes the increase to additional image noise reduction, but does not retain the exact preprocessing configuration, run-level values, threshold, checkpoint identifier, prediction vectors, or labels needed for a complete audit.</w:t>
+        <w:t>An interim checkpoint summary supplied after repeated evaluation reports materially higher aggregate classification performance than the currently executable notebook. The corrected summary records 179 correct predictions among 194 internal-test cases, giving accuracy 0.9227 (92.27%), and four false negatives. It also reports precision 0.9350, recall 0.9470, F1 0.9400, balanced accuracy 0.9400, internal-test AUROC 0.9850, and anchor-family out-of-fold AUROC 0.9800. The summary attributes the increase to additional image noise reduction, but does not retain the exact preprocessing configuration, run-level values, threshold, checkpoint identifier, prediction vectors, or labels needed for a complete audit.</w:t>
       </w:r>
     </w:p>
     <w:p>
@@ -18760,7 +18760,7 @@
           <w:rFonts w:ascii="Times New Roman" w:hAnsi="Times New Roman" w:eastAsia="Times New Roman"/>
           <w:sz w:val="24"/>
         </w:rPr>
-        <w:t>The accompanying count statements are not arithmetically compatible with the 194-case test cohort: the reported true-positive, true-negative, false-positive, and false-negative counts sum to 195, while the stated number of correct predictions is given inconsistently. Consequently, the aggregate metrics are shown as provisional checkpoint values, whereas the exact confusion matrix, ECE, triage operating points, bootstrap intervals, DeLong test, and McNemar test remain tied to the verified notebook until the updated outputs are available. This prevents a higher headline accuracy from being combined with incompatible secondary statistics.</w:t>
+        <w:t>The corrected accuracy and false-negative count supersede the earlier count statement. Because the remaining true-positive, true-negative, and false-positive counts have not been supplied as a complete retained-run matrix, no additional count is inferred. The aggregate metrics are therefore shown as provisional checkpoint values, whereas the complete confusion matrix, ECE, triage operating points, bootstrap intervals, DeLong test, and McNemar test remain tied to the verified notebook until the updated outputs are available. This keeps repeated-run summaries separate from count-based statistics for a single retained checkpoint.</w:t>
       </w:r>
     </w:p>
     <w:p>
@@ -18768,7 +18768,7 @@
         <w:pStyle w:val="25"/>
         <w:keepNext/>
       </w:pPr>
-      <w:bookmarkStart w:id="46" w:name="_Toc22216"/>
+      <w:bookmarkStart w:id="46" w:name="_Toc5661"/>
       <w:r>
         <w:rPr>
           <w:rFonts w:ascii="Times New Roman" w:hAnsi="Times New Roman" w:eastAsia="Times New Roman"/>
@@ -19010,7 +19010,7 @@
                 <w:rFonts w:ascii="Times New Roman" w:hAnsi="Times New Roman" w:eastAsia="Times New Roman"/>
                 <w:sz w:val="15"/>
               </w:rPr>
-              <w:t>0.9300</w:t>
+              <w:t>0.9227 (179/194)</w:t>
             </w:r>
           </w:p>
         </w:tc>
@@ -19033,7 +19033,7 @@
                 <w:rFonts w:ascii="Times New Roman" w:hAnsi="Times New Roman" w:eastAsia="Times New Roman"/>
                 <w:sz w:val="15"/>
               </w:rPr>
-              <w:t>Provisional aggregate</w:t>
+              <w:t>Corrected checkpoint summary</w:t>
             </w:r>
           </w:p>
         </w:tc>
@@ -19808,7 +19808,7 @@
                 <w:rFonts w:ascii="Times New Roman" w:hAnsi="Times New Roman" w:eastAsia="Times New Roman"/>
                 <w:sz w:val="15"/>
               </w:rPr>
-              <w:t>Internally inconsistent</w:t>
+              <w:t>FN 4; other counts pending</w:t>
             </w:r>
           </w:p>
         </w:tc>
@@ -19831,7 +19831,7 @@
                 <w:rFonts w:ascii="Times New Roman" w:hAnsi="Times New Roman" w:eastAsia="Times New Roman"/>
                 <w:sz w:val="15"/>
               </w:rPr>
-              <w:t>Await updated predictions</w:t>
+              <w:t>Partial checkpoint count</w:t>
             </w:r>
           </w:p>
         </w:tc>
@@ -20074,7 +20074,7 @@
       <w:pPr>
         <w:pStyle w:val="3"/>
       </w:pPr>
-      <w:bookmarkStart w:id="47" w:name="_Toc22592"/>
+      <w:bookmarkStart w:id="47" w:name="_Toc9228"/>
       <w:r>
         <w:rPr>
           <w:rFonts w:ascii="Times New Roman" w:hAnsi="Times New Roman" w:eastAsia="Times New Roman"/>
@@ -20118,7 +20118,7 @@
         <w:pStyle w:val="25"/>
         <w:keepNext/>
       </w:pPr>
-      <w:bookmarkStart w:id="48" w:name="_Toc27594"/>
+      <w:bookmarkStart w:id="48" w:name="_Toc11588"/>
       <w:r>
         <w:rPr>
           <w:rFonts w:ascii="Times New Roman" w:hAnsi="Times New Roman" w:eastAsia="Times New Roman"/>
@@ -20974,7 +20974,7 @@
       <w:pPr>
         <w:pStyle w:val="3"/>
       </w:pPr>
-      <w:bookmarkStart w:id="49" w:name="_Toc30989"/>
+      <w:bookmarkStart w:id="49" w:name="_Toc3233"/>
       <w:r>
         <w:rPr>
           <w:rFonts w:ascii="Times New Roman" w:hAnsi="Times New Roman" w:eastAsia="Times New Roman"/>
@@ -21018,7 +21018,7 @@
         <w:pStyle w:val="25"/>
         <w:keepNext/>
       </w:pPr>
-      <w:bookmarkStart w:id="50" w:name="_Toc14195"/>
+      <w:bookmarkStart w:id="50" w:name="_Toc15660"/>
       <w:r>
         <w:rPr>
           <w:rFonts w:ascii="Times New Roman" w:hAnsi="Times New Roman" w:eastAsia="Times New Roman"/>
@@ -21800,7 +21800,7 @@
         <w:pStyle w:val="24"/>
         <w:keepLines/>
       </w:pPr>
-      <w:bookmarkStart w:id="51" w:name="_Toc25222"/>
+      <w:bookmarkStart w:id="51" w:name="_Toc2491"/>
       <w:r>
         <w:rPr>
           <w:rFonts w:ascii="Times New Roman" w:hAnsi="Times New Roman" w:eastAsia="Times New Roman"/>
@@ -21815,7 +21815,7 @@
       <w:pPr>
         <w:pStyle w:val="3"/>
       </w:pPr>
-      <w:bookmarkStart w:id="52" w:name="_Toc20775"/>
+      <w:bookmarkStart w:id="52" w:name="_Toc5142"/>
       <w:r>
         <w:rPr>
           <w:rFonts w:ascii="Times New Roman" w:hAnsi="Times New Roman" w:eastAsia="Times New Roman"/>
@@ -21873,7 +21873,7 @@
         <w:pStyle w:val="25"/>
         <w:keepNext/>
       </w:pPr>
-      <w:bookmarkStart w:id="53" w:name="_Toc11738"/>
+      <w:bookmarkStart w:id="53" w:name="_Toc9360"/>
       <w:r>
         <w:rPr>
           <w:rFonts w:ascii="Times New Roman" w:hAnsi="Times New Roman" w:eastAsia="Times New Roman"/>
@@ -22480,7 +22480,7 @@
       <w:pPr>
         <w:pStyle w:val="3"/>
       </w:pPr>
-      <w:bookmarkStart w:id="54" w:name="_Toc14534"/>
+      <w:bookmarkStart w:id="54" w:name="_Toc3916"/>
       <w:r>
         <w:rPr>
           <w:rFonts w:ascii="Times New Roman" w:hAnsi="Times New Roman" w:eastAsia="Times New Roman"/>
@@ -22555,7 +22555,7 @@
         <w:pStyle w:val="24"/>
         <w:keepLines/>
       </w:pPr>
-      <w:bookmarkStart w:id="55" w:name="_Toc27018"/>
+      <w:bookmarkStart w:id="55" w:name="_Toc20401"/>
       <w:r>
         <w:rPr>
           <w:rFonts w:ascii="Times New Roman" w:hAnsi="Times New Roman" w:eastAsia="Times New Roman"/>
@@ -22585,7 +22585,7 @@
         <w:pStyle w:val="25"/>
         <w:keepNext/>
       </w:pPr>
-      <w:bookmarkStart w:id="56" w:name="_Toc4657"/>
+      <w:bookmarkStart w:id="56" w:name="_Toc9088"/>
       <w:r>
         <w:rPr>
           <w:rFonts w:ascii="Times New Roman" w:hAnsi="Times New Roman" w:eastAsia="Times New Roman"/>
@@ -23155,7 +23155,7 @@
         <w:pStyle w:val="24"/>
         <w:keepLines/>
       </w:pPr>
-      <w:bookmarkStart w:id="57" w:name="_Toc5202"/>
+      <w:bookmarkStart w:id="57" w:name="_Toc855"/>
       <w:r>
         <w:rPr>
           <w:rFonts w:ascii="Times New Roman" w:hAnsi="Times New Roman" w:eastAsia="Times New Roman"/>
@@ -23170,7 +23170,7 @@
       <w:pPr>
         <w:pStyle w:val="3"/>
       </w:pPr>
-      <w:bookmarkStart w:id="58" w:name="_Toc5075"/>
+      <w:bookmarkStart w:id="58" w:name="_Toc10587"/>
       <w:r>
         <w:rPr>
           <w:rFonts w:ascii="Times New Roman" w:hAnsi="Times New Roman" w:eastAsia="Times New Roman"/>
@@ -23228,7 +23228,7 @@
         <w:pStyle w:val="25"/>
         <w:keepNext/>
       </w:pPr>
-      <w:bookmarkStart w:id="59" w:name="_Toc21366"/>
+      <w:bookmarkStart w:id="59" w:name="_Toc22537"/>
       <w:r>
         <w:rPr>
           <w:rFonts w:ascii="Times New Roman" w:hAnsi="Times New Roman" w:eastAsia="Times New Roman"/>
@@ -23876,7 +23876,7 @@
         <w:pStyle w:val="24"/>
         <w:keepLines/>
       </w:pPr>
-      <w:bookmarkStart w:id="60" w:name="_Toc10672"/>
+      <w:bookmarkStart w:id="60" w:name="_Toc6590"/>
       <w:r>
         <w:rPr>
           <w:rFonts w:ascii="Times New Roman" w:hAnsi="Times New Roman" w:eastAsia="Times New Roman"/>
@@ -23891,7 +23891,7 @@
       <w:pPr>
         <w:pStyle w:val="3"/>
       </w:pPr>
-      <w:bookmarkStart w:id="61" w:name="_Toc26591"/>
+      <w:bookmarkStart w:id="61" w:name="_Toc14029"/>
       <w:r>
         <w:rPr>
           <w:rFonts w:ascii="Times New Roman" w:hAnsi="Times New Roman" w:eastAsia="Times New Roman"/>
@@ -24226,7 +24226,7 @@
       <w:pPr>
         <w:pStyle w:val="3"/>
       </w:pPr>
-      <w:bookmarkStart w:id="62" w:name="_Toc11093"/>
+      <w:bookmarkStart w:id="62" w:name="_Toc16263"/>
       <w:r>
         <w:rPr>
           <w:rFonts w:ascii="Times New Roman" w:hAnsi="Times New Roman" w:eastAsia="Times New Roman"/>
@@ -24261,7 +24261,7 @@
         <w:pStyle w:val="2"/>
         <w:spacing w:after="360"/>
       </w:pPr>
-      <w:bookmarkStart w:id="63" w:name="_Toc5270"/>
+      <w:bookmarkStart w:id="63" w:name="_Toc1625"/>
       <w:r>
         <w:rPr>
           <w:rFonts w:ascii="Times New Roman" w:hAnsi="Times New Roman" w:eastAsia="Times New Roman"/>
@@ -24306,7 +24306,7 @@
       <w:pPr>
         <w:pStyle w:val="3"/>
       </w:pPr>
-      <w:bookmarkStart w:id="64" w:name="_Toc9883"/>
+      <w:bookmarkStart w:id="64" w:name="_Toc29261"/>
       <w:r>
         <w:rPr>
           <w:rFonts w:ascii="Times New Roman" w:hAnsi="Times New Roman" w:eastAsia="Times New Roman"/>
@@ -24390,7 +24390,7 @@
         <w:pStyle w:val="25"/>
         <w:keepNext/>
       </w:pPr>
-      <w:bookmarkStart w:id="65" w:name="_Toc13815"/>
+      <w:bookmarkStart w:id="65" w:name="_Toc29775"/>
       <w:r>
         <w:rPr>
           <w:rFonts w:ascii="Times New Roman" w:hAnsi="Times New Roman" w:eastAsia="Times New Roman"/>
@@ -25077,7 +25077,7 @@
       <w:pPr>
         <w:pStyle w:val="3"/>
       </w:pPr>
-      <w:bookmarkStart w:id="66" w:name="_Toc3360"/>
+      <w:bookmarkStart w:id="66" w:name="_Toc740"/>
       <w:r>
         <w:rPr>
           <w:rFonts w:ascii="Times New Roman" w:hAnsi="Times New Roman" w:eastAsia="Times New Roman"/>
@@ -25134,7 +25134,7 @@
       <w:pPr>
         <w:pStyle w:val="3"/>
       </w:pPr>
-      <w:bookmarkStart w:id="67" w:name="_Toc12801"/>
+      <w:bookmarkStart w:id="67" w:name="_Toc21175"/>
       <w:r>
         <w:rPr>
           <w:rFonts w:ascii="Times New Roman" w:hAnsi="Times New Roman" w:eastAsia="Times New Roman"/>
@@ -25177,7 +25177,7 @@
       <w:pPr>
         <w:pStyle w:val="3"/>
       </w:pPr>
-      <w:bookmarkStart w:id="68" w:name="_Toc28547"/>
+      <w:bookmarkStart w:id="68" w:name="_Toc8616"/>
       <w:r>
         <w:rPr>
           <w:rFonts w:ascii="Times New Roman" w:hAnsi="Times New Roman" w:eastAsia="Times New Roman"/>
@@ -25207,7 +25207,7 @@
         <w:pStyle w:val="25"/>
         <w:keepNext/>
       </w:pPr>
-      <w:bookmarkStart w:id="69" w:name="_Toc2036"/>
+      <w:bookmarkStart w:id="69" w:name="_Toc18445"/>
       <w:r>
         <w:rPr>
           <w:rFonts w:ascii="Times New Roman" w:hAnsi="Times New Roman" w:eastAsia="Times New Roman"/>
@@ -25814,7 +25814,7 @@
         <w:pStyle w:val="25"/>
         <w:keepNext/>
       </w:pPr>
-      <w:bookmarkStart w:id="70" w:name="_Toc8240"/>
+      <w:bookmarkStart w:id="70" w:name="_Toc4242"/>
       <w:r>
         <w:rPr>
           <w:rFonts w:ascii="Times New Roman" w:hAnsi="Times New Roman" w:eastAsia="Times New Roman"/>
@@ -26592,7 +26592,7 @@
       <w:pPr>
         <w:pStyle w:val="3"/>
       </w:pPr>
-      <w:bookmarkStart w:id="71" w:name="_Toc21055"/>
+      <w:bookmarkStart w:id="71" w:name="_Toc28678"/>
       <w:r>
         <w:rPr>
           <w:rFonts w:ascii="Times New Roman" w:hAnsi="Times New Roman" w:eastAsia="Times New Roman"/>
@@ -26636,7 +26636,7 @@
         <w:pStyle w:val="25"/>
         <w:keepNext/>
       </w:pPr>
-      <w:bookmarkStart w:id="72" w:name="_Toc31955"/>
+      <w:bookmarkStart w:id="72" w:name="_Toc29560"/>
       <w:r>
         <w:rPr>
           <w:rFonts w:ascii="Times New Roman" w:hAnsi="Times New Roman" w:eastAsia="Times New Roman"/>
@@ -27160,7 +27160,7 @@
       <w:pPr>
         <w:pStyle w:val="3"/>
       </w:pPr>
-      <w:bookmarkStart w:id="73" w:name="_Toc14642"/>
+      <w:bookmarkStart w:id="73" w:name="_Toc12300"/>
       <w:r>
         <w:rPr>
           <w:rFonts w:ascii="Times New Roman" w:hAnsi="Times New Roman" w:eastAsia="Times New Roman"/>
@@ -27203,7 +27203,7 @@
       <w:pPr>
         <w:pStyle w:val="3"/>
       </w:pPr>
-      <w:bookmarkStart w:id="74" w:name="_Toc29721"/>
+      <w:bookmarkStart w:id="74" w:name="_Toc6277"/>
       <w:r>
         <w:rPr>
           <w:rFonts w:ascii="Times New Roman" w:hAnsi="Times New Roman" w:eastAsia="Times New Roman"/>
@@ -27219,7 +27219,7 @@
         <w:pStyle w:val="25"/>
         <w:keepNext/>
       </w:pPr>
-      <w:bookmarkStart w:id="75" w:name="_Toc18200"/>
+      <w:bookmarkStart w:id="75" w:name="_Toc15958"/>
       <w:r>
         <w:rPr>
           <w:rFonts w:ascii="Times New Roman" w:hAnsi="Times New Roman" w:eastAsia="Times New Roman"/>
@@ -28102,7 +28102,7 @@
       <w:pPr>
         <w:pStyle w:val="3"/>
       </w:pPr>
-      <w:bookmarkStart w:id="76" w:name="_Toc23702"/>
+      <w:bookmarkStart w:id="76" w:name="_Toc10155"/>
       <w:r>
         <w:rPr>
           <w:rFonts w:ascii="Times New Roman" w:hAnsi="Times New Roman" w:eastAsia="Times New Roman"/>
@@ -28137,7 +28137,7 @@
         <w:pStyle w:val="2"/>
         <w:spacing w:after="360"/>
       </w:pPr>
-      <w:bookmarkStart w:id="77" w:name="_Toc24120"/>
+      <w:bookmarkStart w:id="77" w:name="_Toc6648"/>
       <w:r>
         <w:rPr>
           <w:rFonts w:ascii="Times New Roman" w:hAnsi="Times New Roman" w:eastAsia="Times New Roman"/>
@@ -28182,7 +28182,7 @@
       <w:pPr>
         <w:pStyle w:val="3"/>
       </w:pPr>
-      <w:bookmarkStart w:id="78" w:name="_Toc21489"/>
+      <w:bookmarkStart w:id="78" w:name="_Toc14206"/>
       <w:r>
         <w:rPr>
           <w:rFonts w:ascii="Times New Roman" w:hAnsi="Times New Roman" w:eastAsia="Times New Roman"/>
@@ -28232,7 +28232,7 @@
           <w:rFonts w:ascii="Times New Roman" w:hAnsi="Times New Roman" w:eastAsia="Times New Roman"/>
           <w:sz w:val="24"/>
         </w:rPr>
-        <w:t>The later checkpoint summary provisionally reports accuracy 0.9300, precision 0.9350, recall 0.9470, F1 0.9400, balanced accuracy 0.9400, internal-test AUROC 0.9850, and anchor-family OOF AUROC 0.9800 after repeated evaluation and additional noise reduction. These values have not replaced the verified result tables because the supplied count statements are inconsistent with the 194-case cohort and the threshold, per-run dispersion, calibration outputs, and paired prediction vectors were not supplied.</w:t>
+        <w:t>The later checkpoint summary provisionally reports 179 correct predictions among 194 internal-test cases, corresponding to accuracy 0.9227 (92.27%), with four false negatives. It also reports precision 0.9350, recall 0.9470, F1 0.9400, balanced accuracy 0.9400, internal-test AUROC 0.9850, and anchor-family OOF AUROC 0.9800 after repeated evaluation and additional noise reduction. These values have not replaced the verified result tables because the complete retained-run confusion matrix, threshold, per-run dispersion, calibration outputs, and paired prediction vectors were not supplied.</w:t>
       </w:r>
     </w:p>
     <w:p>
@@ -28253,7 +28253,7 @@
       <w:pPr>
         <w:pStyle w:val="3"/>
       </w:pPr>
-      <w:bookmarkStart w:id="79" w:name="_Toc16146"/>
+      <w:bookmarkStart w:id="79" w:name="_Toc18071"/>
       <w:r>
         <w:rPr>
           <w:rFonts w:ascii="Times New Roman" w:hAnsi="Times New Roman" w:eastAsia="Times New Roman"/>
@@ -28352,7 +28352,7 @@
       <w:pPr>
         <w:pStyle w:val="3"/>
       </w:pPr>
-      <w:bookmarkStart w:id="80" w:name="_Toc9275"/>
+      <w:bookmarkStart w:id="80" w:name="_Toc21373"/>
       <w:r>
         <w:rPr>
           <w:rFonts w:ascii="Times New Roman" w:hAnsi="Times New Roman" w:eastAsia="Times New Roman"/>
@@ -28437,7 +28437,7 @@
       <w:pPr>
         <w:pStyle w:val="3"/>
       </w:pPr>
-      <w:bookmarkStart w:id="81" w:name="_Toc7886"/>
+      <w:bookmarkStart w:id="81" w:name="_Toc27305"/>
       <w:r>
         <w:rPr>
           <w:rFonts w:ascii="Times New Roman" w:hAnsi="Times New Roman" w:eastAsia="Times New Roman"/>
@@ -28548,7 +28548,7 @@
       <w:pPr>
         <w:pStyle w:val="3"/>
       </w:pPr>
-      <w:bookmarkStart w:id="82" w:name="_Toc6111"/>
+      <w:bookmarkStart w:id="82" w:name="_Toc26168"/>
       <w:r>
         <w:rPr>
           <w:rFonts w:ascii="Times New Roman" w:hAnsi="Times New Roman" w:eastAsia="Times New Roman"/>
@@ -28582,7 +28582,7 @@
       <w:pPr>
         <w:pStyle w:val="2"/>
       </w:pPr>
-      <w:bookmarkStart w:id="83" w:name="_Toc32129"/>
+      <w:bookmarkStart w:id="83" w:name="_Toc67"/>
       <w:r>
         <w:rPr>
           <w:rFonts w:ascii="Times New Roman" w:hAnsi="Times New Roman" w:eastAsia="Times New Roman"/>
@@ -29577,7 +29577,7 @@
       <w:pPr>
         <w:pStyle w:val="2"/>
       </w:pPr>
-      <w:bookmarkStart w:id="84" w:name="_Toc30861"/>
+      <w:bookmarkStart w:id="84" w:name="_Toc23598"/>
       <w:r>
         <w:rPr>
           <w:rFonts w:ascii="Times New Roman" w:hAnsi="Times New Roman" w:eastAsia="Times New Roman"/>
@@ -29608,7 +29608,7 @@
       <w:pPr>
         <w:pStyle w:val="3"/>
       </w:pPr>
-      <w:bookmarkStart w:id="85" w:name="_Toc26691"/>
+      <w:bookmarkStart w:id="85" w:name="_Toc6583"/>
       <w:r>
         <w:rPr>
           <w:rFonts w:ascii="Times New Roman" w:hAnsi="Times New Roman" w:eastAsia="Times New Roman"/>
@@ -29624,7 +29624,7 @@
         <w:pStyle w:val="25"/>
         <w:keepNext/>
       </w:pPr>
-      <w:bookmarkStart w:id="86" w:name="_Toc5936"/>
+      <w:bookmarkStart w:id="86" w:name="_Toc18492"/>
       <w:r>
         <w:rPr>
           <w:rFonts w:ascii="Times New Roman" w:hAnsi="Times New Roman" w:eastAsia="Times New Roman"/>
@@ -30896,7 +30896,7 @@
       <w:pPr>
         <w:pStyle w:val="3"/>
       </w:pPr>
-      <w:bookmarkStart w:id="87" w:name="_Toc2175"/>
+      <w:bookmarkStart w:id="87" w:name="_Toc16113"/>
       <w:r>
         <w:rPr>
           <w:rFonts w:ascii="Times New Roman" w:hAnsi="Times New Roman" w:eastAsia="Times New Roman"/>
@@ -30912,7 +30912,7 @@
         <w:pStyle w:val="25"/>
         <w:keepNext/>
       </w:pPr>
-      <w:bookmarkStart w:id="88" w:name="_Toc27613"/>
+      <w:bookmarkStart w:id="88" w:name="_Toc23415"/>
       <w:r>
         <w:rPr>
           <w:rFonts w:ascii="Times New Roman" w:hAnsi="Times New Roman" w:eastAsia="Times New Roman"/>
@@ -31508,7 +31508,7 @@
       <w:pPr>
         <w:pStyle w:val="3"/>
       </w:pPr>
-      <w:bookmarkStart w:id="89" w:name="_Toc25573"/>
+      <w:bookmarkStart w:id="89" w:name="_Toc176"/>
       <w:r>
         <w:rPr>
           <w:rFonts w:ascii="Times New Roman" w:hAnsi="Times New Roman" w:eastAsia="Times New Roman"/>
@@ -31542,7 +31542,7 @@
       <w:pPr>
         <w:pStyle w:val="2"/>
       </w:pPr>
-      <w:bookmarkStart w:id="90" w:name="_Toc16084"/>
+      <w:bookmarkStart w:id="90" w:name="_Toc1627"/>
       <w:r>
         <w:rPr>
           <w:rFonts w:ascii="Times New Roman" w:hAnsi="Times New Roman" w:eastAsia="Times New Roman"/>
@@ -31574,7 +31574,7 @@
         <w:pStyle w:val="25"/>
         <w:keepNext/>
       </w:pPr>
-      <w:bookmarkStart w:id="91" w:name="_Toc27109"/>
+      <w:bookmarkStart w:id="91" w:name="_Toc32178"/>
       <w:r>
         <w:rPr>
           <w:rFonts w:ascii="Times New Roman" w:hAnsi="Times New Roman" w:eastAsia="Times New Roman"/>
@@ -32302,7 +32302,7 @@
       <w:pPr>
         <w:pStyle w:val="3"/>
       </w:pPr>
-      <w:bookmarkStart w:id="92" w:name="_Toc16974"/>
+      <w:bookmarkStart w:id="92" w:name="_Toc14105"/>
       <w:r>
         <w:rPr>
           <w:rFonts w:ascii="Times New Roman" w:hAnsi="Times New Roman" w:eastAsia="Times New Roman"/>
@@ -32434,7 +32434,7 @@
       <w:pPr>
         <w:pStyle w:val="2"/>
       </w:pPr>
-      <w:bookmarkStart w:id="93" w:name="_Toc10238"/>
+      <w:bookmarkStart w:id="93" w:name="_Toc14418"/>
       <w:r>
         <w:rPr>
           <w:rFonts w:ascii="Times New Roman" w:hAnsi="Times New Roman" w:eastAsia="Times New Roman"/>
@@ -32465,7 +32465,7 @@
       <w:pPr>
         <w:pStyle w:val="3"/>
       </w:pPr>
-      <w:bookmarkStart w:id="94" w:name="_Toc24519"/>
+      <w:bookmarkStart w:id="94" w:name="_Toc12344"/>
       <w:r>
         <w:rPr>
           <w:rFonts w:ascii="Times New Roman" w:hAnsi="Times New Roman" w:eastAsia="Times New Roman"/>
@@ -32481,7 +32481,7 @@
         <w:pStyle w:val="25"/>
         <w:keepNext/>
       </w:pPr>
-      <w:bookmarkStart w:id="95" w:name="_Toc23251"/>
+      <w:bookmarkStart w:id="95" w:name="_Toc30509"/>
       <w:r>
         <w:rPr>
           <w:rFonts w:ascii="Times New Roman" w:hAnsi="Times New Roman" w:eastAsia="Times New Roman"/>
@@ -33350,7 +33350,7 @@
       <w:pPr>
         <w:pStyle w:val="3"/>
       </w:pPr>
-      <w:bookmarkStart w:id="96" w:name="_Toc4684"/>
+      <w:bookmarkStart w:id="96" w:name="_Toc29697"/>
       <w:r>
         <w:rPr>
           <w:rFonts w:ascii="Times New Roman" w:hAnsi="Times New Roman" w:eastAsia="Times New Roman"/>
@@ -33366,7 +33366,7 @@
         <w:pStyle w:val="25"/>
         <w:keepNext/>
       </w:pPr>
-      <w:bookmarkStart w:id="97" w:name="_Toc26983"/>
+      <w:bookmarkStart w:id="97" w:name="_Toc20073"/>
       <w:r>
         <w:rPr>
           <w:rFonts w:ascii="Times New Roman" w:hAnsi="Times New Roman" w:eastAsia="Times New Roman"/>
@@ -33560,7 +33560,7 @@
                 <w:rFonts w:ascii="Times New Roman" w:hAnsi="Times New Roman" w:eastAsia="Times New Roman"/>
                 <w:sz w:val="15"/>
               </w:rPr>
-              <w:t>0.9300</w:t>
+              <w:t>0.9227 (179/194)</w:t>
             </w:r>
           </w:p>
         </w:tc>
@@ -33583,7 +33583,7 @@
                 <w:rFonts w:ascii="Times New Roman" w:hAnsi="Times New Roman" w:eastAsia="Times New Roman"/>
                 <w:sz w:val="15"/>
               </w:rPr>
-              <w:t>Run-level values, threshold, and confusion matrix</w:t>
+              <w:t>Run-level values, threshold, and complete confusion matrix</w:t>
             </w:r>
           </w:p>
         </w:tc>
@@ -33674,7 +33674,7 @@
                 <w:rFonts w:ascii="Times New Roman" w:hAnsi="Times New Roman" w:eastAsia="Times New Roman"/>
                 <w:sz w:val="15"/>
               </w:rPr>
-              <w:t>Per-case labels and decisions</w:t>
+              <w:t>Per-case labels and decisions; FN reported as 4</w:t>
             </w:r>
           </w:p>
         </w:tc>
@@ -34326,7 +34326,7 @@
       <w:pPr>
         <w:pStyle w:val="3"/>
       </w:pPr>
-      <w:bookmarkStart w:id="98" w:name="_Toc28619"/>
+      <w:bookmarkStart w:id="98" w:name="_Toc2983"/>
       <w:r>
         <w:rPr>
           <w:rFonts w:ascii="Times New Roman" w:hAnsi="Times New Roman" w:eastAsia="Times New Roman"/>
@@ -34374,7 +34374,7 @@
       <w:pPr>
         <w:pStyle w:val="2"/>
       </w:pPr>
-      <w:bookmarkStart w:id="99" w:name="_Toc12312"/>
+      <w:bookmarkStart w:id="99" w:name="_Toc11107"/>
       <w:r>
         <w:rPr>
           <w:rFonts w:ascii="Times New Roman" w:hAnsi="Times New Roman" w:eastAsia="Times New Roman"/>
@@ -34406,7 +34406,7 @@
         <w:pStyle w:val="25"/>
         <w:keepNext/>
       </w:pPr>
-      <w:bookmarkStart w:id="100" w:name="_Toc29247"/>
+      <w:bookmarkStart w:id="100" w:name="_Toc4380"/>
       <w:r>
         <w:rPr>
           <w:rFonts w:ascii="Times New Roman" w:hAnsi="Times New Roman" w:eastAsia="Times New Roman"/>
@@ -35370,7 +35370,7 @@
       <w:pPr>
         <w:pStyle w:val="3"/>
       </w:pPr>
-      <w:bookmarkStart w:id="101" w:name="_Toc32006"/>
+      <w:bookmarkStart w:id="101" w:name="_Toc10513"/>
       <w:r>
         <w:rPr>
           <w:rFonts w:ascii="Times New Roman" w:hAnsi="Times New Roman" w:eastAsia="Times New Roman"/>
@@ -35418,7 +35418,7 @@
       <w:pPr>
         <w:pStyle w:val="2"/>
       </w:pPr>
-      <w:bookmarkStart w:id="102" w:name="_Toc25641"/>
+      <w:bookmarkStart w:id="102" w:name="_Toc9874"/>
       <w:r>
         <w:rPr>
           <w:rFonts w:ascii="Times New Roman" w:hAnsi="Times New Roman" w:eastAsia="Times New Roman"/>
@@ -35450,7 +35450,7 @@
         <w:pStyle w:val="25"/>
         <w:keepNext/>
       </w:pPr>
-      <w:bookmarkStart w:id="103" w:name="_Toc28649"/>
+      <w:bookmarkStart w:id="103" w:name="_Toc30082"/>
       <w:r>
         <w:rPr>
           <w:rFonts w:ascii="Times New Roman" w:hAnsi="Times New Roman" w:eastAsia="Times New Roman"/>
@@ -36319,7 +36319,7 @@
       <w:pPr>
         <w:pStyle w:val="3"/>
       </w:pPr>
-      <w:bookmarkStart w:id="104" w:name="_Toc7856"/>
+      <w:bookmarkStart w:id="104" w:name="_Toc25309"/>
       <w:r>
         <w:rPr>
           <w:rFonts w:ascii="Times New Roman" w:hAnsi="Times New Roman" w:eastAsia="Times New Roman"/>
@@ -36353,7 +36353,7 @@
       <w:pPr>
         <w:pStyle w:val="2"/>
       </w:pPr>
-      <w:bookmarkStart w:id="105" w:name="_Toc21050"/>
+      <w:bookmarkStart w:id="105" w:name="_Toc1604"/>
       <w:r>
         <w:rPr>
           <w:rFonts w:ascii="Times New Roman" w:hAnsi="Times New Roman" w:eastAsia="Times New Roman"/>
@@ -36385,7 +36385,7 @@
         <w:pStyle w:val="25"/>
         <w:keepNext/>
       </w:pPr>
-      <w:bookmarkStart w:id="106" w:name="_Toc19590"/>
+      <w:bookmarkStart w:id="106" w:name="_Toc29121"/>
       <w:r>
         <w:rPr>
           <w:rFonts w:ascii="Times New Roman" w:hAnsi="Times New Roman" w:eastAsia="Times New Roman"/>
@@ -37786,7 +37786,7 @@
       <w:pPr>
         <w:pStyle w:val="3"/>
       </w:pPr>
-      <w:bookmarkStart w:id="107" w:name="_Toc13676"/>
+      <w:bookmarkStart w:id="107" w:name="_Toc28461"/>
       <w:r>
         <w:rPr>
           <w:rFonts w:ascii="Times New Roman" w:hAnsi="Times New Roman" w:eastAsia="Times New Roman"/>
@@ -38696,6 +38696,7 @@
   </w:style>
   <w:style w:type="paragraph" w:customStyle="1" w:styleId="23">
     <w:name w:val="Chapter Intro"/>
+    <w:qFormat/>
     <w:uiPriority w:val="0"/>
     <w:pPr>
       <w:spacing w:after="120" w:line="360" w:lineRule="auto"/>
@@ -38710,6 +38711,7 @@
   </w:style>
   <w:style w:type="paragraph" w:customStyle="1" w:styleId="24">
     <w:name w:val="Figure Caption"/>
+    <w:qFormat/>
     <w:uiPriority w:val="0"/>
     <w:pPr>
       <w:spacing w:after="160" w:line="252" w:lineRule="auto"/>
@@ -38736,6 +38738,7 @@
   </w:style>
   <w:style w:type="paragraph" w:customStyle="1" w:styleId="26">
     <w:name w:val="Reference Entry"/>
+    <w:qFormat/>
     <w:uiPriority w:val="0"/>
     <w:pPr>
       <w:spacing w:after="120" w:line="252" w:lineRule="auto"/>
@@ -38750,6 +38753,7 @@
   </w:style>
   <w:style w:type="paragraph" w:customStyle="1" w:styleId="27">
     <w:name w:val="Table Text"/>
+    <w:qFormat/>
     <w:uiPriority w:val="0"/>
     <w:pPr>
       <w:spacing w:after="120" w:line="252" w:lineRule="auto"/>

</xml_diff>

<commit_message>
Add dental study provenance and ethics records
</commit_message>
<xml_diff>
--- a/Topic 2/Dental FYDP Writing/Dental_FYDP_Checkpoint_Draft.docx
+++ b/Topic 2/Dental FYDP Writing/Dental_FYDP_Checkpoint_Draft.docx
@@ -338,6 +338,20 @@
     </w:p>
     <w:p>
       <w:pPr>
+        <w:jc w:val="center"/>
+      </w:pPr>
+      <w:r>
+        <w:rPr>
+          <w:rFonts w:ascii="Times New Roman" w:hAnsi="Times New Roman" w:eastAsia="Times New Roman"/>
+          <w:b/>
+          <w:i w:val="0"/>
+          <w:sz w:val="22"/>
+        </w:rPr>
+        <w:t>Submission and presentation date: 09 September 2026</w:t>
+      </w:r>
+    </w:p>
+    <w:p>
+      <w:pPr>
         <w:sectPr>
           <w:footerReference r:id="rId5" w:type="default"/>
           <w:pgSz w:w="11906" w:h="16838"/>
@@ -374,7 +388,7 @@
           <w:rFonts w:ascii="Times New Roman" w:hAnsi="Times New Roman" w:eastAsia="Times New Roman"/>
           <w:sz w:val="24"/>
         </w:rPr>
-        <w:t>This project titled “Deep Learning-Driven Radiographic Analysis for Impacted Tooth Detection and Localization,” submitted by Meherajur Rahman and Jannatun Nahar to the Department of Computer Science and Engineering, Daffodil International University, has been accepted as satisfactory for the partial fulfillment of the requirements for the degree of B.Sc. in Computer Science and Engineering and approved as to its style and contents. The presentation and submission information will be completed in the official copy.</w:t>
+        <w:t>This project titled “Deep Learning-Driven Radiographic Analysis for Impacted Tooth Detection and Localization,” submitted by Meherajur Rahman and Jannatun Nahar to the Department of Computer Science and Engineering, Daffodil International University, has been accepted as satisfactory for the partial fulfillment of the requirements for the degree of B.Sc. in Computer Science and Engineering and approved as to its style and contents. The submission and presentation date is 09 September 2026.</w:t>
       </w:r>
     </w:p>
     <w:p>
@@ -1205,7 +1219,7 @@
           <w:rFonts w:ascii="Times New Roman" w:hAnsi="Times New Roman" w:eastAsia="Times New Roman"/>
           <w:sz w:val="24"/>
         </w:rPr>
-        <w:t>We acknowledge the Department of Computer Science and Engineering at Daffodil International University for providing the academic environment for this work. We are grateful to the collaborating clinical source and the clinician who validated the study labels. Their official identifying details will be inserted in the approved institutional copy after administrative verification.</w:t>
+        <w:t>We acknowledge the Department of Computer Science and Engineering at Daffodil International University for providing the academic environment for this work. We are grateful to the participating dental hospitals for supporting the clinical data collection and to Dr. Nur Nobi of Family Dental Care Hospital for validating the study labels.</w:t>
       </w:r>
     </w:p>
     <w:p>
@@ -1331,7 +1345,7 @@
         <w:rPr>
           <w:rFonts w:ascii="Times New Roman" w:hAnsi="Times New Roman" w:eastAsia="Times New Roman"/>
         </w:rPr>
-        <w:instrText xml:space="preserve"> HYPERLINK \l _Toc12700 </w:instrText>
+        <w:instrText xml:space="preserve"> HYPERLINK \l _Toc16761 </w:instrText>
       </w:r>
       <w:r>
         <w:rPr>
@@ -1367,7 +1381,7 @@
         <w:fldChar w:fldCharType="begin"/>
       </w:r>
       <w:r>
-        <w:instrText xml:space="preserve"> PAGEREF _Toc12700 \h </w:instrText>
+        <w:instrText xml:space="preserve"> PAGEREF _Toc16761 \h </w:instrText>
       </w:r>
       <w:r>
         <w:fldChar w:fldCharType="separate"/>
@@ -1402,7 +1416,7 @@
         <w:rPr>
           <w:rFonts w:ascii="Times New Roman" w:hAnsi="Times New Roman" w:eastAsia="Times New Roman"/>
         </w:rPr>
-        <w:instrText xml:space="preserve"> HYPERLINK \l _Toc14789 </w:instrText>
+        <w:instrText xml:space="preserve"> HYPERLINK \l _Toc20594 </w:instrText>
       </w:r>
       <w:r>
         <w:rPr>
@@ -1424,7 +1438,7 @@
         <w:fldChar w:fldCharType="begin"/>
       </w:r>
       <w:r>
-        <w:instrText xml:space="preserve"> PAGEREF _Toc14789 \h </w:instrText>
+        <w:instrText xml:space="preserve"> PAGEREF _Toc20594 \h </w:instrText>
       </w:r>
       <w:r>
         <w:fldChar w:fldCharType="separate"/>
@@ -1459,7 +1473,7 @@
         <w:rPr>
           <w:rFonts w:ascii="Times New Roman" w:hAnsi="Times New Roman" w:eastAsia="Times New Roman"/>
         </w:rPr>
-        <w:instrText xml:space="preserve"> HYPERLINK \l _Toc9321 </w:instrText>
+        <w:instrText xml:space="preserve"> HYPERLINK \l _Toc22292 </w:instrText>
       </w:r>
       <w:r>
         <w:rPr>
@@ -1481,7 +1495,7 @@
         <w:fldChar w:fldCharType="begin"/>
       </w:r>
       <w:r>
-        <w:instrText xml:space="preserve"> PAGEREF _Toc9321 \h </w:instrText>
+        <w:instrText xml:space="preserve"> PAGEREF _Toc22292 \h </w:instrText>
       </w:r>
       <w:r>
         <w:fldChar w:fldCharType="separate"/>
@@ -1516,7 +1530,7 @@
         <w:rPr>
           <w:rFonts w:ascii="Times New Roman" w:hAnsi="Times New Roman" w:eastAsia="Times New Roman"/>
         </w:rPr>
-        <w:instrText xml:space="preserve"> HYPERLINK \l _Toc19282 </w:instrText>
+        <w:instrText xml:space="preserve"> HYPERLINK \l _Toc29369 </w:instrText>
       </w:r>
       <w:r>
         <w:rPr>
@@ -1538,7 +1552,7 @@
         <w:fldChar w:fldCharType="begin"/>
       </w:r>
       <w:r>
-        <w:instrText xml:space="preserve"> PAGEREF _Toc19282 \h </w:instrText>
+        <w:instrText xml:space="preserve"> PAGEREF _Toc29369 \h </w:instrText>
       </w:r>
       <w:r>
         <w:fldChar w:fldCharType="separate"/>
@@ -1573,7 +1587,7 @@
         <w:rPr>
           <w:rFonts w:ascii="Times New Roman" w:hAnsi="Times New Roman" w:eastAsia="Times New Roman"/>
         </w:rPr>
-        <w:instrText xml:space="preserve"> HYPERLINK \l _Toc4488 </w:instrText>
+        <w:instrText xml:space="preserve"> HYPERLINK \l _Toc29343 </w:instrText>
       </w:r>
       <w:r>
         <w:rPr>
@@ -1595,7 +1609,7 @@
         <w:fldChar w:fldCharType="begin"/>
       </w:r>
       <w:r>
-        <w:instrText xml:space="preserve"> PAGEREF _Toc4488 \h </w:instrText>
+        <w:instrText xml:space="preserve"> PAGEREF _Toc29343 \h </w:instrText>
       </w:r>
       <w:r>
         <w:fldChar w:fldCharType="separate"/>
@@ -1630,7 +1644,7 @@
         <w:rPr>
           <w:rFonts w:ascii="Times New Roman" w:hAnsi="Times New Roman" w:eastAsia="Times New Roman"/>
         </w:rPr>
-        <w:instrText xml:space="preserve"> HYPERLINK \l _Toc32707 </w:instrText>
+        <w:instrText xml:space="preserve"> HYPERLINK \l _Toc5667 </w:instrText>
       </w:r>
       <w:r>
         <w:rPr>
@@ -1652,7 +1666,7 @@
         <w:fldChar w:fldCharType="begin"/>
       </w:r>
       <w:r>
-        <w:instrText xml:space="preserve"> PAGEREF _Toc32707 \h </w:instrText>
+        <w:instrText xml:space="preserve"> PAGEREF _Toc5667 \h </w:instrText>
       </w:r>
       <w:r>
         <w:fldChar w:fldCharType="separate"/>
@@ -1687,7 +1701,7 @@
         <w:rPr>
           <w:rFonts w:ascii="Times New Roman" w:hAnsi="Times New Roman" w:eastAsia="Times New Roman"/>
         </w:rPr>
-        <w:instrText xml:space="preserve"> HYPERLINK \l _Toc23912 </w:instrText>
+        <w:instrText xml:space="preserve"> HYPERLINK \l _Toc12002 </w:instrText>
       </w:r>
       <w:r>
         <w:rPr>
@@ -1709,7 +1723,7 @@
         <w:fldChar w:fldCharType="begin"/>
       </w:r>
       <w:r>
-        <w:instrText xml:space="preserve"> PAGEREF _Toc23912 \h </w:instrText>
+        <w:instrText xml:space="preserve"> PAGEREF _Toc12002 \h </w:instrText>
       </w:r>
       <w:r>
         <w:fldChar w:fldCharType="separate"/>
@@ -1744,7 +1758,7 @@
         <w:rPr>
           <w:rFonts w:ascii="Times New Roman" w:hAnsi="Times New Roman" w:eastAsia="Times New Roman"/>
         </w:rPr>
-        <w:instrText xml:space="preserve"> HYPERLINK \l _Toc19112 </w:instrText>
+        <w:instrText xml:space="preserve"> HYPERLINK \l _Toc21487 </w:instrText>
       </w:r>
       <w:r>
         <w:rPr>
@@ -1766,13 +1780,13 @@
         <w:fldChar w:fldCharType="begin"/>
       </w:r>
       <w:r>
-        <w:instrText xml:space="preserve"> PAGEREF _Toc19112 \h </w:instrText>
+        <w:instrText xml:space="preserve"> PAGEREF _Toc21487 \h </w:instrText>
       </w:r>
       <w:r>
         <w:fldChar w:fldCharType="separate"/>
       </w:r>
       <w:r>
-        <w:t>5</w:t>
+        <w:t>4</w:t>
       </w:r>
       <w:r>
         <w:fldChar w:fldCharType="end"/>
@@ -1801,7 +1815,7 @@
         <w:rPr>
           <w:rFonts w:ascii="Times New Roman" w:hAnsi="Times New Roman" w:eastAsia="Times New Roman"/>
         </w:rPr>
-        <w:instrText xml:space="preserve"> HYPERLINK \l _Toc13006 </w:instrText>
+        <w:instrText xml:space="preserve"> HYPERLINK \l _Toc27482 </w:instrText>
       </w:r>
       <w:r>
         <w:rPr>
@@ -1837,7 +1851,7 @@
         <w:fldChar w:fldCharType="begin"/>
       </w:r>
       <w:r>
-        <w:instrText xml:space="preserve"> PAGEREF _Toc13006 \h </w:instrText>
+        <w:instrText xml:space="preserve"> PAGEREF _Toc27482 \h </w:instrText>
       </w:r>
       <w:r>
         <w:fldChar w:fldCharType="separate"/>
@@ -1872,7 +1886,7 @@
         <w:rPr>
           <w:rFonts w:ascii="Times New Roman" w:hAnsi="Times New Roman" w:eastAsia="Times New Roman"/>
         </w:rPr>
-        <w:instrText xml:space="preserve"> HYPERLINK \l _Toc25432 </w:instrText>
+        <w:instrText xml:space="preserve"> HYPERLINK \l _Toc21527 </w:instrText>
       </w:r>
       <w:r>
         <w:rPr>
@@ -1894,7 +1908,7 @@
         <w:fldChar w:fldCharType="begin"/>
       </w:r>
       <w:r>
-        <w:instrText xml:space="preserve"> PAGEREF _Toc25432 \h </w:instrText>
+        <w:instrText xml:space="preserve"> PAGEREF _Toc21527 \h </w:instrText>
       </w:r>
       <w:r>
         <w:fldChar w:fldCharType="separate"/>
@@ -1929,7 +1943,7 @@
         <w:rPr>
           <w:rFonts w:ascii="Times New Roman" w:hAnsi="Times New Roman" w:eastAsia="Times New Roman"/>
         </w:rPr>
-        <w:instrText xml:space="preserve"> HYPERLINK \l _Toc27828 </w:instrText>
+        <w:instrText xml:space="preserve"> HYPERLINK \l _Toc1240 </w:instrText>
       </w:r>
       <w:r>
         <w:rPr>
@@ -1951,7 +1965,7 @@
         <w:fldChar w:fldCharType="begin"/>
       </w:r>
       <w:r>
-        <w:instrText xml:space="preserve"> PAGEREF _Toc27828 \h </w:instrText>
+        <w:instrText xml:space="preserve"> PAGEREF _Toc1240 \h </w:instrText>
       </w:r>
       <w:r>
         <w:fldChar w:fldCharType="separate"/>
@@ -1986,7 +2000,7 @@
         <w:rPr>
           <w:rFonts w:ascii="Times New Roman" w:hAnsi="Times New Roman" w:eastAsia="Times New Roman"/>
         </w:rPr>
-        <w:instrText xml:space="preserve"> HYPERLINK \l _Toc15843 </w:instrText>
+        <w:instrText xml:space="preserve"> HYPERLINK \l _Toc2523 </w:instrText>
       </w:r>
       <w:r>
         <w:rPr>
@@ -2008,7 +2022,7 @@
         <w:fldChar w:fldCharType="begin"/>
       </w:r>
       <w:r>
-        <w:instrText xml:space="preserve"> PAGEREF _Toc15843 \h </w:instrText>
+        <w:instrText xml:space="preserve"> PAGEREF _Toc2523 \h </w:instrText>
       </w:r>
       <w:r>
         <w:fldChar w:fldCharType="separate"/>
@@ -2043,7 +2057,7 @@
         <w:rPr>
           <w:rFonts w:ascii="Times New Roman" w:hAnsi="Times New Roman" w:eastAsia="Times New Roman"/>
         </w:rPr>
-        <w:instrText xml:space="preserve"> HYPERLINK \l _Toc2046 </w:instrText>
+        <w:instrText xml:space="preserve"> HYPERLINK \l _Toc27758 </w:instrText>
       </w:r>
       <w:r>
         <w:rPr>
@@ -2065,7 +2079,7 @@
         <w:fldChar w:fldCharType="begin"/>
       </w:r>
       <w:r>
-        <w:instrText xml:space="preserve"> PAGEREF _Toc2046 \h </w:instrText>
+        <w:instrText xml:space="preserve"> PAGEREF _Toc27758 \h </w:instrText>
       </w:r>
       <w:r>
         <w:fldChar w:fldCharType="separate"/>
@@ -2100,7 +2114,7 @@
         <w:rPr>
           <w:rFonts w:ascii="Times New Roman" w:hAnsi="Times New Roman" w:eastAsia="Times New Roman"/>
         </w:rPr>
-        <w:instrText xml:space="preserve"> HYPERLINK \l _Toc8293 </w:instrText>
+        <w:instrText xml:space="preserve"> HYPERLINK \l _Toc2452 </w:instrText>
       </w:r>
       <w:r>
         <w:rPr>
@@ -2122,7 +2136,7 @@
         <w:fldChar w:fldCharType="begin"/>
       </w:r>
       <w:r>
-        <w:instrText xml:space="preserve"> PAGEREF _Toc8293 \h </w:instrText>
+        <w:instrText xml:space="preserve"> PAGEREF _Toc2452 \h </w:instrText>
       </w:r>
       <w:r>
         <w:fldChar w:fldCharType="separate"/>
@@ -2157,7 +2171,7 @@
         <w:rPr>
           <w:rFonts w:ascii="Times New Roman" w:hAnsi="Times New Roman" w:eastAsia="Times New Roman"/>
         </w:rPr>
-        <w:instrText xml:space="preserve"> HYPERLINK \l _Toc9210 </w:instrText>
+        <w:instrText xml:space="preserve"> HYPERLINK \l _Toc22130 </w:instrText>
       </w:r>
       <w:r>
         <w:rPr>
@@ -2179,7 +2193,7 @@
         <w:fldChar w:fldCharType="begin"/>
       </w:r>
       <w:r>
-        <w:instrText xml:space="preserve"> PAGEREF _Toc9210 \h </w:instrText>
+        <w:instrText xml:space="preserve"> PAGEREF _Toc22130 \h </w:instrText>
       </w:r>
       <w:r>
         <w:fldChar w:fldCharType="separate"/>
@@ -2214,7 +2228,7 @@
         <w:rPr>
           <w:rFonts w:ascii="Times New Roman" w:hAnsi="Times New Roman" w:eastAsia="Times New Roman"/>
         </w:rPr>
-        <w:instrText xml:space="preserve"> HYPERLINK \l _Toc24589 </w:instrText>
+        <w:instrText xml:space="preserve"> HYPERLINK \l _Toc27159 </w:instrText>
       </w:r>
       <w:r>
         <w:rPr>
@@ -2236,7 +2250,7 @@
         <w:fldChar w:fldCharType="begin"/>
       </w:r>
       <w:r>
-        <w:instrText xml:space="preserve"> PAGEREF _Toc24589 \h </w:instrText>
+        <w:instrText xml:space="preserve"> PAGEREF _Toc27159 \h </w:instrText>
       </w:r>
       <w:r>
         <w:fldChar w:fldCharType="separate"/>
@@ -2271,7 +2285,7 @@
         <w:rPr>
           <w:rFonts w:ascii="Times New Roman" w:hAnsi="Times New Roman" w:eastAsia="Times New Roman"/>
         </w:rPr>
-        <w:instrText xml:space="preserve"> HYPERLINK \l _Toc4043 </w:instrText>
+        <w:instrText xml:space="preserve"> HYPERLINK \l _Toc19162 </w:instrText>
       </w:r>
       <w:r>
         <w:rPr>
@@ -2307,7 +2321,7 @@
         <w:fldChar w:fldCharType="begin"/>
       </w:r>
       <w:r>
-        <w:instrText xml:space="preserve"> PAGEREF _Toc4043 \h </w:instrText>
+        <w:instrText xml:space="preserve"> PAGEREF _Toc19162 \h </w:instrText>
       </w:r>
       <w:r>
         <w:fldChar w:fldCharType="separate"/>
@@ -2342,7 +2356,7 @@
         <w:rPr>
           <w:rFonts w:ascii="Times New Roman" w:hAnsi="Times New Roman" w:eastAsia="Times New Roman"/>
         </w:rPr>
-        <w:instrText xml:space="preserve"> HYPERLINK \l _Toc27488 </w:instrText>
+        <w:instrText xml:space="preserve"> HYPERLINK \l _Toc30256 </w:instrText>
       </w:r>
       <w:r>
         <w:rPr>
@@ -2364,7 +2378,7 @@
         <w:fldChar w:fldCharType="begin"/>
       </w:r>
       <w:r>
-        <w:instrText xml:space="preserve"> PAGEREF _Toc27488 \h </w:instrText>
+        <w:instrText xml:space="preserve"> PAGEREF _Toc30256 \h </w:instrText>
       </w:r>
       <w:r>
         <w:fldChar w:fldCharType="separate"/>
@@ -2399,7 +2413,7 @@
         <w:rPr>
           <w:rFonts w:ascii="Times New Roman" w:hAnsi="Times New Roman" w:eastAsia="Times New Roman"/>
         </w:rPr>
-        <w:instrText xml:space="preserve"> HYPERLINK \l _Toc5157 </w:instrText>
+        <w:instrText xml:space="preserve"> HYPERLINK \l _Toc26946 </w:instrText>
       </w:r>
       <w:r>
         <w:rPr>
@@ -2421,7 +2435,7 @@
         <w:fldChar w:fldCharType="begin"/>
       </w:r>
       <w:r>
-        <w:instrText xml:space="preserve"> PAGEREF _Toc5157 \h </w:instrText>
+        <w:instrText xml:space="preserve"> PAGEREF _Toc26946 \h </w:instrText>
       </w:r>
       <w:r>
         <w:fldChar w:fldCharType="separate"/>
@@ -2456,7 +2470,7 @@
         <w:rPr>
           <w:rFonts w:ascii="Times New Roman" w:hAnsi="Times New Roman" w:eastAsia="Times New Roman"/>
         </w:rPr>
-        <w:instrText xml:space="preserve"> HYPERLINK \l _Toc13176 </w:instrText>
+        <w:instrText xml:space="preserve"> HYPERLINK \l _Toc22271 </w:instrText>
       </w:r>
       <w:r>
         <w:rPr>
@@ -2478,7 +2492,7 @@
         <w:fldChar w:fldCharType="begin"/>
       </w:r>
       <w:r>
-        <w:instrText xml:space="preserve"> PAGEREF _Toc13176 \h </w:instrText>
+        <w:instrText xml:space="preserve"> PAGEREF _Toc22271 \h </w:instrText>
       </w:r>
       <w:r>
         <w:fldChar w:fldCharType="separate"/>
@@ -2513,7 +2527,7 @@
         <w:rPr>
           <w:rFonts w:ascii="Times New Roman" w:hAnsi="Times New Roman" w:eastAsia="Times New Roman"/>
         </w:rPr>
-        <w:instrText xml:space="preserve"> HYPERLINK \l _Toc25614 </w:instrText>
+        <w:instrText xml:space="preserve"> HYPERLINK \l _Toc1627 </w:instrText>
       </w:r>
       <w:r>
         <w:rPr>
@@ -2535,7 +2549,7 @@
         <w:fldChar w:fldCharType="begin"/>
       </w:r>
       <w:r>
-        <w:instrText xml:space="preserve"> PAGEREF _Toc25614 \h </w:instrText>
+        <w:instrText xml:space="preserve"> PAGEREF _Toc1627 \h </w:instrText>
       </w:r>
       <w:r>
         <w:fldChar w:fldCharType="separate"/>
@@ -2570,7 +2584,7 @@
         <w:rPr>
           <w:rFonts w:ascii="Times New Roman" w:hAnsi="Times New Roman" w:eastAsia="Times New Roman"/>
         </w:rPr>
-        <w:instrText xml:space="preserve"> HYPERLINK \l _Toc21580 </w:instrText>
+        <w:instrText xml:space="preserve"> HYPERLINK \l _Toc26177 </w:instrText>
       </w:r>
       <w:r>
         <w:rPr>
@@ -2592,7 +2606,7 @@
         <w:fldChar w:fldCharType="begin"/>
       </w:r>
       <w:r>
-        <w:instrText xml:space="preserve"> PAGEREF _Toc21580 \h </w:instrText>
+        <w:instrText xml:space="preserve"> PAGEREF _Toc26177 \h </w:instrText>
       </w:r>
       <w:r>
         <w:fldChar w:fldCharType="separate"/>
@@ -2627,7 +2641,7 @@
         <w:rPr>
           <w:rFonts w:ascii="Times New Roman" w:hAnsi="Times New Roman" w:eastAsia="Times New Roman"/>
         </w:rPr>
-        <w:instrText xml:space="preserve"> HYPERLINK \l _Toc13438 </w:instrText>
+        <w:instrText xml:space="preserve"> HYPERLINK \l _Toc13714 </w:instrText>
       </w:r>
       <w:r>
         <w:rPr>
@@ -2649,7 +2663,7 @@
         <w:fldChar w:fldCharType="begin"/>
       </w:r>
       <w:r>
-        <w:instrText xml:space="preserve"> PAGEREF _Toc13438 \h </w:instrText>
+        <w:instrText xml:space="preserve"> PAGEREF _Toc13714 \h </w:instrText>
       </w:r>
       <w:r>
         <w:fldChar w:fldCharType="separate"/>
@@ -2684,7 +2698,7 @@
         <w:rPr>
           <w:rFonts w:ascii="Times New Roman" w:hAnsi="Times New Roman" w:eastAsia="Times New Roman"/>
         </w:rPr>
-        <w:instrText xml:space="preserve"> HYPERLINK \l _Toc7249 </w:instrText>
+        <w:instrText xml:space="preserve"> HYPERLINK \l _Toc4035 </w:instrText>
       </w:r>
       <w:r>
         <w:rPr>
@@ -2706,7 +2720,7 @@
         <w:fldChar w:fldCharType="begin"/>
       </w:r>
       <w:r>
-        <w:instrText xml:space="preserve"> PAGEREF _Toc7249 \h </w:instrText>
+        <w:instrText xml:space="preserve"> PAGEREF _Toc4035 \h </w:instrText>
       </w:r>
       <w:r>
         <w:fldChar w:fldCharType="separate"/>
@@ -2741,7 +2755,7 @@
         <w:rPr>
           <w:rFonts w:ascii="Times New Roman" w:hAnsi="Times New Roman" w:eastAsia="Times New Roman"/>
         </w:rPr>
-        <w:instrText xml:space="preserve"> HYPERLINK \l _Toc14862 </w:instrText>
+        <w:instrText xml:space="preserve"> HYPERLINK \l _Toc10546 </w:instrText>
       </w:r>
       <w:r>
         <w:rPr>
@@ -2763,7 +2777,7 @@
         <w:fldChar w:fldCharType="begin"/>
       </w:r>
       <w:r>
-        <w:instrText xml:space="preserve"> PAGEREF _Toc14862 \h </w:instrText>
+        <w:instrText xml:space="preserve"> PAGEREF _Toc10546 \h </w:instrText>
       </w:r>
       <w:r>
         <w:fldChar w:fldCharType="separate"/>
@@ -2798,7 +2812,7 @@
         <w:rPr>
           <w:rFonts w:ascii="Times New Roman" w:hAnsi="Times New Roman" w:eastAsia="Times New Roman"/>
         </w:rPr>
-        <w:instrText xml:space="preserve"> HYPERLINK \l _Toc21993 </w:instrText>
+        <w:instrText xml:space="preserve"> HYPERLINK \l _Toc9109 </w:instrText>
       </w:r>
       <w:r>
         <w:rPr>
@@ -2820,7 +2834,7 @@
         <w:fldChar w:fldCharType="begin"/>
       </w:r>
       <w:r>
-        <w:instrText xml:space="preserve"> PAGEREF _Toc21993 \h </w:instrText>
+        <w:instrText xml:space="preserve"> PAGEREF _Toc9109 \h </w:instrText>
       </w:r>
       <w:r>
         <w:fldChar w:fldCharType="separate"/>
@@ -2855,7 +2869,7 @@
         <w:rPr>
           <w:rFonts w:ascii="Times New Roman" w:hAnsi="Times New Roman" w:eastAsia="Times New Roman"/>
         </w:rPr>
-        <w:instrText xml:space="preserve"> HYPERLINK \l _Toc1304 </w:instrText>
+        <w:instrText xml:space="preserve"> HYPERLINK \l _Toc25675 </w:instrText>
       </w:r>
       <w:r>
         <w:rPr>
@@ -2877,7 +2891,7 @@
         <w:fldChar w:fldCharType="begin"/>
       </w:r>
       <w:r>
-        <w:instrText xml:space="preserve"> PAGEREF _Toc1304 \h </w:instrText>
+        <w:instrText xml:space="preserve"> PAGEREF _Toc25675 \h </w:instrText>
       </w:r>
       <w:r>
         <w:fldChar w:fldCharType="separate"/>
@@ -2912,7 +2926,7 @@
         <w:rPr>
           <w:rFonts w:ascii="Times New Roman" w:hAnsi="Times New Roman" w:eastAsia="Times New Roman"/>
         </w:rPr>
-        <w:instrText xml:space="preserve"> HYPERLINK \l _Toc2424 </w:instrText>
+        <w:instrText xml:space="preserve"> HYPERLINK \l _Toc18106 </w:instrText>
       </w:r>
       <w:r>
         <w:rPr>
@@ -2934,7 +2948,7 @@
         <w:fldChar w:fldCharType="begin"/>
       </w:r>
       <w:r>
-        <w:instrText xml:space="preserve"> PAGEREF _Toc2424 \h </w:instrText>
+        <w:instrText xml:space="preserve"> PAGEREF _Toc18106 \h </w:instrText>
       </w:r>
       <w:r>
         <w:fldChar w:fldCharType="separate"/>
@@ -2969,7 +2983,7 @@
         <w:rPr>
           <w:rFonts w:ascii="Times New Roman" w:hAnsi="Times New Roman" w:eastAsia="Times New Roman"/>
         </w:rPr>
-        <w:instrText xml:space="preserve"> HYPERLINK \l _Toc14334 </w:instrText>
+        <w:instrText xml:space="preserve"> HYPERLINK \l _Toc21799 </w:instrText>
       </w:r>
       <w:r>
         <w:rPr>
@@ -3005,7 +3019,7 @@
         <w:fldChar w:fldCharType="begin"/>
       </w:r>
       <w:r>
-        <w:instrText xml:space="preserve"> PAGEREF _Toc14334 \h </w:instrText>
+        <w:instrText xml:space="preserve"> PAGEREF _Toc21799 \h </w:instrText>
       </w:r>
       <w:r>
         <w:fldChar w:fldCharType="separate"/>
@@ -3040,7 +3054,7 @@
         <w:rPr>
           <w:rFonts w:ascii="Times New Roman" w:hAnsi="Times New Roman" w:eastAsia="Times New Roman"/>
         </w:rPr>
-        <w:instrText xml:space="preserve"> HYPERLINK \l _Toc25896 </w:instrText>
+        <w:instrText xml:space="preserve"> HYPERLINK \l _Toc24163 </w:instrText>
       </w:r>
       <w:r>
         <w:rPr>
@@ -3062,7 +3076,7 @@
         <w:fldChar w:fldCharType="begin"/>
       </w:r>
       <w:r>
-        <w:instrText xml:space="preserve"> PAGEREF _Toc25896 \h </w:instrText>
+        <w:instrText xml:space="preserve"> PAGEREF _Toc24163 \h </w:instrText>
       </w:r>
       <w:r>
         <w:fldChar w:fldCharType="separate"/>
@@ -3097,7 +3111,7 @@
         <w:rPr>
           <w:rFonts w:ascii="Times New Roman" w:hAnsi="Times New Roman" w:eastAsia="Times New Roman"/>
         </w:rPr>
-        <w:instrText xml:space="preserve"> HYPERLINK \l _Toc12395 </w:instrText>
+        <w:instrText xml:space="preserve"> HYPERLINK \l _Toc25622 </w:instrText>
       </w:r>
       <w:r>
         <w:rPr>
@@ -3119,7 +3133,7 @@
         <w:fldChar w:fldCharType="begin"/>
       </w:r>
       <w:r>
-        <w:instrText xml:space="preserve"> PAGEREF _Toc12395 \h </w:instrText>
+        <w:instrText xml:space="preserve"> PAGEREF _Toc25622 \h </w:instrText>
       </w:r>
       <w:r>
         <w:fldChar w:fldCharType="separate"/>
@@ -3154,7 +3168,7 @@
         <w:rPr>
           <w:rFonts w:ascii="Times New Roman" w:hAnsi="Times New Roman" w:eastAsia="Times New Roman"/>
         </w:rPr>
-        <w:instrText xml:space="preserve"> HYPERLINK \l _Toc8079 </w:instrText>
+        <w:instrText xml:space="preserve"> HYPERLINK \l _Toc29177 </w:instrText>
       </w:r>
       <w:r>
         <w:rPr>
@@ -3176,7 +3190,7 @@
         <w:fldChar w:fldCharType="begin"/>
       </w:r>
       <w:r>
-        <w:instrText xml:space="preserve"> PAGEREF _Toc8079 \h </w:instrText>
+        <w:instrText xml:space="preserve"> PAGEREF _Toc29177 \h </w:instrText>
       </w:r>
       <w:r>
         <w:fldChar w:fldCharType="separate"/>
@@ -3211,7 +3225,7 @@
         <w:rPr>
           <w:rFonts w:ascii="Times New Roman" w:hAnsi="Times New Roman" w:eastAsia="Times New Roman"/>
         </w:rPr>
-        <w:instrText xml:space="preserve"> HYPERLINK \l _Toc17351 </w:instrText>
+        <w:instrText xml:space="preserve"> HYPERLINK \l _Toc8654 </w:instrText>
       </w:r>
       <w:r>
         <w:rPr>
@@ -3233,7 +3247,7 @@
         <w:fldChar w:fldCharType="begin"/>
       </w:r>
       <w:r>
-        <w:instrText xml:space="preserve"> PAGEREF _Toc17351 \h </w:instrText>
+        <w:instrText xml:space="preserve"> PAGEREF _Toc8654 \h </w:instrText>
       </w:r>
       <w:r>
         <w:fldChar w:fldCharType="separate"/>
@@ -3268,7 +3282,7 @@
         <w:rPr>
           <w:rFonts w:ascii="Times New Roman" w:hAnsi="Times New Roman" w:eastAsia="Times New Roman"/>
         </w:rPr>
-        <w:instrText xml:space="preserve"> HYPERLINK \l _Toc5345 </w:instrText>
+        <w:instrText xml:space="preserve"> HYPERLINK \l _Toc8834 </w:instrText>
       </w:r>
       <w:r>
         <w:rPr>
@@ -3290,7 +3304,7 @@
         <w:fldChar w:fldCharType="begin"/>
       </w:r>
       <w:r>
-        <w:instrText xml:space="preserve"> PAGEREF _Toc5345 \h </w:instrText>
+        <w:instrText xml:space="preserve"> PAGEREF _Toc8834 \h </w:instrText>
       </w:r>
       <w:r>
         <w:fldChar w:fldCharType="separate"/>
@@ -3325,7 +3339,7 @@
         <w:rPr>
           <w:rFonts w:ascii="Times New Roman" w:hAnsi="Times New Roman" w:eastAsia="Times New Roman"/>
         </w:rPr>
-        <w:instrText xml:space="preserve"> HYPERLINK \l _Toc28735 </w:instrText>
+        <w:instrText xml:space="preserve"> HYPERLINK \l _Toc22976 </w:instrText>
       </w:r>
       <w:r>
         <w:rPr>
@@ -3347,7 +3361,7 @@
         <w:fldChar w:fldCharType="begin"/>
       </w:r>
       <w:r>
-        <w:instrText xml:space="preserve"> PAGEREF _Toc28735 \h </w:instrText>
+        <w:instrText xml:space="preserve"> PAGEREF _Toc22976 \h </w:instrText>
       </w:r>
       <w:r>
         <w:fldChar w:fldCharType="separate"/>
@@ -3382,7 +3396,7 @@
         <w:rPr>
           <w:rFonts w:ascii="Times New Roman" w:hAnsi="Times New Roman" w:eastAsia="Times New Roman"/>
         </w:rPr>
-        <w:instrText xml:space="preserve"> HYPERLINK \l _Toc6738 </w:instrText>
+        <w:instrText xml:space="preserve"> HYPERLINK \l _Toc2597 </w:instrText>
       </w:r>
       <w:r>
         <w:rPr>
@@ -3404,7 +3418,7 @@
         <w:fldChar w:fldCharType="begin"/>
       </w:r>
       <w:r>
-        <w:instrText xml:space="preserve"> PAGEREF _Toc6738 \h </w:instrText>
+        <w:instrText xml:space="preserve"> PAGEREF _Toc2597 \h </w:instrText>
       </w:r>
       <w:r>
         <w:fldChar w:fldCharType="separate"/>
@@ -3439,7 +3453,7 @@
         <w:rPr>
           <w:rFonts w:ascii="Times New Roman" w:hAnsi="Times New Roman" w:eastAsia="Times New Roman"/>
         </w:rPr>
-        <w:instrText xml:space="preserve"> HYPERLINK \l _Toc12040 </w:instrText>
+        <w:instrText xml:space="preserve"> HYPERLINK \l _Toc12297 </w:instrText>
       </w:r>
       <w:r>
         <w:rPr>
@@ -3461,7 +3475,7 @@
         <w:fldChar w:fldCharType="begin"/>
       </w:r>
       <w:r>
-        <w:instrText xml:space="preserve"> PAGEREF _Toc12040 \h </w:instrText>
+        <w:instrText xml:space="preserve"> PAGEREF _Toc12297 \h </w:instrText>
       </w:r>
       <w:r>
         <w:fldChar w:fldCharType="separate"/>
@@ -3496,7 +3510,7 @@
         <w:rPr>
           <w:rFonts w:ascii="Times New Roman" w:hAnsi="Times New Roman" w:eastAsia="Times New Roman"/>
         </w:rPr>
-        <w:instrText xml:space="preserve"> HYPERLINK \l _Toc8648 </w:instrText>
+        <w:instrText xml:space="preserve"> HYPERLINK \l _Toc11481 </w:instrText>
       </w:r>
       <w:r>
         <w:rPr>
@@ -3518,7 +3532,7 @@
         <w:fldChar w:fldCharType="begin"/>
       </w:r>
       <w:r>
-        <w:instrText xml:space="preserve"> PAGEREF _Toc8648 \h </w:instrText>
+        <w:instrText xml:space="preserve"> PAGEREF _Toc11481 \h </w:instrText>
       </w:r>
       <w:r>
         <w:fldChar w:fldCharType="separate"/>
@@ -3553,7 +3567,7 @@
         <w:rPr>
           <w:rFonts w:ascii="Times New Roman" w:hAnsi="Times New Roman" w:eastAsia="Times New Roman"/>
         </w:rPr>
-        <w:instrText xml:space="preserve"> HYPERLINK \l _Toc14796 </w:instrText>
+        <w:instrText xml:space="preserve"> HYPERLINK \l _Toc28643 </w:instrText>
       </w:r>
       <w:r>
         <w:rPr>
@@ -3575,7 +3589,7 @@
         <w:fldChar w:fldCharType="begin"/>
       </w:r>
       <w:r>
-        <w:instrText xml:space="preserve"> PAGEREF _Toc14796 \h </w:instrText>
+        <w:instrText xml:space="preserve"> PAGEREF _Toc28643 \h </w:instrText>
       </w:r>
       <w:r>
         <w:fldChar w:fldCharType="separate"/>
@@ -3610,7 +3624,7 @@
         <w:rPr>
           <w:rFonts w:ascii="Times New Roman" w:hAnsi="Times New Roman" w:eastAsia="Times New Roman"/>
         </w:rPr>
-        <w:instrText xml:space="preserve"> HYPERLINK \l _Toc25691 </w:instrText>
+        <w:instrText xml:space="preserve"> HYPERLINK \l _Toc11141 </w:instrText>
       </w:r>
       <w:r>
         <w:rPr>
@@ -3646,7 +3660,7 @@
         <w:fldChar w:fldCharType="begin"/>
       </w:r>
       <w:r>
-        <w:instrText xml:space="preserve"> PAGEREF _Toc25691 \h </w:instrText>
+        <w:instrText xml:space="preserve"> PAGEREF _Toc11141 \h </w:instrText>
       </w:r>
       <w:r>
         <w:fldChar w:fldCharType="separate"/>
@@ -3681,7 +3695,7 @@
         <w:rPr>
           <w:rFonts w:ascii="Times New Roman" w:hAnsi="Times New Roman" w:eastAsia="Times New Roman"/>
         </w:rPr>
-        <w:instrText xml:space="preserve"> HYPERLINK \l _Toc31390 </w:instrText>
+        <w:instrText xml:space="preserve"> HYPERLINK \l _Toc5838 </w:instrText>
       </w:r>
       <w:r>
         <w:rPr>
@@ -3703,7 +3717,7 @@
         <w:fldChar w:fldCharType="begin"/>
       </w:r>
       <w:r>
-        <w:instrText xml:space="preserve"> PAGEREF _Toc31390 \h </w:instrText>
+        <w:instrText xml:space="preserve"> PAGEREF _Toc5838 \h </w:instrText>
       </w:r>
       <w:r>
         <w:fldChar w:fldCharType="separate"/>
@@ -3738,7 +3752,7 @@
         <w:rPr>
           <w:rFonts w:ascii="Times New Roman" w:hAnsi="Times New Roman" w:eastAsia="Times New Roman"/>
         </w:rPr>
-        <w:instrText xml:space="preserve"> HYPERLINK \l _Toc29983 </w:instrText>
+        <w:instrText xml:space="preserve"> HYPERLINK \l _Toc13591 </w:instrText>
       </w:r>
       <w:r>
         <w:rPr>
@@ -3760,7 +3774,7 @@
         <w:fldChar w:fldCharType="begin"/>
       </w:r>
       <w:r>
-        <w:instrText xml:space="preserve"> PAGEREF _Toc29983 \h </w:instrText>
+        <w:instrText xml:space="preserve"> PAGEREF _Toc13591 \h </w:instrText>
       </w:r>
       <w:r>
         <w:fldChar w:fldCharType="separate"/>
@@ -3795,7 +3809,7 @@
         <w:rPr>
           <w:rFonts w:ascii="Times New Roman" w:hAnsi="Times New Roman" w:eastAsia="Times New Roman"/>
         </w:rPr>
-        <w:instrText xml:space="preserve"> HYPERLINK \l _Toc17396 </w:instrText>
+        <w:instrText xml:space="preserve"> HYPERLINK \l _Toc18883 </w:instrText>
       </w:r>
       <w:r>
         <w:rPr>
@@ -3817,7 +3831,7 @@
         <w:fldChar w:fldCharType="begin"/>
       </w:r>
       <w:r>
-        <w:instrText xml:space="preserve"> PAGEREF _Toc17396 \h </w:instrText>
+        <w:instrText xml:space="preserve"> PAGEREF _Toc18883 \h </w:instrText>
       </w:r>
       <w:r>
         <w:fldChar w:fldCharType="separate"/>
@@ -3852,7 +3866,7 @@
         <w:rPr>
           <w:rFonts w:ascii="Times New Roman" w:hAnsi="Times New Roman" w:eastAsia="Times New Roman"/>
         </w:rPr>
-        <w:instrText xml:space="preserve"> HYPERLINK \l _Toc31195 </w:instrText>
+        <w:instrText xml:space="preserve"> HYPERLINK \l _Toc19803 </w:instrText>
       </w:r>
       <w:r>
         <w:rPr>
@@ -3874,7 +3888,7 @@
         <w:fldChar w:fldCharType="begin"/>
       </w:r>
       <w:r>
-        <w:instrText xml:space="preserve"> PAGEREF _Toc31195 \h </w:instrText>
+        <w:instrText xml:space="preserve"> PAGEREF _Toc19803 \h </w:instrText>
       </w:r>
       <w:r>
         <w:fldChar w:fldCharType="separate"/>
@@ -3909,7 +3923,7 @@
         <w:rPr>
           <w:rFonts w:ascii="Times New Roman" w:hAnsi="Times New Roman" w:eastAsia="Times New Roman"/>
         </w:rPr>
-        <w:instrText xml:space="preserve"> HYPERLINK \l _Toc6308 </w:instrText>
+        <w:instrText xml:space="preserve"> HYPERLINK \l _Toc3370 </w:instrText>
       </w:r>
       <w:r>
         <w:rPr>
@@ -3931,7 +3945,7 @@
         <w:fldChar w:fldCharType="begin"/>
       </w:r>
       <w:r>
-        <w:instrText xml:space="preserve"> PAGEREF _Toc6308 \h </w:instrText>
+        <w:instrText xml:space="preserve"> PAGEREF _Toc3370 \h </w:instrText>
       </w:r>
       <w:r>
         <w:fldChar w:fldCharType="separate"/>
@@ -3966,7 +3980,7 @@
         <w:rPr>
           <w:rFonts w:ascii="Times New Roman" w:hAnsi="Times New Roman" w:eastAsia="Times New Roman"/>
         </w:rPr>
-        <w:instrText xml:space="preserve"> HYPERLINK \l _Toc17343 </w:instrText>
+        <w:instrText xml:space="preserve"> HYPERLINK \l _Toc32676 </w:instrText>
       </w:r>
       <w:r>
         <w:rPr>
@@ -3988,7 +4002,7 @@
         <w:fldChar w:fldCharType="begin"/>
       </w:r>
       <w:r>
-        <w:instrText xml:space="preserve"> PAGEREF _Toc17343 \h </w:instrText>
+        <w:instrText xml:space="preserve"> PAGEREF _Toc32676 \h </w:instrText>
       </w:r>
       <w:r>
         <w:fldChar w:fldCharType="separate"/>
@@ -4023,7 +4037,7 @@
         <w:rPr>
           <w:rFonts w:ascii="Times New Roman" w:hAnsi="Times New Roman" w:eastAsia="Times New Roman"/>
         </w:rPr>
-        <w:instrText xml:space="preserve"> HYPERLINK \l _Toc4407 </w:instrText>
+        <w:instrText xml:space="preserve"> HYPERLINK \l _Toc7542 </w:instrText>
       </w:r>
       <w:r>
         <w:rPr>
@@ -4045,7 +4059,7 @@
         <w:fldChar w:fldCharType="begin"/>
       </w:r>
       <w:r>
-        <w:instrText xml:space="preserve"> PAGEREF _Toc4407 \h </w:instrText>
+        <w:instrText xml:space="preserve"> PAGEREF _Toc7542 \h </w:instrText>
       </w:r>
       <w:r>
         <w:fldChar w:fldCharType="separate"/>
@@ -4080,7 +4094,7 @@
         <w:rPr>
           <w:rFonts w:ascii="Times New Roman" w:hAnsi="Times New Roman" w:eastAsia="Times New Roman"/>
         </w:rPr>
-        <w:instrText xml:space="preserve"> HYPERLINK \l _Toc19683 </w:instrText>
+        <w:instrText xml:space="preserve"> HYPERLINK \l _Toc885 </w:instrText>
       </w:r>
       <w:r>
         <w:rPr>
@@ -4102,7 +4116,7 @@
         <w:fldChar w:fldCharType="begin"/>
       </w:r>
       <w:r>
-        <w:instrText xml:space="preserve"> PAGEREF _Toc19683 \h </w:instrText>
+        <w:instrText xml:space="preserve"> PAGEREF _Toc885 \h </w:instrText>
       </w:r>
       <w:r>
         <w:fldChar w:fldCharType="separate"/>
@@ -4137,7 +4151,7 @@
         <w:rPr>
           <w:rFonts w:ascii="Times New Roman" w:hAnsi="Times New Roman" w:eastAsia="Times New Roman"/>
         </w:rPr>
-        <w:instrText xml:space="preserve"> HYPERLINK \l _Toc15445 </w:instrText>
+        <w:instrText xml:space="preserve"> HYPERLINK \l _Toc30086 </w:instrText>
       </w:r>
       <w:r>
         <w:rPr>
@@ -4173,7 +4187,7 @@
         <w:fldChar w:fldCharType="begin"/>
       </w:r>
       <w:r>
-        <w:instrText xml:space="preserve"> PAGEREF _Toc15445 \h </w:instrText>
+        <w:instrText xml:space="preserve"> PAGEREF _Toc30086 \h </w:instrText>
       </w:r>
       <w:r>
         <w:fldChar w:fldCharType="separate"/>
@@ -4208,7 +4222,7 @@
         <w:rPr>
           <w:rFonts w:ascii="Times New Roman" w:hAnsi="Times New Roman" w:eastAsia="Times New Roman"/>
         </w:rPr>
-        <w:instrText xml:space="preserve"> HYPERLINK \l _Toc6801 </w:instrText>
+        <w:instrText xml:space="preserve"> HYPERLINK \l _Toc19415 </w:instrText>
       </w:r>
       <w:r>
         <w:rPr>
@@ -4230,7 +4244,7 @@
         <w:fldChar w:fldCharType="begin"/>
       </w:r>
       <w:r>
-        <w:instrText xml:space="preserve"> PAGEREF _Toc6801 \h </w:instrText>
+        <w:instrText xml:space="preserve"> PAGEREF _Toc19415 \h </w:instrText>
       </w:r>
       <w:r>
         <w:fldChar w:fldCharType="separate"/>
@@ -4265,7 +4279,7 @@
         <w:rPr>
           <w:rFonts w:ascii="Times New Roman" w:hAnsi="Times New Roman" w:eastAsia="Times New Roman"/>
         </w:rPr>
-        <w:instrText xml:space="preserve"> HYPERLINK \l _Toc32340 </w:instrText>
+        <w:instrText xml:space="preserve"> HYPERLINK \l _Toc14664 </w:instrText>
       </w:r>
       <w:r>
         <w:rPr>
@@ -4287,7 +4301,7 @@
         <w:fldChar w:fldCharType="begin"/>
       </w:r>
       <w:r>
-        <w:instrText xml:space="preserve"> PAGEREF _Toc32340 \h </w:instrText>
+        <w:instrText xml:space="preserve"> PAGEREF _Toc14664 \h </w:instrText>
       </w:r>
       <w:r>
         <w:fldChar w:fldCharType="separate"/>
@@ -4322,7 +4336,7 @@
         <w:rPr>
           <w:rFonts w:ascii="Times New Roman" w:hAnsi="Times New Roman" w:eastAsia="Times New Roman"/>
         </w:rPr>
-        <w:instrText xml:space="preserve"> HYPERLINK \l _Toc2840 </w:instrText>
+        <w:instrText xml:space="preserve"> HYPERLINK \l _Toc32255 </w:instrText>
       </w:r>
       <w:r>
         <w:rPr>
@@ -4344,7 +4358,7 @@
         <w:fldChar w:fldCharType="begin"/>
       </w:r>
       <w:r>
-        <w:instrText xml:space="preserve"> PAGEREF _Toc2840 \h </w:instrText>
+        <w:instrText xml:space="preserve"> PAGEREF _Toc32255 \h </w:instrText>
       </w:r>
       <w:r>
         <w:fldChar w:fldCharType="separate"/>
@@ -4379,7 +4393,7 @@
         <w:rPr>
           <w:rFonts w:ascii="Times New Roman" w:hAnsi="Times New Roman" w:eastAsia="Times New Roman"/>
         </w:rPr>
-        <w:instrText xml:space="preserve"> HYPERLINK \l _Toc25172 </w:instrText>
+        <w:instrText xml:space="preserve"> HYPERLINK \l _Toc11818 </w:instrText>
       </w:r>
       <w:r>
         <w:rPr>
@@ -4401,7 +4415,7 @@
         <w:fldChar w:fldCharType="begin"/>
       </w:r>
       <w:r>
-        <w:instrText xml:space="preserve"> PAGEREF _Toc25172 \h </w:instrText>
+        <w:instrText xml:space="preserve"> PAGEREF _Toc11818 \h </w:instrText>
       </w:r>
       <w:r>
         <w:fldChar w:fldCharType="separate"/>
@@ -4436,7 +4450,7 @@
         <w:rPr>
           <w:rFonts w:ascii="Times New Roman" w:hAnsi="Times New Roman" w:eastAsia="Times New Roman"/>
         </w:rPr>
-        <w:instrText xml:space="preserve"> HYPERLINK \l _Toc13049 </w:instrText>
+        <w:instrText xml:space="preserve"> HYPERLINK \l _Toc29289 </w:instrText>
       </w:r>
       <w:r>
         <w:rPr>
@@ -4458,7 +4472,7 @@
         <w:fldChar w:fldCharType="begin"/>
       </w:r>
       <w:r>
-        <w:instrText xml:space="preserve"> PAGEREF _Toc13049 \h </w:instrText>
+        <w:instrText xml:space="preserve"> PAGEREF _Toc29289 \h </w:instrText>
       </w:r>
       <w:r>
         <w:fldChar w:fldCharType="separate"/>
@@ -4493,7 +4507,7 @@
         <w:rPr>
           <w:rFonts w:ascii="Times New Roman" w:hAnsi="Times New Roman" w:eastAsia="Times New Roman"/>
         </w:rPr>
-        <w:instrText xml:space="preserve"> HYPERLINK \l _Toc4395 </w:instrText>
+        <w:instrText xml:space="preserve"> HYPERLINK \l _Toc30813 </w:instrText>
       </w:r>
       <w:r>
         <w:rPr>
@@ -4515,7 +4529,7 @@
         <w:fldChar w:fldCharType="begin"/>
       </w:r>
       <w:r>
-        <w:instrText xml:space="preserve"> PAGEREF _Toc4395 \h </w:instrText>
+        <w:instrText xml:space="preserve"> PAGEREF _Toc30813 \h </w:instrText>
       </w:r>
       <w:r>
         <w:fldChar w:fldCharType="separate"/>
@@ -4550,7 +4564,7 @@
         <w:rPr>
           <w:rFonts w:ascii="Times New Roman" w:hAnsi="Times New Roman" w:eastAsia="Times New Roman"/>
         </w:rPr>
-        <w:instrText xml:space="preserve"> HYPERLINK \l _Toc19625 </w:instrText>
+        <w:instrText xml:space="preserve"> HYPERLINK \l _Toc15259 </w:instrText>
       </w:r>
       <w:r>
         <w:rPr>
@@ -4586,7 +4600,7 @@
         <w:fldChar w:fldCharType="begin"/>
       </w:r>
       <w:r>
-        <w:instrText xml:space="preserve"> PAGEREF _Toc19625 \h </w:instrText>
+        <w:instrText xml:space="preserve"> PAGEREF _Toc15259 \h </w:instrText>
       </w:r>
       <w:r>
         <w:fldChar w:fldCharType="separate"/>
@@ -4621,7 +4635,7 @@
         <w:rPr>
           <w:rFonts w:ascii="Times New Roman" w:hAnsi="Times New Roman" w:eastAsia="Times New Roman"/>
         </w:rPr>
-        <w:instrText xml:space="preserve"> HYPERLINK \l _Toc1188 </w:instrText>
+        <w:instrText xml:space="preserve"> HYPERLINK \l _Toc19199 </w:instrText>
       </w:r>
       <w:r>
         <w:rPr>
@@ -4643,7 +4657,7 @@
         <w:fldChar w:fldCharType="begin"/>
       </w:r>
       <w:r>
-        <w:instrText xml:space="preserve"> PAGEREF _Toc1188 \h </w:instrText>
+        <w:instrText xml:space="preserve"> PAGEREF _Toc19199 \h </w:instrText>
       </w:r>
       <w:r>
         <w:fldChar w:fldCharType="separate"/>
@@ -4678,7 +4692,7 @@
         <w:rPr>
           <w:rFonts w:ascii="Times New Roman" w:hAnsi="Times New Roman" w:eastAsia="Times New Roman"/>
         </w:rPr>
-        <w:instrText xml:space="preserve"> HYPERLINK \l _Toc5954 </w:instrText>
+        <w:instrText xml:space="preserve"> HYPERLINK \l _Toc18473 </w:instrText>
       </w:r>
       <w:r>
         <w:rPr>
@@ -4700,7 +4714,7 @@
         <w:fldChar w:fldCharType="begin"/>
       </w:r>
       <w:r>
-        <w:instrText xml:space="preserve"> PAGEREF _Toc5954 \h </w:instrText>
+        <w:instrText xml:space="preserve"> PAGEREF _Toc18473 \h </w:instrText>
       </w:r>
       <w:r>
         <w:fldChar w:fldCharType="separate"/>
@@ -4735,7 +4749,7 @@
         <w:rPr>
           <w:rFonts w:ascii="Times New Roman" w:hAnsi="Times New Roman" w:eastAsia="Times New Roman"/>
         </w:rPr>
-        <w:instrText xml:space="preserve"> HYPERLINK \l _Toc491 </w:instrText>
+        <w:instrText xml:space="preserve"> HYPERLINK \l _Toc27288 </w:instrText>
       </w:r>
       <w:r>
         <w:rPr>
@@ -4757,7 +4771,7 @@
         <w:fldChar w:fldCharType="begin"/>
       </w:r>
       <w:r>
-        <w:instrText xml:space="preserve"> PAGEREF _Toc491 \h </w:instrText>
+        <w:instrText xml:space="preserve"> PAGEREF _Toc27288 \h </w:instrText>
       </w:r>
       <w:r>
         <w:fldChar w:fldCharType="separate"/>
@@ -4792,7 +4806,7 @@
         <w:rPr>
           <w:rFonts w:ascii="Times New Roman" w:hAnsi="Times New Roman" w:eastAsia="Times New Roman"/>
         </w:rPr>
-        <w:instrText xml:space="preserve"> HYPERLINK \l _Toc9173 </w:instrText>
+        <w:instrText xml:space="preserve"> HYPERLINK \l _Toc8628 </w:instrText>
       </w:r>
       <w:r>
         <w:rPr>
@@ -4828,7 +4842,7 @@
         <w:fldChar w:fldCharType="begin"/>
       </w:r>
       <w:r>
-        <w:instrText xml:space="preserve"> PAGEREF _Toc9173 \h </w:instrText>
+        <w:instrText xml:space="preserve"> PAGEREF _Toc8628 \h </w:instrText>
       </w:r>
       <w:r>
         <w:fldChar w:fldCharType="separate"/>
@@ -4863,7 +4877,7 @@
         <w:rPr>
           <w:rFonts w:ascii="Times New Roman" w:hAnsi="Times New Roman" w:eastAsia="Times New Roman"/>
         </w:rPr>
-        <w:instrText xml:space="preserve"> HYPERLINK \l _Toc31767 </w:instrText>
+        <w:instrText xml:space="preserve"> HYPERLINK \l _Toc7321 </w:instrText>
       </w:r>
       <w:r>
         <w:rPr>
@@ -4885,7 +4899,7 @@
         <w:fldChar w:fldCharType="begin"/>
       </w:r>
       <w:r>
-        <w:instrText xml:space="preserve"> PAGEREF _Toc31767 \h </w:instrText>
+        <w:instrText xml:space="preserve"> PAGEREF _Toc7321 \h </w:instrText>
       </w:r>
       <w:r>
         <w:fldChar w:fldCharType="separate"/>
@@ -4920,7 +4934,7 @@
         <w:rPr>
           <w:rFonts w:ascii="Times New Roman" w:hAnsi="Times New Roman" w:eastAsia="Times New Roman"/>
         </w:rPr>
-        <w:instrText xml:space="preserve"> HYPERLINK \l _Toc20032 </w:instrText>
+        <w:instrText xml:space="preserve"> HYPERLINK \l _Toc6386 </w:instrText>
       </w:r>
       <w:r>
         <w:rPr>
@@ -4956,7 +4970,7 @@
         <w:fldChar w:fldCharType="begin"/>
       </w:r>
       <w:r>
-        <w:instrText xml:space="preserve"> PAGEREF _Toc20032 \h </w:instrText>
+        <w:instrText xml:space="preserve"> PAGEREF _Toc6386 \h </w:instrText>
       </w:r>
       <w:r>
         <w:fldChar w:fldCharType="separate"/>
@@ -4991,7 +5005,7 @@
         <w:rPr>
           <w:rFonts w:ascii="Times New Roman" w:hAnsi="Times New Roman" w:eastAsia="Times New Roman"/>
         </w:rPr>
-        <w:instrText xml:space="preserve"> HYPERLINK \l _Toc18474 </w:instrText>
+        <w:instrText xml:space="preserve"> HYPERLINK \l _Toc13244 </w:instrText>
       </w:r>
       <w:r>
         <w:rPr>
@@ -5013,7 +5027,7 @@
         <w:fldChar w:fldCharType="begin"/>
       </w:r>
       <w:r>
-        <w:instrText xml:space="preserve"> PAGEREF _Toc18474 \h </w:instrText>
+        <w:instrText xml:space="preserve"> PAGEREF _Toc13244 \h </w:instrText>
       </w:r>
       <w:r>
         <w:fldChar w:fldCharType="separate"/>
@@ -5048,7 +5062,7 @@
         <w:rPr>
           <w:rFonts w:ascii="Times New Roman" w:hAnsi="Times New Roman" w:eastAsia="Times New Roman"/>
         </w:rPr>
-        <w:instrText xml:space="preserve"> HYPERLINK \l _Toc17838 </w:instrText>
+        <w:instrText xml:space="preserve"> HYPERLINK \l _Toc28430 </w:instrText>
       </w:r>
       <w:r>
         <w:rPr>
@@ -5070,7 +5084,7 @@
         <w:fldChar w:fldCharType="begin"/>
       </w:r>
       <w:r>
-        <w:instrText xml:space="preserve"> PAGEREF _Toc17838 \h </w:instrText>
+        <w:instrText xml:space="preserve"> PAGEREF _Toc28430 \h </w:instrText>
       </w:r>
       <w:r>
         <w:fldChar w:fldCharType="separate"/>
@@ -5105,7 +5119,7 @@
         <w:rPr>
           <w:rFonts w:ascii="Times New Roman" w:hAnsi="Times New Roman" w:eastAsia="Times New Roman"/>
         </w:rPr>
-        <w:instrText xml:space="preserve"> HYPERLINK \l _Toc5641 </w:instrText>
+        <w:instrText xml:space="preserve"> HYPERLINK \l _Toc10356 </w:instrText>
       </w:r>
       <w:r>
         <w:rPr>
@@ -5141,7 +5155,7 @@
         <w:fldChar w:fldCharType="begin"/>
       </w:r>
       <w:r>
-        <w:instrText xml:space="preserve"> PAGEREF _Toc5641 \h </w:instrText>
+        <w:instrText xml:space="preserve"> PAGEREF _Toc10356 \h </w:instrText>
       </w:r>
       <w:r>
         <w:fldChar w:fldCharType="separate"/>
@@ -5176,7 +5190,7 @@
         <w:rPr>
           <w:rFonts w:ascii="Times New Roman" w:hAnsi="Times New Roman" w:eastAsia="Times New Roman"/>
         </w:rPr>
-        <w:instrText xml:space="preserve"> HYPERLINK \l _Toc27187 </w:instrText>
+        <w:instrText xml:space="preserve"> HYPERLINK \l _Toc20186 </w:instrText>
       </w:r>
       <w:r>
         <w:rPr>
@@ -5198,7 +5212,7 @@
         <w:fldChar w:fldCharType="begin"/>
       </w:r>
       <w:r>
-        <w:instrText xml:space="preserve"> PAGEREF _Toc27187 \h </w:instrText>
+        <w:instrText xml:space="preserve"> PAGEREF _Toc20186 \h </w:instrText>
       </w:r>
       <w:r>
         <w:fldChar w:fldCharType="separate"/>
@@ -5233,7 +5247,7 @@
         <w:rPr>
           <w:rFonts w:ascii="Times New Roman" w:hAnsi="Times New Roman" w:eastAsia="Times New Roman"/>
         </w:rPr>
-        <w:instrText xml:space="preserve"> HYPERLINK \l _Toc32309 </w:instrText>
+        <w:instrText xml:space="preserve"> HYPERLINK \l _Toc26065 </w:instrText>
       </w:r>
       <w:r>
         <w:rPr>
@@ -5269,7 +5283,7 @@
         <w:fldChar w:fldCharType="begin"/>
       </w:r>
       <w:r>
-        <w:instrText xml:space="preserve"> PAGEREF _Toc32309 \h </w:instrText>
+        <w:instrText xml:space="preserve"> PAGEREF _Toc26065 \h </w:instrText>
       </w:r>
       <w:r>
         <w:fldChar w:fldCharType="separate"/>
@@ -5304,7 +5318,7 @@
         <w:rPr>
           <w:rFonts w:ascii="Times New Roman" w:hAnsi="Times New Roman" w:eastAsia="Times New Roman"/>
         </w:rPr>
-        <w:instrText xml:space="preserve"> HYPERLINK \l _Toc12317 </w:instrText>
+        <w:instrText xml:space="preserve"> HYPERLINK \l _Toc15522 </w:instrText>
       </w:r>
       <w:r>
         <w:rPr>
@@ -5326,7 +5340,7 @@
         <w:fldChar w:fldCharType="begin"/>
       </w:r>
       <w:r>
-        <w:instrText xml:space="preserve"> PAGEREF _Toc12317 \h </w:instrText>
+        <w:instrText xml:space="preserve"> PAGEREF _Toc15522 \h </w:instrText>
       </w:r>
       <w:r>
         <w:fldChar w:fldCharType="separate"/>
@@ -5361,7 +5375,7 @@
         <w:rPr>
           <w:rFonts w:ascii="Times New Roman" w:hAnsi="Times New Roman" w:eastAsia="Times New Roman"/>
         </w:rPr>
-        <w:instrText xml:space="preserve"> HYPERLINK \l _Toc12877 </w:instrText>
+        <w:instrText xml:space="preserve"> HYPERLINK \l _Toc30334 </w:instrText>
       </w:r>
       <w:r>
         <w:rPr>
@@ -5397,7 +5411,7 @@
         <w:fldChar w:fldCharType="begin"/>
       </w:r>
       <w:r>
-        <w:instrText xml:space="preserve"> PAGEREF _Toc12877 \h </w:instrText>
+        <w:instrText xml:space="preserve"> PAGEREF _Toc30334 \h </w:instrText>
       </w:r>
       <w:r>
         <w:fldChar w:fldCharType="separate"/>
@@ -5432,7 +5446,7 @@
         <w:rPr>
           <w:rFonts w:ascii="Times New Roman" w:hAnsi="Times New Roman" w:eastAsia="Times New Roman"/>
         </w:rPr>
-        <w:instrText xml:space="preserve"> HYPERLINK \l _Toc32495 </w:instrText>
+        <w:instrText xml:space="preserve"> HYPERLINK \l _Toc6573 </w:instrText>
       </w:r>
       <w:r>
         <w:rPr>
@@ -5454,7 +5468,7 @@
         <w:fldChar w:fldCharType="begin"/>
       </w:r>
       <w:r>
-        <w:instrText xml:space="preserve"> PAGEREF _Toc32495 \h </w:instrText>
+        <w:instrText xml:space="preserve"> PAGEREF _Toc6573 \h </w:instrText>
       </w:r>
       <w:r>
         <w:fldChar w:fldCharType="separate"/>
@@ -5543,7 +5557,7 @@
         <w:rPr>
           <w:rFonts w:ascii="Times New Roman" w:hAnsi="Times New Roman" w:eastAsia="Times New Roman"/>
         </w:rPr>
-        <w:instrText xml:space="preserve"> HYPERLINK \l _Toc3748 </w:instrText>
+        <w:instrText xml:space="preserve"> HYPERLINK \l _Toc23242 </w:instrText>
       </w:r>
       <w:r>
         <w:rPr>
@@ -5565,7 +5579,7 @@
         <w:fldChar w:fldCharType="begin"/>
       </w:r>
       <w:r>
-        <w:instrText xml:space="preserve"> PAGEREF _Toc3748 \h </w:instrText>
+        <w:instrText xml:space="preserve"> PAGEREF _Toc23242 \h </w:instrText>
       </w:r>
       <w:r>
         <w:fldChar w:fldCharType="separate"/>
@@ -5600,7 +5614,7 @@
         <w:rPr>
           <w:rFonts w:ascii="Times New Roman" w:hAnsi="Times New Roman" w:eastAsia="Times New Roman"/>
         </w:rPr>
-        <w:instrText xml:space="preserve"> HYPERLINK \l _Toc28967 </w:instrText>
+        <w:instrText xml:space="preserve"> HYPERLINK \l _Toc170 </w:instrText>
       </w:r>
       <w:r>
         <w:rPr>
@@ -5622,7 +5636,7 @@
         <w:fldChar w:fldCharType="begin"/>
       </w:r>
       <w:r>
-        <w:instrText xml:space="preserve"> PAGEREF _Toc28967 \h </w:instrText>
+        <w:instrText xml:space="preserve"> PAGEREF _Toc170 \h </w:instrText>
       </w:r>
       <w:r>
         <w:fldChar w:fldCharType="separate"/>
@@ -5657,7 +5671,7 @@
         <w:rPr>
           <w:rFonts w:ascii="Times New Roman" w:hAnsi="Times New Roman" w:eastAsia="Times New Roman"/>
         </w:rPr>
-        <w:instrText xml:space="preserve"> HYPERLINK \l _Toc32104 </w:instrText>
+        <w:instrText xml:space="preserve"> HYPERLINK \l _Toc22486 </w:instrText>
       </w:r>
       <w:r>
         <w:rPr>
@@ -5679,7 +5693,7 @@
         <w:fldChar w:fldCharType="begin"/>
       </w:r>
       <w:r>
-        <w:instrText xml:space="preserve"> PAGEREF _Toc32104 \h </w:instrText>
+        <w:instrText xml:space="preserve"> PAGEREF _Toc22486 \h </w:instrText>
       </w:r>
       <w:r>
         <w:fldChar w:fldCharType="separate"/>
@@ -5714,7 +5728,7 @@
         <w:rPr>
           <w:rFonts w:ascii="Times New Roman" w:hAnsi="Times New Roman" w:eastAsia="Times New Roman"/>
         </w:rPr>
-        <w:instrText xml:space="preserve"> HYPERLINK \l _Toc17210 </w:instrText>
+        <w:instrText xml:space="preserve"> HYPERLINK \l _Toc10906 </w:instrText>
       </w:r>
       <w:r>
         <w:rPr>
@@ -5736,7 +5750,7 @@
         <w:fldChar w:fldCharType="begin"/>
       </w:r>
       <w:r>
-        <w:instrText xml:space="preserve"> PAGEREF _Toc17210 \h </w:instrText>
+        <w:instrText xml:space="preserve"> PAGEREF _Toc10906 \h </w:instrText>
       </w:r>
       <w:r>
         <w:fldChar w:fldCharType="separate"/>
@@ -5771,7 +5785,7 @@
         <w:rPr>
           <w:rFonts w:ascii="Times New Roman" w:hAnsi="Times New Roman" w:eastAsia="Times New Roman"/>
         </w:rPr>
-        <w:instrText xml:space="preserve"> HYPERLINK \l _Toc24626 </w:instrText>
+        <w:instrText xml:space="preserve"> HYPERLINK \l _Toc20836 </w:instrText>
       </w:r>
       <w:r>
         <w:rPr>
@@ -5793,7 +5807,7 @@
         <w:fldChar w:fldCharType="begin"/>
       </w:r>
       <w:r>
-        <w:instrText xml:space="preserve"> PAGEREF _Toc24626 \h </w:instrText>
+        <w:instrText xml:space="preserve"> PAGEREF _Toc20836 \h </w:instrText>
       </w:r>
       <w:r>
         <w:fldChar w:fldCharType="separate"/>
@@ -5828,7 +5842,7 @@
         <w:rPr>
           <w:rFonts w:ascii="Times New Roman" w:hAnsi="Times New Roman" w:eastAsia="Times New Roman"/>
         </w:rPr>
-        <w:instrText xml:space="preserve"> HYPERLINK \l _Toc29550 </w:instrText>
+        <w:instrText xml:space="preserve"> HYPERLINK \l _Toc18424 </w:instrText>
       </w:r>
       <w:r>
         <w:rPr>
@@ -5850,7 +5864,7 @@
         <w:fldChar w:fldCharType="begin"/>
       </w:r>
       <w:r>
-        <w:instrText xml:space="preserve"> PAGEREF _Toc29550 \h </w:instrText>
+        <w:instrText xml:space="preserve"> PAGEREF _Toc18424 \h </w:instrText>
       </w:r>
       <w:r>
         <w:fldChar w:fldCharType="separate"/>
@@ -5885,7 +5899,7 @@
         <w:rPr>
           <w:rFonts w:ascii="Times New Roman" w:hAnsi="Times New Roman" w:eastAsia="Times New Roman"/>
         </w:rPr>
-        <w:instrText xml:space="preserve"> HYPERLINK \l _Toc6909 </w:instrText>
+        <w:instrText xml:space="preserve"> HYPERLINK \l _Toc2772 </w:instrText>
       </w:r>
       <w:r>
         <w:rPr>
@@ -5907,7 +5921,7 @@
         <w:fldChar w:fldCharType="begin"/>
       </w:r>
       <w:r>
-        <w:instrText xml:space="preserve"> PAGEREF _Toc6909 \h </w:instrText>
+        <w:instrText xml:space="preserve"> PAGEREF _Toc2772 \h </w:instrText>
       </w:r>
       <w:r>
         <w:fldChar w:fldCharType="separate"/>
@@ -5942,7 +5956,7 @@
         <w:rPr>
           <w:rFonts w:ascii="Times New Roman" w:hAnsi="Times New Roman" w:eastAsia="Times New Roman"/>
         </w:rPr>
-        <w:instrText xml:space="preserve"> HYPERLINK \l _Toc24950 </w:instrText>
+        <w:instrText xml:space="preserve"> HYPERLINK \l _Toc22571 </w:instrText>
       </w:r>
       <w:r>
         <w:rPr>
@@ -5964,7 +5978,7 @@
         <w:fldChar w:fldCharType="begin"/>
       </w:r>
       <w:r>
-        <w:instrText xml:space="preserve"> PAGEREF _Toc24950 \h </w:instrText>
+        <w:instrText xml:space="preserve"> PAGEREF _Toc22571 \h </w:instrText>
       </w:r>
       <w:r>
         <w:fldChar w:fldCharType="separate"/>
@@ -6053,7 +6067,7 @@
         <w:rPr>
           <w:rFonts w:ascii="Times New Roman" w:hAnsi="Times New Roman" w:eastAsia="Times New Roman"/>
         </w:rPr>
-        <w:instrText xml:space="preserve"> HYPERLINK \l _Toc29644 </w:instrText>
+        <w:instrText xml:space="preserve"> HYPERLINK \l _Toc20817 </w:instrText>
       </w:r>
       <w:r>
         <w:rPr>
@@ -6075,7 +6089,7 @@
         <w:fldChar w:fldCharType="begin"/>
       </w:r>
       <w:r>
-        <w:instrText xml:space="preserve"> PAGEREF _Toc29644 \h </w:instrText>
+        <w:instrText xml:space="preserve"> PAGEREF _Toc20817 \h </w:instrText>
       </w:r>
       <w:r>
         <w:fldChar w:fldCharType="separate"/>
@@ -6110,7 +6124,7 @@
         <w:rPr>
           <w:rFonts w:ascii="Times New Roman" w:hAnsi="Times New Roman" w:eastAsia="Times New Roman"/>
         </w:rPr>
-        <w:instrText xml:space="preserve"> HYPERLINK \l _Toc29691 </w:instrText>
+        <w:instrText xml:space="preserve"> HYPERLINK \l _Toc6539 </w:instrText>
       </w:r>
       <w:r>
         <w:rPr>
@@ -6132,7 +6146,7 @@
         <w:fldChar w:fldCharType="begin"/>
       </w:r>
       <w:r>
-        <w:instrText xml:space="preserve"> PAGEREF _Toc29691 \h </w:instrText>
+        <w:instrText xml:space="preserve"> PAGEREF _Toc6539 \h </w:instrText>
       </w:r>
       <w:r>
         <w:fldChar w:fldCharType="separate"/>
@@ -6167,7 +6181,7 @@
         <w:rPr>
           <w:rFonts w:ascii="Times New Roman" w:hAnsi="Times New Roman" w:eastAsia="Times New Roman"/>
         </w:rPr>
-        <w:instrText xml:space="preserve"> HYPERLINK \l _Toc21641 </w:instrText>
+        <w:instrText xml:space="preserve"> HYPERLINK \l _Toc24649 </w:instrText>
       </w:r>
       <w:r>
         <w:rPr>
@@ -6189,13 +6203,13 @@
         <w:fldChar w:fldCharType="begin"/>
       </w:r>
       <w:r>
-        <w:instrText xml:space="preserve"> PAGEREF _Toc21641 \h </w:instrText>
+        <w:instrText xml:space="preserve"> PAGEREF _Toc24649 \h </w:instrText>
       </w:r>
       <w:r>
         <w:fldChar w:fldCharType="separate"/>
       </w:r>
       <w:r>
-        <w:t>11</w:t>
+        <w:t>12</w:t>
       </w:r>
       <w:r>
         <w:fldChar w:fldCharType="end"/>
@@ -6224,7 +6238,7 @@
         <w:rPr>
           <w:rFonts w:ascii="Times New Roman" w:hAnsi="Times New Roman" w:eastAsia="Times New Roman"/>
         </w:rPr>
-        <w:instrText xml:space="preserve"> HYPERLINK \l _Toc15232 </w:instrText>
+        <w:instrText xml:space="preserve"> HYPERLINK \l _Toc15995 </w:instrText>
       </w:r>
       <w:r>
         <w:rPr>
@@ -6246,7 +6260,7 @@
         <w:fldChar w:fldCharType="begin"/>
       </w:r>
       <w:r>
-        <w:instrText xml:space="preserve"> PAGEREF _Toc15232 \h </w:instrText>
+        <w:instrText xml:space="preserve"> PAGEREF _Toc15995 \h </w:instrText>
       </w:r>
       <w:r>
         <w:fldChar w:fldCharType="separate"/>
@@ -6281,7 +6295,7 @@
         <w:rPr>
           <w:rFonts w:ascii="Times New Roman" w:hAnsi="Times New Roman" w:eastAsia="Times New Roman"/>
         </w:rPr>
-        <w:instrText xml:space="preserve"> HYPERLINK \l _Toc10472 </w:instrText>
+        <w:instrText xml:space="preserve"> HYPERLINK \l _Toc6806 </w:instrText>
       </w:r>
       <w:r>
         <w:rPr>
@@ -6303,7 +6317,7 @@
         <w:fldChar w:fldCharType="begin"/>
       </w:r>
       <w:r>
-        <w:instrText xml:space="preserve"> PAGEREF _Toc10472 \h </w:instrText>
+        <w:instrText xml:space="preserve"> PAGEREF _Toc6806 \h </w:instrText>
       </w:r>
       <w:r>
         <w:fldChar w:fldCharType="separate"/>
@@ -6338,7 +6352,7 @@
         <w:rPr>
           <w:rFonts w:ascii="Times New Roman" w:hAnsi="Times New Roman" w:eastAsia="Times New Roman"/>
         </w:rPr>
-        <w:instrText xml:space="preserve"> HYPERLINK \l _Toc1338 </w:instrText>
+        <w:instrText xml:space="preserve"> HYPERLINK \l _Toc14436 </w:instrText>
       </w:r>
       <w:r>
         <w:rPr>
@@ -6360,7 +6374,7 @@
         <w:fldChar w:fldCharType="begin"/>
       </w:r>
       <w:r>
-        <w:instrText xml:space="preserve"> PAGEREF _Toc1338 \h </w:instrText>
+        <w:instrText xml:space="preserve"> PAGEREF _Toc14436 \h </w:instrText>
       </w:r>
       <w:r>
         <w:fldChar w:fldCharType="separate"/>
@@ -6395,7 +6409,7 @@
         <w:rPr>
           <w:rFonts w:ascii="Times New Roman" w:hAnsi="Times New Roman" w:eastAsia="Times New Roman"/>
         </w:rPr>
-        <w:instrText xml:space="preserve"> HYPERLINK \l _Toc8273 </w:instrText>
+        <w:instrText xml:space="preserve"> HYPERLINK \l _Toc17928 </w:instrText>
       </w:r>
       <w:r>
         <w:rPr>
@@ -6417,7 +6431,7 @@
         <w:fldChar w:fldCharType="begin"/>
       </w:r>
       <w:r>
-        <w:instrText xml:space="preserve"> PAGEREF _Toc8273 \h </w:instrText>
+        <w:instrText xml:space="preserve"> PAGEREF _Toc17928 \h </w:instrText>
       </w:r>
       <w:r>
         <w:fldChar w:fldCharType="separate"/>
@@ -6452,7 +6466,7 @@
         <w:rPr>
           <w:rFonts w:ascii="Times New Roman" w:hAnsi="Times New Roman" w:eastAsia="Times New Roman"/>
         </w:rPr>
-        <w:instrText xml:space="preserve"> HYPERLINK \l _Toc9687 </w:instrText>
+        <w:instrText xml:space="preserve"> HYPERLINK \l _Toc12195 </w:instrText>
       </w:r>
       <w:r>
         <w:rPr>
@@ -6474,7 +6488,7 @@
         <w:fldChar w:fldCharType="begin"/>
       </w:r>
       <w:r>
-        <w:instrText xml:space="preserve"> PAGEREF _Toc9687 \h </w:instrText>
+        <w:instrText xml:space="preserve"> PAGEREF _Toc12195 \h </w:instrText>
       </w:r>
       <w:r>
         <w:fldChar w:fldCharType="separate"/>
@@ -6509,7 +6523,7 @@
         <w:rPr>
           <w:rFonts w:ascii="Times New Roman" w:hAnsi="Times New Roman" w:eastAsia="Times New Roman"/>
         </w:rPr>
-        <w:instrText xml:space="preserve"> HYPERLINK \l _Toc7192 </w:instrText>
+        <w:instrText xml:space="preserve"> HYPERLINK \l _Toc9266 </w:instrText>
       </w:r>
       <w:r>
         <w:rPr>
@@ -6531,7 +6545,7 @@
         <w:fldChar w:fldCharType="begin"/>
       </w:r>
       <w:r>
-        <w:instrText xml:space="preserve"> PAGEREF _Toc7192 \h </w:instrText>
+        <w:instrText xml:space="preserve"> PAGEREF _Toc9266 \h </w:instrText>
       </w:r>
       <w:r>
         <w:fldChar w:fldCharType="separate"/>
@@ -6566,7 +6580,7 @@
         <w:rPr>
           <w:rFonts w:ascii="Times New Roman" w:hAnsi="Times New Roman" w:eastAsia="Times New Roman"/>
         </w:rPr>
-        <w:instrText xml:space="preserve"> HYPERLINK \l _Toc17222 </w:instrText>
+        <w:instrText xml:space="preserve"> HYPERLINK \l _Toc14230 </w:instrText>
       </w:r>
       <w:r>
         <w:rPr>
@@ -6588,7 +6602,7 @@
         <w:fldChar w:fldCharType="begin"/>
       </w:r>
       <w:r>
-        <w:instrText xml:space="preserve"> PAGEREF _Toc17222 \h </w:instrText>
+        <w:instrText xml:space="preserve"> PAGEREF _Toc14230 \h </w:instrText>
       </w:r>
       <w:r>
         <w:fldChar w:fldCharType="separate"/>
@@ -6623,7 +6637,7 @@
         <w:rPr>
           <w:rFonts w:ascii="Times New Roman" w:hAnsi="Times New Roman" w:eastAsia="Times New Roman"/>
         </w:rPr>
-        <w:instrText xml:space="preserve"> HYPERLINK \l _Toc5272 </w:instrText>
+        <w:instrText xml:space="preserve"> HYPERLINK \l _Toc23205 </w:instrText>
       </w:r>
       <w:r>
         <w:rPr>
@@ -6645,7 +6659,7 @@
         <w:fldChar w:fldCharType="begin"/>
       </w:r>
       <w:r>
-        <w:instrText xml:space="preserve"> PAGEREF _Toc5272 \h </w:instrText>
+        <w:instrText xml:space="preserve"> PAGEREF _Toc23205 \h </w:instrText>
       </w:r>
       <w:r>
         <w:fldChar w:fldCharType="separate"/>
@@ -6680,7 +6694,7 @@
         <w:rPr>
           <w:rFonts w:ascii="Times New Roman" w:hAnsi="Times New Roman" w:eastAsia="Times New Roman"/>
         </w:rPr>
-        <w:instrText xml:space="preserve"> HYPERLINK \l _Toc24065 </w:instrText>
+        <w:instrText xml:space="preserve"> HYPERLINK \l _Toc2165 </w:instrText>
       </w:r>
       <w:r>
         <w:rPr>
@@ -6702,7 +6716,7 @@
         <w:fldChar w:fldCharType="begin"/>
       </w:r>
       <w:r>
-        <w:instrText xml:space="preserve"> PAGEREF _Toc24065 \h </w:instrText>
+        <w:instrText xml:space="preserve"> PAGEREF _Toc2165 \h </w:instrText>
       </w:r>
       <w:r>
         <w:fldChar w:fldCharType="separate"/>
@@ -6737,7 +6751,7 @@
         <w:rPr>
           <w:rFonts w:ascii="Times New Roman" w:hAnsi="Times New Roman" w:eastAsia="Times New Roman"/>
         </w:rPr>
-        <w:instrText xml:space="preserve"> HYPERLINK \l _Toc21471 </w:instrText>
+        <w:instrText xml:space="preserve"> HYPERLINK \l _Toc28160 </w:instrText>
       </w:r>
       <w:r>
         <w:rPr>
@@ -6759,7 +6773,7 @@
         <w:fldChar w:fldCharType="begin"/>
       </w:r>
       <w:r>
-        <w:instrText xml:space="preserve"> PAGEREF _Toc21471 \h </w:instrText>
+        <w:instrText xml:space="preserve"> PAGEREF _Toc28160 \h </w:instrText>
       </w:r>
       <w:r>
         <w:fldChar w:fldCharType="separate"/>
@@ -6794,7 +6808,7 @@
         <w:rPr>
           <w:rFonts w:ascii="Times New Roman" w:hAnsi="Times New Roman" w:eastAsia="Times New Roman"/>
         </w:rPr>
-        <w:instrText xml:space="preserve"> HYPERLINK \l _Toc7527 </w:instrText>
+        <w:instrText xml:space="preserve"> HYPERLINK \l _Toc5277 </w:instrText>
       </w:r>
       <w:r>
         <w:rPr>
@@ -6816,7 +6830,7 @@
         <w:fldChar w:fldCharType="begin"/>
       </w:r>
       <w:r>
-        <w:instrText xml:space="preserve"> PAGEREF _Toc7527 \h </w:instrText>
+        <w:instrText xml:space="preserve"> PAGEREF _Toc5277 \h </w:instrText>
       </w:r>
       <w:r>
         <w:fldChar w:fldCharType="separate"/>
@@ -6851,7 +6865,7 @@
         <w:rPr>
           <w:rFonts w:ascii="Times New Roman" w:hAnsi="Times New Roman" w:eastAsia="Times New Roman"/>
         </w:rPr>
-        <w:instrText xml:space="preserve"> HYPERLINK \l _Toc6932 </w:instrText>
+        <w:instrText xml:space="preserve"> HYPERLINK \l _Toc28284 </w:instrText>
       </w:r>
       <w:r>
         <w:rPr>
@@ -6873,7 +6887,7 @@
         <w:fldChar w:fldCharType="begin"/>
       </w:r>
       <w:r>
-        <w:instrText xml:space="preserve"> PAGEREF _Toc6932 \h </w:instrText>
+        <w:instrText xml:space="preserve"> PAGEREF _Toc28284 \h </w:instrText>
       </w:r>
       <w:r>
         <w:fldChar w:fldCharType="separate"/>
@@ -6908,7 +6922,7 @@
         <w:rPr>
           <w:rFonts w:ascii="Times New Roman" w:hAnsi="Times New Roman" w:eastAsia="Times New Roman"/>
         </w:rPr>
-        <w:instrText xml:space="preserve"> HYPERLINK \l _Toc16426 </w:instrText>
+        <w:instrText xml:space="preserve"> HYPERLINK \l _Toc15725 </w:instrText>
       </w:r>
       <w:r>
         <w:rPr>
@@ -6930,7 +6944,7 @@
         <w:fldChar w:fldCharType="begin"/>
       </w:r>
       <w:r>
-        <w:instrText xml:space="preserve"> PAGEREF _Toc16426 \h </w:instrText>
+        <w:instrText xml:space="preserve"> PAGEREF _Toc15725 \h </w:instrText>
       </w:r>
       <w:r>
         <w:fldChar w:fldCharType="separate"/>
@@ -6965,7 +6979,7 @@
         <w:rPr>
           <w:rFonts w:ascii="Times New Roman" w:hAnsi="Times New Roman" w:eastAsia="Times New Roman"/>
         </w:rPr>
-        <w:instrText xml:space="preserve"> HYPERLINK \l _Toc12227 </w:instrText>
+        <w:instrText xml:space="preserve"> HYPERLINK \l _Toc10718 </w:instrText>
       </w:r>
       <w:r>
         <w:rPr>
@@ -6987,7 +7001,7 @@
         <w:fldChar w:fldCharType="begin"/>
       </w:r>
       <w:r>
-        <w:instrText xml:space="preserve"> PAGEREF _Toc12227 \h </w:instrText>
+        <w:instrText xml:space="preserve"> PAGEREF _Toc10718 \h </w:instrText>
       </w:r>
       <w:r>
         <w:fldChar w:fldCharType="separate"/>
@@ -7022,7 +7036,7 @@
         <w:rPr>
           <w:rFonts w:ascii="Times New Roman" w:hAnsi="Times New Roman" w:eastAsia="Times New Roman"/>
         </w:rPr>
-        <w:instrText xml:space="preserve"> HYPERLINK \l _Toc22746 </w:instrText>
+        <w:instrText xml:space="preserve"> HYPERLINK \l _Toc19440 </w:instrText>
       </w:r>
       <w:r>
         <w:rPr>
@@ -7044,7 +7058,7 @@
         <w:fldChar w:fldCharType="begin"/>
       </w:r>
       <w:r>
-        <w:instrText xml:space="preserve"> PAGEREF _Toc22746 \h </w:instrText>
+        <w:instrText xml:space="preserve"> PAGEREF _Toc19440 \h </w:instrText>
       </w:r>
       <w:r>
         <w:fldChar w:fldCharType="separate"/>
@@ -7079,7 +7093,7 @@
         <w:rPr>
           <w:rFonts w:ascii="Times New Roman" w:hAnsi="Times New Roman" w:eastAsia="Times New Roman"/>
         </w:rPr>
-        <w:instrText xml:space="preserve"> HYPERLINK \l _Toc30883 </w:instrText>
+        <w:instrText xml:space="preserve"> HYPERLINK \l _Toc5621 </w:instrText>
       </w:r>
       <w:r>
         <w:rPr>
@@ -7101,7 +7115,7 @@
         <w:fldChar w:fldCharType="begin"/>
       </w:r>
       <w:r>
-        <w:instrText xml:space="preserve"> PAGEREF _Toc30883 \h </w:instrText>
+        <w:instrText xml:space="preserve"> PAGEREF _Toc5621 \h </w:instrText>
       </w:r>
       <w:r>
         <w:fldChar w:fldCharType="separate"/>
@@ -7136,7 +7150,7 @@
         <w:rPr>
           <w:rFonts w:ascii="Times New Roman" w:hAnsi="Times New Roman" w:eastAsia="Times New Roman"/>
         </w:rPr>
-        <w:instrText xml:space="preserve"> HYPERLINK \l _Toc15 </w:instrText>
+        <w:instrText xml:space="preserve"> HYPERLINK \l _Toc13284 </w:instrText>
       </w:r>
       <w:r>
         <w:rPr>
@@ -7158,7 +7172,7 @@
         <w:fldChar w:fldCharType="begin"/>
       </w:r>
       <w:r>
-        <w:instrText xml:space="preserve"> PAGEREF _Toc15 \h </w:instrText>
+        <w:instrText xml:space="preserve"> PAGEREF _Toc13284 \h </w:instrText>
       </w:r>
       <w:r>
         <w:fldChar w:fldCharType="separate"/>
@@ -7193,7 +7207,7 @@
         <w:rPr>
           <w:rFonts w:ascii="Times New Roman" w:hAnsi="Times New Roman" w:eastAsia="Times New Roman"/>
         </w:rPr>
-        <w:instrText xml:space="preserve"> HYPERLINK \l _Toc19875 </w:instrText>
+        <w:instrText xml:space="preserve"> HYPERLINK \l _Toc15 </w:instrText>
       </w:r>
       <w:r>
         <w:rPr>
@@ -7215,7 +7229,7 @@
         <w:fldChar w:fldCharType="begin"/>
       </w:r>
       <w:r>
-        <w:instrText xml:space="preserve"> PAGEREF _Toc19875 \h </w:instrText>
+        <w:instrText xml:space="preserve"> PAGEREF _Toc15 \h </w:instrText>
       </w:r>
       <w:r>
         <w:fldChar w:fldCharType="separate"/>
@@ -7250,7 +7264,7 @@
         <w:rPr>
           <w:rFonts w:ascii="Times New Roman" w:hAnsi="Times New Roman" w:eastAsia="Times New Roman"/>
         </w:rPr>
-        <w:instrText xml:space="preserve"> HYPERLINK \l _Toc12496 </w:instrText>
+        <w:instrText xml:space="preserve"> HYPERLINK \l _Toc7130 </w:instrText>
       </w:r>
       <w:r>
         <w:rPr>
@@ -7263,7 +7277,7 @@
           <w:rFonts w:ascii="Times New Roman" w:hAnsi="Times New Roman" w:eastAsia="Times New Roman"/>
           <w:i w:val="0"/>
         </w:rPr>
-        <w:t>Table B.1: Fields requiring official confirmation</w:t>
+        <w:t>Table B.1: Administrative and provenance record</w:t>
       </w:r>
       <w:r>
         <w:tab/>
@@ -7272,7 +7286,7 @@
         <w:fldChar w:fldCharType="begin"/>
       </w:r>
       <w:r>
-        <w:instrText xml:space="preserve"> PAGEREF _Toc12496 \h </w:instrText>
+        <w:instrText xml:space="preserve"> PAGEREF _Toc7130 \h </w:instrText>
       </w:r>
       <w:r>
         <w:fldChar w:fldCharType="separate"/>
@@ -7307,7 +7321,7 @@
         <w:rPr>
           <w:rFonts w:ascii="Times New Roman" w:hAnsi="Times New Roman" w:eastAsia="Times New Roman"/>
         </w:rPr>
-        <w:instrText xml:space="preserve"> HYPERLINK \l _Toc32059 </w:instrText>
+        <w:instrText xml:space="preserve"> HYPERLINK \l _Toc12551 </w:instrText>
       </w:r>
       <w:r>
         <w:rPr>
@@ -7329,7 +7343,7 @@
         <w:fldChar w:fldCharType="begin"/>
       </w:r>
       <w:r>
-        <w:instrText xml:space="preserve"> PAGEREF _Toc32059 \h </w:instrText>
+        <w:instrText xml:space="preserve"> PAGEREF _Toc12551 \h </w:instrText>
       </w:r>
       <w:r>
         <w:fldChar w:fldCharType="separate"/>
@@ -7364,7 +7378,7 @@
         <w:rPr>
           <w:rFonts w:ascii="Times New Roman" w:hAnsi="Times New Roman" w:eastAsia="Times New Roman"/>
         </w:rPr>
-        <w:instrText xml:space="preserve"> HYPERLINK \l _Toc26906 </w:instrText>
+        <w:instrText xml:space="preserve"> HYPERLINK \l _Toc15239 </w:instrText>
       </w:r>
       <w:r>
         <w:rPr>
@@ -7386,7 +7400,7 @@
         <w:fldChar w:fldCharType="begin"/>
       </w:r>
       <w:r>
-        <w:instrText xml:space="preserve"> PAGEREF _Toc26906 \h </w:instrText>
+        <w:instrText xml:space="preserve"> PAGEREF _Toc15239 \h </w:instrText>
       </w:r>
       <w:r>
         <w:fldChar w:fldCharType="separate"/>
@@ -7421,7 +7435,7 @@
         <w:rPr>
           <w:rFonts w:ascii="Times New Roman" w:hAnsi="Times New Roman" w:eastAsia="Times New Roman"/>
         </w:rPr>
-        <w:instrText xml:space="preserve"> HYPERLINK \l _Toc22859 </w:instrText>
+        <w:instrText xml:space="preserve"> HYPERLINK \l _Toc29406 </w:instrText>
       </w:r>
       <w:r>
         <w:rPr>
@@ -7443,7 +7457,7 @@
         <w:fldChar w:fldCharType="begin"/>
       </w:r>
       <w:r>
-        <w:instrText xml:space="preserve"> PAGEREF _Toc22859 \h </w:instrText>
+        <w:instrText xml:space="preserve"> PAGEREF _Toc29406 \h </w:instrText>
       </w:r>
       <w:r>
         <w:fldChar w:fldCharType="separate"/>
@@ -7478,7 +7492,7 @@
         <w:rPr>
           <w:rFonts w:ascii="Times New Roman" w:hAnsi="Times New Roman" w:eastAsia="Times New Roman"/>
         </w:rPr>
-        <w:instrText xml:space="preserve"> HYPERLINK \l _Toc14264 </w:instrText>
+        <w:instrText xml:space="preserve"> HYPERLINK \l _Toc27013 </w:instrText>
       </w:r>
       <w:r>
         <w:rPr>
@@ -7500,7 +7514,7 @@
         <w:fldChar w:fldCharType="begin"/>
       </w:r>
       <w:r>
-        <w:instrText xml:space="preserve"> PAGEREF _Toc14264 \h </w:instrText>
+        <w:instrText xml:space="preserve"> PAGEREF _Toc27013 \h </w:instrText>
       </w:r>
       <w:r>
         <w:fldChar w:fldCharType="separate"/>
@@ -7546,7 +7560,7 @@
         <w:pStyle w:val="2"/>
         <w:spacing w:after="360"/>
       </w:pPr>
-      <w:bookmarkStart w:id="0" w:name="_Toc12700"/>
+      <w:bookmarkStart w:id="0" w:name="_Toc16761"/>
       <w:r>
         <w:rPr>
           <w:rFonts w:ascii="Times New Roman" w:hAnsi="Times New Roman" w:eastAsia="Times New Roman"/>
@@ -7591,7 +7605,7 @@
       <w:pPr>
         <w:pStyle w:val="3"/>
       </w:pPr>
-      <w:bookmarkStart w:id="1" w:name="_Toc14789"/>
+      <w:bookmarkStart w:id="1" w:name="_Toc20594"/>
       <w:r>
         <w:rPr>
           <w:rFonts w:ascii="Times New Roman" w:hAnsi="Times New Roman" w:eastAsia="Times New Roman"/>
@@ -8182,7 +8196,7 @@
       <w:pPr>
         <w:pStyle w:val="3"/>
       </w:pPr>
-      <w:bookmarkStart w:id="2" w:name="_Toc9321"/>
+      <w:bookmarkStart w:id="2" w:name="_Toc22292"/>
       <w:r>
         <w:rPr>
           <w:rFonts w:ascii="Times New Roman" w:hAnsi="Times New Roman" w:eastAsia="Times New Roman"/>
@@ -8529,7 +8543,7 @@
       <w:pPr>
         <w:pStyle w:val="3"/>
       </w:pPr>
-      <w:bookmarkStart w:id="3" w:name="_Toc19282"/>
+      <w:bookmarkStart w:id="3" w:name="_Toc29369"/>
       <w:r>
         <w:rPr>
           <w:rFonts w:ascii="Times New Roman" w:hAnsi="Times New Roman" w:eastAsia="Times New Roman"/>
@@ -8572,7 +8586,7 @@
       <w:pPr>
         <w:pStyle w:val="3"/>
       </w:pPr>
-      <w:bookmarkStart w:id="4" w:name="_Toc4488"/>
+      <w:bookmarkStart w:id="4" w:name="_Toc29343"/>
       <w:r>
         <w:rPr>
           <w:rFonts w:ascii="Times New Roman" w:hAnsi="Times New Roman" w:eastAsia="Times New Roman"/>
@@ -8700,7 +8714,7 @@
         <w:pStyle w:val="25"/>
         <w:keepNext/>
       </w:pPr>
-      <w:bookmarkStart w:id="5" w:name="_Toc29644"/>
+      <w:bookmarkStart w:id="5" w:name="_Toc20817"/>
       <w:r>
         <w:rPr>
           <w:rFonts w:ascii="Times New Roman" w:hAnsi="Times New Roman" w:eastAsia="Times New Roman"/>
@@ -9156,7 +9170,7 @@
       <w:pPr>
         <w:pStyle w:val="3"/>
       </w:pPr>
-      <w:bookmarkStart w:id="6" w:name="_Toc32707"/>
+      <w:bookmarkStart w:id="6" w:name="_Toc5667"/>
       <w:r>
         <w:rPr>
           <w:rFonts w:ascii="Times New Roman" w:hAnsi="Times New Roman" w:eastAsia="Times New Roman"/>
@@ -9178,7 +9192,7 @@
           <w:rFonts w:ascii="Times New Roman" w:hAnsi="Times New Roman" w:eastAsia="Times New Roman"/>
           <w:sz w:val="24"/>
         </w:rPr>
-        <w:t>The study is retrospective and computational. It uses panoramic radiographs from [Hospital 1 name and location], [Hospital 2 name and location], and [Hospital 3 name and location], collected from [data collection start date] to [data collection end date]. These placeholders must be replaced with the approved provenance record. The 1,287 images represent 1,287 unique patients, and no patient contributes more than one radiograph to the analysed cohort.</w:t>
+        <w:t>The study is retrospective and computational. It uses panoramic radiographs collected across 21 dental hospitals from October 2025 to April 2026. The hospitals are identified in Section 3.1. The 1,287 images represent 1,287 unique patients, and no patient contributes more than one radiograph to the analysed cohort.</w:t>
       </w:r>
     </w:p>
     <w:p>
@@ -9563,7 +9577,7 @@
       <w:pPr>
         <w:pStyle w:val="3"/>
       </w:pPr>
-      <w:bookmarkStart w:id="7" w:name="_Toc23912"/>
+      <w:bookmarkStart w:id="7" w:name="_Toc12002"/>
       <w:r>
         <w:rPr>
           <w:rFonts w:ascii="Times New Roman" w:hAnsi="Times New Roman" w:eastAsia="Times New Roman"/>
@@ -9592,7 +9606,7 @@
       <w:pPr>
         <w:pStyle w:val="3"/>
       </w:pPr>
-      <w:bookmarkStart w:id="8" w:name="_Toc19112"/>
+      <w:bookmarkStart w:id="8" w:name="_Toc21487"/>
       <w:r>
         <w:rPr>
           <w:rFonts w:ascii="Times New Roman" w:hAnsi="Times New Roman" w:eastAsia="Times New Roman"/>
@@ -9627,7 +9641,7 @@
         <w:pStyle w:val="2"/>
         <w:spacing w:after="360"/>
       </w:pPr>
-      <w:bookmarkStart w:id="9" w:name="_Toc13006"/>
+      <w:bookmarkStart w:id="9" w:name="_Toc27482"/>
       <w:r>
         <w:rPr>
           <w:rFonts w:ascii="Times New Roman" w:hAnsi="Times New Roman" w:eastAsia="Times New Roman"/>
@@ -9672,7 +9686,7 @@
       <w:pPr>
         <w:pStyle w:val="3"/>
       </w:pPr>
-      <w:bookmarkStart w:id="10" w:name="_Toc25432"/>
+      <w:bookmarkStart w:id="10" w:name="_Toc21527"/>
       <w:r>
         <w:rPr>
           <w:rFonts w:ascii="Times New Roman" w:hAnsi="Times New Roman" w:eastAsia="Times New Roman"/>
@@ -10149,7 +10163,7 @@
       <w:pPr>
         <w:pStyle w:val="3"/>
       </w:pPr>
-      <w:bookmarkStart w:id="11" w:name="_Toc27828"/>
+      <w:bookmarkStart w:id="11" w:name="_Toc1240"/>
       <w:r>
         <w:rPr>
           <w:rFonts w:ascii="Times New Roman" w:hAnsi="Times New Roman" w:eastAsia="Times New Roman"/>
@@ -10516,7 +10530,7 @@
       <w:pPr>
         <w:pStyle w:val="3"/>
       </w:pPr>
-      <w:bookmarkStart w:id="12" w:name="_Toc15843"/>
+      <w:bookmarkStart w:id="12" w:name="_Toc2523"/>
       <w:r>
         <w:rPr>
           <w:rFonts w:ascii="Times New Roman" w:hAnsi="Times New Roman" w:eastAsia="Times New Roman"/>
@@ -10783,7 +10797,7 @@
       <w:pPr>
         <w:pStyle w:val="3"/>
       </w:pPr>
-      <w:bookmarkStart w:id="13" w:name="_Toc2046"/>
+      <w:bookmarkStart w:id="13" w:name="_Toc27758"/>
       <w:r>
         <w:rPr>
           <w:rFonts w:ascii="Times New Roman" w:hAnsi="Times New Roman" w:eastAsia="Times New Roman"/>
@@ -10840,7 +10854,7 @@
       <w:pPr>
         <w:pStyle w:val="3"/>
       </w:pPr>
-      <w:bookmarkStart w:id="14" w:name="_Toc8293"/>
+      <w:bookmarkStart w:id="14" w:name="_Toc2452"/>
       <w:r>
         <w:rPr>
           <w:rFonts w:ascii="Times New Roman" w:hAnsi="Times New Roman" w:eastAsia="Times New Roman"/>
@@ -11038,7 +11052,7 @@
         <w:pStyle w:val="25"/>
         <w:keepNext/>
       </w:pPr>
-      <w:bookmarkStart w:id="15" w:name="_Toc29691"/>
+      <w:bookmarkStart w:id="15" w:name="_Toc6539"/>
       <w:r>
         <w:rPr>
           <w:rFonts w:ascii="Times New Roman" w:hAnsi="Times New Roman" w:eastAsia="Times New Roman"/>
@@ -12269,7 +12283,7 @@
       <w:pPr>
         <w:pStyle w:val="3"/>
       </w:pPr>
-      <w:bookmarkStart w:id="16" w:name="_Toc9210"/>
+      <w:bookmarkStart w:id="16" w:name="_Toc22130"/>
       <w:r>
         <w:rPr>
           <w:rFonts w:ascii="Times New Roman" w:hAnsi="Times New Roman" w:eastAsia="Times New Roman"/>
@@ -12312,7 +12326,7 @@
       <w:pPr>
         <w:pStyle w:val="3"/>
       </w:pPr>
-      <w:bookmarkStart w:id="17" w:name="_Toc24589"/>
+      <w:bookmarkStart w:id="17" w:name="_Toc27159"/>
       <w:r>
         <w:rPr>
           <w:rFonts w:ascii="Times New Roman" w:hAnsi="Times New Roman" w:eastAsia="Times New Roman"/>
@@ -12347,7 +12361,7 @@
         <w:pStyle w:val="2"/>
         <w:spacing w:after="360"/>
       </w:pPr>
-      <w:bookmarkStart w:id="18" w:name="_Toc4043"/>
+      <w:bookmarkStart w:id="18" w:name="_Toc19162"/>
       <w:r>
         <w:rPr>
           <w:rFonts w:ascii="Times New Roman" w:hAnsi="Times New Roman" w:eastAsia="Times New Roman"/>
@@ -12392,7 +12406,7 @@
       <w:pPr>
         <w:pStyle w:val="3"/>
       </w:pPr>
-      <w:bookmarkStart w:id="19" w:name="_Toc27488"/>
+      <w:bookmarkStart w:id="19" w:name="_Toc30256"/>
       <w:r>
         <w:rPr>
           <w:rFonts w:ascii="Times New Roman" w:hAnsi="Times New Roman" w:eastAsia="Times New Roman"/>
@@ -12414,7 +12428,7 @@
           <w:rFonts w:ascii="Times New Roman" w:hAnsi="Times New Roman" w:eastAsia="Times New Roman"/>
           <w:sz w:val="24"/>
         </w:rPr>
-        <w:t>The study used a retrospective computational design based on a primary collection of panoramic dental radiographs. Data were obtained from [Hospital 1 name and location], [Hospital 2 name and location], and [Hospital 3 name and location] between [data collection start date] and [data collection end date]. Ethical permission was obtained from [ethics committee or institutional review board name], approval [approval/reference number], dated [approval date]. These bracketed fields must be completed from the signed institutional records before submission.</w:t>
+        <w:t>The study used a retrospective computational design based on a primary collection of panoramic dental radiographs. Data were collected from October 2025 to April 2026 across the following 21 hospitals: Family Dental Care Hospital, Raipur Dental Care Hospital, Apolo Dental Hospital, Shumi's Dental Hospital, Shahed Bhai Hospital, Ramganj Dental Hospital, Lineon Dental Hospital, Evercare Dental Hospital, Ma Dental Care Hospital, Jannat Dental Hospital, DigiLab Hospital, IBN Sina Hospital, Alok Healthcare Hospital, Popular Hospital, Labaid Hospital, Medinet Healthcare Hospital, Medinet Private Hospital, Ibrahim General Hospital, Exceptional Dental Hospital, Nusrat Dental Care Hospital, and Narayanganj Dental Hospital. Ethical permission was granted by the Institutional Ethical Review Committee (IERC), Daffodil International University, under reference IEC-FSIT/DIU/2026/2023.</w:t>
       </w:r>
     </w:p>
     <w:p>
@@ -12428,7 +12442,7 @@
           <w:rFonts w:ascii="Times New Roman" w:hAnsi="Times New Roman" w:eastAsia="Times New Roman"/>
           <w:sz w:val="24"/>
         </w:rPr>
-        <w:t>The dataset contains 1,287 radiographs from 1,287 unique patients, so each patient contributes one image. Image-level impacted/non-impacted labels were reviewed by [validating clinician name and qualification], a single doctor. This validation supports use of the binary labels; a multi-reader annotation phase is required to estimate inter-rater agreement. The confirmed reference standard comprises image-level labels, while spatial bounding boxes, segmentation masks, tooth-specific categories, and surgical outcomes are planned as separate evidence layers.</w:t>
+        <w:t>The dataset contains 1,287 radiographs from 1,287 unique patients, so each patient contributes one image. Image-level impacted/non-impacted labels were reviewed by Dr. Nur Nobi of Family Dental Care Hospital. This clinical review supports use of the binary labels; a multi-reader annotation phase would allow inter-rater agreement to be estimated. The confirmed reference standard comprises image-level labels, while spatial bounding boxes, segmentation masks, tooth-specific categories, and surgical outcomes are planned as separate evidence layers.</w:t>
       </w:r>
     </w:p>
     <w:p>
@@ -12450,7 +12464,7 @@
         <w:pStyle w:val="25"/>
         <w:keepNext/>
       </w:pPr>
-      <w:bookmarkStart w:id="20" w:name="_Toc21641"/>
+      <w:bookmarkStart w:id="20" w:name="_Toc24649"/>
       <w:r>
         <w:rPr>
           <w:rFonts w:ascii="Times New Roman" w:hAnsi="Times New Roman" w:eastAsia="Times New Roman"/>
@@ -13274,7 +13288,7 @@
         <w:pStyle w:val="24"/>
         <w:keepLines/>
       </w:pPr>
-      <w:bookmarkStart w:id="21" w:name="_Toc3748"/>
+      <w:bookmarkStart w:id="21" w:name="_Toc23242"/>
       <w:r>
         <w:rPr>
           <w:rFonts w:ascii="Times New Roman" w:hAnsi="Times New Roman" w:eastAsia="Times New Roman"/>
@@ -13289,7 +13303,7 @@
       <w:pPr>
         <w:pStyle w:val="3"/>
       </w:pPr>
-      <w:bookmarkStart w:id="22" w:name="_Toc5157"/>
+      <w:bookmarkStart w:id="22" w:name="_Toc26946"/>
       <w:r>
         <w:rPr>
           <w:rFonts w:ascii="Times New Roman" w:hAnsi="Times New Roman" w:eastAsia="Times New Roman"/>
@@ -13346,7 +13360,7 @@
       <w:pPr>
         <w:pStyle w:val="3"/>
       </w:pPr>
-      <w:bookmarkStart w:id="23" w:name="_Toc13176"/>
+      <w:bookmarkStart w:id="23" w:name="_Toc22271"/>
       <w:r>
         <w:rPr>
           <w:rFonts w:ascii="Times New Roman" w:hAnsi="Times New Roman" w:eastAsia="Times New Roman"/>
@@ -13390,7 +13404,7 @@
         <w:pStyle w:val="25"/>
         <w:keepNext/>
       </w:pPr>
-      <w:bookmarkStart w:id="24" w:name="_Toc15232"/>
+      <w:bookmarkStart w:id="24" w:name="_Toc15995"/>
       <w:r>
         <w:rPr>
           <w:rFonts w:ascii="Times New Roman" w:hAnsi="Times New Roman" w:eastAsia="Times New Roman"/>
@@ -13986,7 +14000,7 @@
       <w:pPr>
         <w:pStyle w:val="3"/>
       </w:pPr>
-      <w:bookmarkStart w:id="25" w:name="_Toc25614"/>
+      <w:bookmarkStart w:id="25" w:name="_Toc1627"/>
       <w:r>
         <w:rPr>
           <w:rFonts w:ascii="Times New Roman" w:hAnsi="Times New Roman" w:eastAsia="Times New Roman"/>
@@ -14044,7 +14058,7 @@
         <w:pStyle w:val="25"/>
         <w:keepNext/>
       </w:pPr>
-      <w:bookmarkStart w:id="26" w:name="_Toc10472"/>
+      <w:bookmarkStart w:id="26" w:name="_Toc6806"/>
       <w:r>
         <w:rPr>
           <w:rFonts w:ascii="Times New Roman" w:hAnsi="Times New Roman" w:eastAsia="Times New Roman"/>
@@ -14731,7 +14745,7 @@
       <w:pPr>
         <w:pStyle w:val="3"/>
       </w:pPr>
-      <w:bookmarkStart w:id="27" w:name="_Toc21580"/>
+      <w:bookmarkStart w:id="27" w:name="_Toc26177"/>
       <w:r>
         <w:rPr>
           <w:rFonts w:ascii="Times New Roman" w:hAnsi="Times New Roman" w:eastAsia="Times New Roman"/>
@@ -14775,7 +14789,7 @@
         <w:pStyle w:val="25"/>
         <w:keepNext/>
       </w:pPr>
-      <w:bookmarkStart w:id="28" w:name="_Toc1338"/>
+      <w:bookmarkStart w:id="28" w:name="_Toc14436"/>
       <w:r>
         <w:rPr>
           <w:rFonts w:ascii="Times New Roman" w:hAnsi="Times New Roman" w:eastAsia="Times New Roman"/>
@@ -15377,7 +15391,7 @@
       <w:pPr>
         <w:pStyle w:val="3"/>
       </w:pPr>
-      <w:bookmarkStart w:id="29" w:name="_Toc13438"/>
+      <w:bookmarkStart w:id="29" w:name="_Toc13714"/>
       <w:r>
         <w:rPr>
           <w:rFonts w:ascii="Times New Roman" w:hAnsi="Times New Roman" w:eastAsia="Times New Roman"/>
@@ -15494,7 +15508,7 @@
         <w:pStyle w:val="24"/>
         <w:keepLines/>
       </w:pPr>
-      <w:bookmarkStart w:id="30" w:name="_Toc28967"/>
+      <w:bookmarkStart w:id="30" w:name="_Toc170"/>
       <w:r>
         <w:rPr>
           <w:rFonts w:ascii="Times New Roman" w:hAnsi="Times New Roman" w:eastAsia="Times New Roman"/>
@@ -15509,7 +15523,7 @@
       <w:pPr>
         <w:pStyle w:val="3"/>
       </w:pPr>
-      <w:bookmarkStart w:id="31" w:name="_Toc7249"/>
+      <w:bookmarkStart w:id="31" w:name="_Toc4035"/>
       <w:r>
         <w:rPr>
           <w:rFonts w:ascii="Times New Roman" w:hAnsi="Times New Roman" w:eastAsia="Times New Roman"/>
@@ -15553,7 +15567,7 @@
         <w:pStyle w:val="25"/>
         <w:keepNext/>
       </w:pPr>
-      <w:bookmarkStart w:id="32" w:name="_Toc8273"/>
+      <w:bookmarkStart w:id="32" w:name="_Toc17928"/>
       <w:r>
         <w:rPr>
           <w:rFonts w:ascii="Times New Roman" w:hAnsi="Times New Roman" w:eastAsia="Times New Roman"/>
@@ -16240,7 +16254,7 @@
       <w:pPr>
         <w:pStyle w:val="3"/>
       </w:pPr>
-      <w:bookmarkStart w:id="33" w:name="_Toc14862"/>
+      <w:bookmarkStart w:id="33" w:name="_Toc10546"/>
       <w:r>
         <w:rPr>
           <w:rFonts w:ascii="Times New Roman" w:hAnsi="Times New Roman" w:eastAsia="Times New Roman"/>
@@ -16269,7 +16283,7 @@
       <w:pPr>
         <w:pStyle w:val="3"/>
       </w:pPr>
-      <w:bookmarkStart w:id="34" w:name="_Toc21993"/>
+      <w:bookmarkStart w:id="34" w:name="_Toc9109"/>
       <w:r>
         <w:rPr>
           <w:rFonts w:ascii="Times New Roman" w:hAnsi="Times New Roman" w:eastAsia="Times New Roman"/>
@@ -16532,7 +16546,7 @@
       <w:pPr>
         <w:pStyle w:val="3"/>
       </w:pPr>
-      <w:bookmarkStart w:id="35" w:name="_Toc1304"/>
+      <w:bookmarkStart w:id="35" w:name="_Toc25675"/>
       <w:r>
         <w:rPr>
           <w:rFonts w:ascii="Times New Roman" w:hAnsi="Times New Roman" w:eastAsia="Times New Roman"/>
@@ -16554,7 +16568,41 @@
           <w:rFonts w:ascii="Times New Roman" w:hAnsi="Times New Roman" w:eastAsia="Times New Roman"/>
           <w:sz w:val="24"/>
         </w:rPr>
-        <w:t>Random seeds were fixed at the stages recorded in the notebook, fold assignments were stratified, and output artifacts included predictions, labels, gate-free metrics, geometry mappings, calibration summaries, error lists, and model checkpoints. The complete code will be made available at [GitHub repository URL]. This placeholder must be replaced with a working repository link and a release tag or commit before institutional submission.</w:t>
+        <w:t xml:space="preserve">Random seeds were fixed at the stages recorded in the notebook, fold assignments were stratified, and output artifacts included predictions, labels, gate-free metrics, geometry mappings, calibration summaries, error lists, and model checkpoints. The designated repository address for the project code and reproducibility materials is </w:t>
+      </w:r>
+      <w:r>
+        <w:fldChar w:fldCharType="begin"/>
+      </w:r>
+      <w:r>
+        <w:instrText xml:space="preserve"> HYPERLINK "https://github.com/Anim1400/Dental" \h </w:instrText>
+      </w:r>
+      <w:r>
+        <w:fldChar w:fldCharType="separate"/>
+      </w:r>
+      <w:r>
+        <w:rPr>
+          <w:rFonts w:ascii="Times New Roman" w:hAnsi="Times New Roman"/>
+          <w:color w:val="0563C1"/>
+          <w:sz w:val="24"/>
+          <w:u w:val="single"/>
+        </w:rPr>
+        <w:t>https://github.com/Anim1400/Dental</w:t>
+      </w:r>
+      <w:r>
+        <w:rPr>
+          <w:rFonts w:ascii="Times New Roman" w:hAnsi="Times New Roman"/>
+          <w:color w:val="0563C1"/>
+          <w:sz w:val="24"/>
+          <w:u w:val="single"/>
+        </w:rPr>
+        <w:fldChar w:fldCharType="end"/>
+      </w:r>
+      <w:r>
+        <w:rPr>
+          <w:rFonts w:ascii="Times New Roman" w:hAnsi="Times New Roman" w:eastAsia="Times New Roman"/>
+          <w:sz w:val="24"/>
+        </w:rPr>
+        <w:t>.</w:t>
       </w:r>
     </w:p>
     <w:p>
@@ -16568,14 +16616,14 @@
           <w:rFonts w:ascii="Times New Roman" w:hAnsi="Times New Roman" w:eastAsia="Times New Roman"/>
           <w:sz w:val="24"/>
         </w:rPr>
-        <w:t>The study was performed under institutional ethical permission. The final administrative record must include the approving committee, reference number, approval date, data-source hospitals, collection dates, and validating clinician. No direct project expense or external funding was received; personal devices, existing internet service, and free or institutionally available computing resources were used.</w:t>
+        <w:t>The study was performed under permission from the Institutional Ethical Review Committee (IERC), Daffodil International University, reference IEC-FSIT/DIU/2026/2023. The primary radiographs were collected across the 21 named source hospitals from October 2025 to April 2026, and the image-level labels were validated by Dr. Nur Nobi of Family Dental Care Hospital. No direct project expense or external funding was received; personal devices, existing internet service, and free or institutionally available computing resources were used.</w:t>
       </w:r>
     </w:p>
     <w:p>
       <w:pPr>
         <w:pStyle w:val="3"/>
       </w:pPr>
-      <w:bookmarkStart w:id="36" w:name="_Toc2424"/>
+      <w:bookmarkStart w:id="36" w:name="_Toc18106"/>
       <w:r>
         <w:rPr>
           <w:rFonts w:ascii="Times New Roman" w:hAnsi="Times New Roman" w:eastAsia="Times New Roman"/>
@@ -16610,7 +16658,7 @@
         <w:pStyle w:val="2"/>
         <w:spacing w:after="360"/>
       </w:pPr>
-      <w:bookmarkStart w:id="37" w:name="_Toc14334"/>
+      <w:bookmarkStart w:id="37" w:name="_Toc21799"/>
       <w:r>
         <w:rPr>
           <w:rFonts w:ascii="Times New Roman" w:hAnsi="Times New Roman" w:eastAsia="Times New Roman"/>
@@ -16655,7 +16703,7 @@
       <w:pPr>
         <w:pStyle w:val="3"/>
       </w:pPr>
-      <w:bookmarkStart w:id="38" w:name="_Toc25896"/>
+      <w:bookmarkStart w:id="38" w:name="_Toc24163"/>
       <w:r>
         <w:rPr>
           <w:rFonts w:ascii="Times New Roman" w:hAnsi="Times New Roman" w:eastAsia="Times New Roman"/>
@@ -16698,7 +16746,7 @@
       <w:pPr>
         <w:pStyle w:val="3"/>
       </w:pPr>
-      <w:bookmarkStart w:id="39" w:name="_Toc12395"/>
+      <w:bookmarkStart w:id="39" w:name="_Toc25622"/>
       <w:r>
         <w:rPr>
           <w:rFonts w:ascii="Times New Roman" w:hAnsi="Times New Roman" w:eastAsia="Times New Roman"/>
@@ -16756,7 +16804,7 @@
         <w:pStyle w:val="25"/>
         <w:keepNext/>
       </w:pPr>
-      <w:bookmarkStart w:id="40" w:name="_Toc9687"/>
+      <w:bookmarkStart w:id="40" w:name="_Toc12195"/>
       <w:r>
         <w:rPr>
           <w:rFonts w:ascii="Times New Roman" w:hAnsi="Times New Roman" w:eastAsia="Times New Roman"/>
@@ -17815,7 +17863,7 @@
         <w:pStyle w:val="24"/>
         <w:keepLines/>
       </w:pPr>
-      <w:bookmarkStart w:id="41" w:name="_Toc32104"/>
+      <w:bookmarkStart w:id="41" w:name="_Toc22486"/>
       <w:r>
         <w:rPr>
           <w:rFonts w:ascii="Times New Roman" w:hAnsi="Times New Roman" w:eastAsia="Times New Roman"/>
@@ -17830,7 +17878,7 @@
       <w:pPr>
         <w:pStyle w:val="3"/>
       </w:pPr>
-      <w:bookmarkStart w:id="42" w:name="_Toc8079"/>
+      <w:bookmarkStart w:id="42" w:name="_Toc29177"/>
       <w:r>
         <w:rPr>
           <w:rFonts w:ascii="Times New Roman" w:hAnsi="Times New Roman" w:eastAsia="Times New Roman"/>
@@ -17888,7 +17936,7 @@
         <w:pStyle w:val="25"/>
         <w:keepNext/>
       </w:pPr>
-      <w:bookmarkStart w:id="43" w:name="_Toc7192"/>
+      <w:bookmarkStart w:id="43" w:name="_Toc9266"/>
       <w:r>
         <w:rPr>
           <w:rFonts w:ascii="Times New Roman" w:hAnsi="Times New Roman" w:eastAsia="Times New Roman"/>
@@ -18166,7 +18214,7 @@
         <w:pStyle w:val="24"/>
         <w:keepLines/>
       </w:pPr>
-      <w:bookmarkStart w:id="44" w:name="_Toc17210"/>
+      <w:bookmarkStart w:id="44" w:name="_Toc10906"/>
       <w:r>
         <w:rPr>
           <w:rFonts w:ascii="Times New Roman" w:hAnsi="Times New Roman" w:eastAsia="Times New Roman"/>
@@ -18181,7 +18229,7 @@
       <w:pPr>
         <w:pStyle w:val="3"/>
       </w:pPr>
-      <w:bookmarkStart w:id="45" w:name="_Toc17351"/>
+      <w:bookmarkStart w:id="45" w:name="_Toc8654"/>
       <w:r>
         <w:rPr>
           <w:rFonts w:ascii="Times New Roman" w:hAnsi="Times New Roman" w:eastAsia="Times New Roman"/>
@@ -18225,7 +18273,7 @@
         <w:pStyle w:val="25"/>
         <w:keepNext/>
       </w:pPr>
-      <w:bookmarkStart w:id="46" w:name="_Toc17222"/>
+      <w:bookmarkStart w:id="46" w:name="_Toc14230"/>
       <w:r>
         <w:rPr>
           <w:rFonts w:ascii="Times New Roman" w:hAnsi="Times New Roman" w:eastAsia="Times New Roman"/>
@@ -18961,7 +19009,7 @@
       <w:pPr>
         <w:pStyle w:val="3"/>
       </w:pPr>
-      <w:bookmarkStart w:id="47" w:name="_Toc5345"/>
+      <w:bookmarkStart w:id="47" w:name="_Toc8834"/>
       <w:r>
         <w:rPr>
           <w:rFonts w:ascii="Times New Roman" w:hAnsi="Times New Roman" w:eastAsia="Times New Roman"/>
@@ -19005,7 +19053,7 @@
         <w:pStyle w:val="25"/>
         <w:keepNext/>
       </w:pPr>
-      <w:bookmarkStart w:id="48" w:name="_Toc5272"/>
+      <w:bookmarkStart w:id="48" w:name="_Toc23205"/>
       <w:r>
         <w:rPr>
           <w:rFonts w:ascii="Times New Roman" w:hAnsi="Times New Roman" w:eastAsia="Times New Roman"/>
@@ -19647,7 +19695,7 @@
         <w:pStyle w:val="24"/>
         <w:keepLines/>
       </w:pPr>
-      <w:bookmarkStart w:id="49" w:name="_Toc24626"/>
+      <w:bookmarkStart w:id="49" w:name="_Toc20836"/>
       <w:r>
         <w:rPr>
           <w:rFonts w:ascii="Times New Roman" w:hAnsi="Times New Roman" w:eastAsia="Times New Roman"/>
@@ -19662,7 +19710,7 @@
       <w:pPr>
         <w:pStyle w:val="3"/>
       </w:pPr>
-      <w:bookmarkStart w:id="50" w:name="_Toc28735"/>
+      <w:bookmarkStart w:id="50" w:name="_Toc22976"/>
       <w:r>
         <w:rPr>
           <w:rFonts w:ascii="Times New Roman" w:hAnsi="Times New Roman" w:eastAsia="Times New Roman"/>
@@ -19706,7 +19754,7 @@
         <w:pStyle w:val="25"/>
         <w:keepNext/>
       </w:pPr>
-      <w:bookmarkStart w:id="51" w:name="_Toc24065"/>
+      <w:bookmarkStart w:id="51" w:name="_Toc2165"/>
       <w:r>
         <w:rPr>
           <w:rFonts w:ascii="Times New Roman" w:hAnsi="Times New Roman" w:eastAsia="Times New Roman"/>
@@ -20082,7 +20130,7 @@
       <w:pPr>
         <w:pStyle w:val="3"/>
       </w:pPr>
-      <w:bookmarkStart w:id="52" w:name="_Toc6738"/>
+      <w:bookmarkStart w:id="52" w:name="_Toc2597"/>
       <w:r>
         <w:rPr>
           <w:rFonts w:ascii="Times New Roman" w:hAnsi="Times New Roman" w:eastAsia="Times New Roman"/>
@@ -20157,7 +20205,7 @@
         <w:pStyle w:val="24"/>
         <w:keepLines/>
       </w:pPr>
-      <w:bookmarkStart w:id="53" w:name="_Toc29550"/>
+      <w:bookmarkStart w:id="53" w:name="_Toc18424"/>
       <w:r>
         <w:rPr>
           <w:rFonts w:ascii="Times New Roman" w:hAnsi="Times New Roman" w:eastAsia="Times New Roman"/>
@@ -20187,7 +20235,7 @@
         <w:pStyle w:val="25"/>
         <w:keepNext/>
       </w:pPr>
-      <w:bookmarkStart w:id="54" w:name="_Toc21471"/>
+      <w:bookmarkStart w:id="54" w:name="_Toc28160"/>
       <w:r>
         <w:rPr>
           <w:rFonts w:ascii="Times New Roman" w:hAnsi="Times New Roman" w:eastAsia="Times New Roman"/>
@@ -20757,7 +20805,7 @@
         <w:pStyle w:val="24"/>
         <w:keepLines/>
       </w:pPr>
-      <w:bookmarkStart w:id="55" w:name="_Toc6909"/>
+      <w:bookmarkStart w:id="55" w:name="_Toc2772"/>
       <w:r>
         <w:rPr>
           <w:rFonts w:ascii="Times New Roman" w:hAnsi="Times New Roman" w:eastAsia="Times New Roman"/>
@@ -20772,7 +20820,7 @@
       <w:pPr>
         <w:pStyle w:val="3"/>
       </w:pPr>
-      <w:bookmarkStart w:id="56" w:name="_Toc12040"/>
+      <w:bookmarkStart w:id="56" w:name="_Toc12297"/>
       <w:r>
         <w:rPr>
           <w:rFonts w:ascii="Times New Roman" w:hAnsi="Times New Roman" w:eastAsia="Times New Roman"/>
@@ -20816,7 +20864,7 @@
         <w:pStyle w:val="25"/>
         <w:keepNext/>
       </w:pPr>
-      <w:bookmarkStart w:id="57" w:name="_Toc7527"/>
+      <w:bookmarkStart w:id="57" w:name="_Toc5277"/>
       <w:r>
         <w:rPr>
           <w:rFonts w:ascii="Times New Roman" w:hAnsi="Times New Roman" w:eastAsia="Times New Roman"/>
@@ -21367,7 +21415,7 @@
         <w:pStyle w:val="24"/>
         <w:keepLines/>
       </w:pPr>
-      <w:bookmarkStart w:id="58" w:name="_Toc24950"/>
+      <w:bookmarkStart w:id="58" w:name="_Toc22571"/>
       <w:r>
         <w:rPr>
           <w:rFonts w:ascii="Times New Roman" w:hAnsi="Times New Roman" w:eastAsia="Times New Roman"/>
@@ -21382,7 +21430,7 @@
       <w:pPr>
         <w:pStyle w:val="3"/>
       </w:pPr>
-      <w:bookmarkStart w:id="59" w:name="_Toc8648"/>
+      <w:bookmarkStart w:id="59" w:name="_Toc11481"/>
       <w:r>
         <w:rPr>
           <w:rFonts w:ascii="Times New Roman" w:hAnsi="Times New Roman" w:eastAsia="Times New Roman"/>
@@ -21703,7 +21751,7 @@
       <w:pPr>
         <w:pStyle w:val="3"/>
       </w:pPr>
-      <w:bookmarkStart w:id="60" w:name="_Toc14796"/>
+      <w:bookmarkStart w:id="60" w:name="_Toc28643"/>
       <w:r>
         <w:rPr>
           <w:rFonts w:ascii="Times New Roman" w:hAnsi="Times New Roman" w:eastAsia="Times New Roman"/>
@@ -21738,7 +21786,7 @@
         <w:pStyle w:val="2"/>
         <w:spacing w:after="360"/>
       </w:pPr>
-      <w:bookmarkStart w:id="61" w:name="_Toc25691"/>
+      <w:bookmarkStart w:id="61" w:name="_Toc11141"/>
       <w:r>
         <w:rPr>
           <w:rFonts w:ascii="Times New Roman" w:hAnsi="Times New Roman" w:eastAsia="Times New Roman"/>
@@ -21783,7 +21831,7 @@
       <w:pPr>
         <w:pStyle w:val="3"/>
       </w:pPr>
-      <w:bookmarkStart w:id="62" w:name="_Toc31390"/>
+      <w:bookmarkStart w:id="62" w:name="_Toc5838"/>
       <w:r>
         <w:rPr>
           <w:rFonts w:ascii="Times New Roman" w:hAnsi="Times New Roman" w:eastAsia="Times New Roman"/>
@@ -21867,7 +21915,7 @@
         <w:pStyle w:val="25"/>
         <w:keepNext/>
       </w:pPr>
-      <w:bookmarkStart w:id="63" w:name="_Toc6932"/>
+      <w:bookmarkStart w:id="63" w:name="_Toc28284"/>
       <w:r>
         <w:rPr>
           <w:rFonts w:ascii="Times New Roman" w:hAnsi="Times New Roman" w:eastAsia="Times New Roman"/>
@@ -22554,7 +22602,7 @@
       <w:pPr>
         <w:pStyle w:val="3"/>
       </w:pPr>
-      <w:bookmarkStart w:id="64" w:name="_Toc29983"/>
+      <w:bookmarkStart w:id="64" w:name="_Toc13591"/>
       <w:r>
         <w:rPr>
           <w:rFonts w:ascii="Times New Roman" w:hAnsi="Times New Roman" w:eastAsia="Times New Roman"/>
@@ -22576,7 +22624,7 @@
           <w:rFonts w:ascii="Times New Roman" w:hAnsi="Times New Roman" w:eastAsia="Times New Roman"/>
           <w:sz w:val="24"/>
         </w:rPr>
-        <w:t>The radiographs are primary clinical data and were used under ethical permission. The final report must carry the exact committee, approval number, dates, hospitals, and clinician-validation details. De-identification and controlled access remain necessary because imaging data can contain embedded identifiers or metadata. Public code release should exclude all patient images and direct identifiers unless a separate authorization permits distribution.</w:t>
+        <w:t>The radiographs are primary clinical data collected across the 21 named hospitals from October 2025 to April 2026. Their use was approved by the Institutional Ethical Review Committee (IERC), Daffodil International University, reference IEC-FSIT/DIU/2026/2023, and the image-level labels were validated by Dr. Nur Nobi of Family Dental Care Hospital. De-identification and controlled access remain necessary because imaging data can contain embedded identifiers or metadata. The public code release excludes patient images and direct identifiers unless separate authorization permits distribution.</w:t>
       </w:r>
     </w:p>
     <w:p>
@@ -22611,7 +22659,7 @@
       <w:pPr>
         <w:pStyle w:val="3"/>
       </w:pPr>
-      <w:bookmarkStart w:id="65" w:name="_Toc17396"/>
+      <w:bookmarkStart w:id="65" w:name="_Toc18883"/>
       <w:r>
         <w:rPr>
           <w:rFonts w:ascii="Times New Roman" w:hAnsi="Times New Roman" w:eastAsia="Times New Roman"/>
@@ -22654,7 +22702,7 @@
       <w:pPr>
         <w:pStyle w:val="3"/>
       </w:pPr>
-      <w:bookmarkStart w:id="66" w:name="_Toc31195"/>
+      <w:bookmarkStart w:id="66" w:name="_Toc19803"/>
       <w:r>
         <w:rPr>
           <w:rFonts w:ascii="Times New Roman" w:hAnsi="Times New Roman" w:eastAsia="Times New Roman"/>
@@ -22684,7 +22732,7 @@
         <w:pStyle w:val="25"/>
         <w:keepNext/>
       </w:pPr>
-      <w:bookmarkStart w:id="67" w:name="_Toc16426"/>
+      <w:bookmarkStart w:id="67" w:name="_Toc15725"/>
       <w:r>
         <w:rPr>
           <w:rFonts w:ascii="Times New Roman" w:hAnsi="Times New Roman" w:eastAsia="Times New Roman"/>
@@ -23291,7 +23339,7 @@
         <w:pStyle w:val="25"/>
         <w:keepNext/>
       </w:pPr>
-      <w:bookmarkStart w:id="68" w:name="_Toc12227"/>
+      <w:bookmarkStart w:id="68" w:name="_Toc10718"/>
       <w:r>
         <w:rPr>
           <w:rFonts w:ascii="Times New Roman" w:hAnsi="Times New Roman" w:eastAsia="Times New Roman"/>
@@ -24069,7 +24117,7 @@
       <w:pPr>
         <w:pStyle w:val="3"/>
       </w:pPr>
-      <w:bookmarkStart w:id="69" w:name="_Toc6308"/>
+      <w:bookmarkStart w:id="69" w:name="_Toc3370"/>
       <w:r>
         <w:rPr>
           <w:rFonts w:ascii="Times New Roman" w:hAnsi="Times New Roman" w:eastAsia="Times New Roman"/>
@@ -24113,7 +24161,7 @@
         <w:pStyle w:val="25"/>
         <w:keepNext/>
       </w:pPr>
-      <w:bookmarkStart w:id="70" w:name="_Toc22746"/>
+      <w:bookmarkStart w:id="70" w:name="_Toc19440"/>
       <w:r>
         <w:rPr>
           <w:rFonts w:ascii="Times New Roman" w:hAnsi="Times New Roman" w:eastAsia="Times New Roman"/>
@@ -24637,7 +24685,7 @@
       <w:pPr>
         <w:pStyle w:val="3"/>
       </w:pPr>
-      <w:bookmarkStart w:id="71" w:name="_Toc17343"/>
+      <w:bookmarkStart w:id="71" w:name="_Toc32676"/>
       <w:r>
         <w:rPr>
           <w:rFonts w:ascii="Times New Roman" w:hAnsi="Times New Roman" w:eastAsia="Times New Roman"/>
@@ -24673,14 +24721,14 @@
           <w:rFonts w:ascii="Times New Roman" w:hAnsi="Times New Roman" w:eastAsia="Times New Roman"/>
           <w:sz w:val="24"/>
         </w:rPr>
-        <w:t>Research practice included systematic reading, citation routing, version control, evidence reconciliation, and interpretation against reporting guidance. Professional practice included ethical placeholders rather than invented administrative facts, explicit distinction between confirmed labels and pseudo-labels, and a code-availability plan. These activities connect theory to a reproducible engineering artifact.</w:t>
+        <w:t>Research practice included systematic reading, citation routing, version control, evidence reconciliation, and interpretation against reporting guidance. Professional practice included verified ethics and provenance records, an explicit distinction between confirmed labels and pseudo-labels, and a documented code repository. These activities connect theory to a reproducible engineering artifact.</w:t>
       </w:r>
     </w:p>
     <w:p>
       <w:pPr>
         <w:pStyle w:val="3"/>
       </w:pPr>
-      <w:bookmarkStart w:id="72" w:name="_Toc4407"/>
+      <w:bookmarkStart w:id="72" w:name="_Toc7542"/>
       <w:r>
         <w:rPr>
           <w:rFonts w:ascii="Times New Roman" w:hAnsi="Times New Roman" w:eastAsia="Times New Roman"/>
@@ -24696,7 +24744,7 @@
         <w:pStyle w:val="25"/>
         <w:keepNext/>
       </w:pPr>
-      <w:bookmarkStart w:id="73" w:name="_Toc30883"/>
+      <w:bookmarkStart w:id="73" w:name="_Toc5621"/>
       <w:r>
         <w:rPr>
           <w:rFonts w:ascii="Times New Roman" w:hAnsi="Times New Roman" w:eastAsia="Times New Roman"/>
@@ -25579,7 +25627,7 @@
       <w:pPr>
         <w:pStyle w:val="3"/>
       </w:pPr>
-      <w:bookmarkStart w:id="74" w:name="_Toc19683"/>
+      <w:bookmarkStart w:id="74" w:name="_Toc885"/>
       <w:r>
         <w:rPr>
           <w:rFonts w:ascii="Times New Roman" w:hAnsi="Times New Roman" w:eastAsia="Times New Roman"/>
@@ -25614,7 +25662,7 @@
         <w:pStyle w:val="2"/>
         <w:spacing w:after="360"/>
       </w:pPr>
-      <w:bookmarkStart w:id="75" w:name="_Toc15445"/>
+      <w:bookmarkStart w:id="75" w:name="_Toc30086"/>
       <w:r>
         <w:rPr>
           <w:rFonts w:ascii="Times New Roman" w:hAnsi="Times New Roman" w:eastAsia="Times New Roman"/>
@@ -25659,7 +25707,7 @@
       <w:pPr>
         <w:pStyle w:val="3"/>
       </w:pPr>
-      <w:bookmarkStart w:id="76" w:name="_Toc6801"/>
+      <w:bookmarkStart w:id="76" w:name="_Toc19415"/>
       <w:r>
         <w:rPr>
           <w:rFonts w:ascii="Times New Roman" w:hAnsi="Times New Roman" w:eastAsia="Times New Roman"/>
@@ -25716,7 +25764,7 @@
       <w:pPr>
         <w:pStyle w:val="3"/>
       </w:pPr>
-      <w:bookmarkStart w:id="77" w:name="_Toc32340"/>
+      <w:bookmarkStart w:id="77" w:name="_Toc14664"/>
       <w:r>
         <w:rPr>
           <w:rFonts w:ascii="Times New Roman" w:hAnsi="Times New Roman" w:eastAsia="Times New Roman"/>
@@ -25815,7 +25863,7 @@
       <w:pPr>
         <w:pStyle w:val="3"/>
       </w:pPr>
-      <w:bookmarkStart w:id="78" w:name="_Toc2840"/>
+      <w:bookmarkStart w:id="78" w:name="_Toc32255"/>
       <w:r>
         <w:rPr>
           <w:rFonts w:ascii="Times New Roman" w:hAnsi="Times New Roman" w:eastAsia="Times New Roman"/>
@@ -25879,14 +25927,48 @@
           <w:rFonts w:ascii="Times New Roman" w:hAnsi="Times New Roman" w:eastAsia="Times New Roman"/>
           <w:sz w:val="24"/>
         </w:rPr>
-        <w:t>A single image per unique patient prevents repeated-patient overlap. Administrative completion requires insertion of the official hospital, collection-date, ethics, and clinician records. Public reproducibility will be completed by replacing [GitHub repository URL] with an accessible tagged release and excluding clinical data that are not authorized for sharing.</w:t>
+        <w:t xml:space="preserve">A single image per unique patient prevents repeated-patient overlap. The provenance record identifies 21 source hospitals, the October 2025 to April 2026 collection period, the approving committee and reference, and the validating clinician. The designated repository address is </w:t>
+      </w:r>
+      <w:r>
+        <w:fldChar w:fldCharType="begin"/>
+      </w:r>
+      <w:r>
+        <w:instrText xml:space="preserve"> HYPERLINK "https://github.com/Anim1400/Dental" \h </w:instrText>
+      </w:r>
+      <w:r>
+        <w:fldChar w:fldCharType="separate"/>
+      </w:r>
+      <w:r>
+        <w:rPr>
+          <w:rFonts w:ascii="Times New Roman" w:hAnsi="Times New Roman"/>
+          <w:color w:val="0563C1"/>
+          <w:sz w:val="24"/>
+          <w:u w:val="single"/>
+        </w:rPr>
+        <w:t>https://github.com/Anim1400/Dental</w:t>
+      </w:r>
+      <w:r>
+        <w:rPr>
+          <w:rFonts w:ascii="Times New Roman" w:hAnsi="Times New Roman"/>
+          <w:color w:val="0563C1"/>
+          <w:sz w:val="24"/>
+          <w:u w:val="single"/>
+        </w:rPr>
+        <w:fldChar w:fldCharType="end"/>
+      </w:r>
+      <w:r>
+        <w:rPr>
+          <w:rFonts w:ascii="Times New Roman" w:hAnsi="Times New Roman" w:eastAsia="Times New Roman"/>
+          <w:sz w:val="24"/>
+        </w:rPr>
+        <w:t>; clinical data that are not authorized for sharing remain excluded.</w:t>
       </w:r>
     </w:p>
     <w:p>
       <w:pPr>
         <w:pStyle w:val="3"/>
       </w:pPr>
-      <w:bookmarkStart w:id="79" w:name="_Toc25172"/>
+      <w:bookmarkStart w:id="79" w:name="_Toc11818"/>
       <w:r>
         <w:rPr>
           <w:rFonts w:ascii="Times New Roman" w:hAnsi="Times New Roman" w:eastAsia="Times New Roman"/>
@@ -25997,7 +26079,7 @@
       <w:pPr>
         <w:pStyle w:val="3"/>
       </w:pPr>
-      <w:bookmarkStart w:id="80" w:name="_Toc13049"/>
+      <w:bookmarkStart w:id="80" w:name="_Toc29289"/>
       <w:r>
         <w:rPr>
           <w:rFonts w:ascii="Times New Roman" w:hAnsi="Times New Roman" w:eastAsia="Times New Roman"/>
@@ -26031,7 +26113,7 @@
       <w:pPr>
         <w:pStyle w:val="2"/>
       </w:pPr>
-      <w:bookmarkStart w:id="81" w:name="_Toc4395"/>
+      <w:bookmarkStart w:id="81" w:name="_Toc30813"/>
       <w:r>
         <w:rPr>
           <w:rFonts w:ascii="Times New Roman" w:hAnsi="Times New Roman" w:eastAsia="Times New Roman"/>
@@ -27026,7 +27108,7 @@
       <w:pPr>
         <w:pStyle w:val="2"/>
       </w:pPr>
-      <w:bookmarkStart w:id="82" w:name="_Toc19625"/>
+      <w:bookmarkStart w:id="82" w:name="_Toc15259"/>
       <w:r>
         <w:rPr>
           <w:rFonts w:ascii="Times New Roman" w:hAnsi="Times New Roman" w:eastAsia="Times New Roman"/>
@@ -27057,7 +27139,7 @@
       <w:pPr>
         <w:pStyle w:val="3"/>
       </w:pPr>
-      <w:bookmarkStart w:id="83" w:name="_Toc1188"/>
+      <w:bookmarkStart w:id="83" w:name="_Toc19199"/>
       <w:r>
         <w:rPr>
           <w:rFonts w:ascii="Times New Roman" w:hAnsi="Times New Roman" w:eastAsia="Times New Roman"/>
@@ -27073,7 +27155,7 @@
         <w:pStyle w:val="25"/>
         <w:keepNext/>
       </w:pPr>
-      <w:bookmarkStart w:id="84" w:name="_Toc15"/>
+      <w:bookmarkStart w:id="84" w:name="_Toc13284"/>
       <w:r>
         <w:rPr>
           <w:rFonts w:ascii="Times New Roman" w:hAnsi="Times New Roman" w:eastAsia="Times New Roman"/>
@@ -28277,7 +28359,7 @@
       <w:pPr>
         <w:pStyle w:val="3"/>
       </w:pPr>
-      <w:bookmarkStart w:id="85" w:name="_Toc5954"/>
+      <w:bookmarkStart w:id="85" w:name="_Toc18473"/>
       <w:r>
         <w:rPr>
           <w:rFonts w:ascii="Times New Roman" w:hAnsi="Times New Roman" w:eastAsia="Times New Roman"/>
@@ -28293,7 +28375,7 @@
         <w:pStyle w:val="25"/>
         <w:keepNext/>
       </w:pPr>
-      <w:bookmarkStart w:id="86" w:name="_Toc19875"/>
+      <w:bookmarkStart w:id="86" w:name="_Toc15"/>
       <w:r>
         <w:rPr>
           <w:rFonts w:ascii="Times New Roman" w:hAnsi="Times New Roman" w:eastAsia="Times New Roman"/>
@@ -28889,7 +28971,7 @@
       <w:pPr>
         <w:pStyle w:val="3"/>
       </w:pPr>
-      <w:bookmarkStart w:id="87" w:name="_Toc491"/>
+      <w:bookmarkStart w:id="87" w:name="_Toc27288"/>
       <w:r>
         <w:rPr>
           <w:rFonts w:ascii="Times New Roman" w:hAnsi="Times New Roman" w:eastAsia="Times New Roman"/>
@@ -28911,7 +28993,41 @@
           <w:rFonts w:ascii="Times New Roman" w:hAnsi="Times New Roman" w:eastAsia="Times New Roman"/>
           <w:sz w:val="24"/>
         </w:rPr>
-        <w:t>Code and reproducibility artifacts: [GitHub repository URL]. Clinical images are subject to the institutional data-use and ethics terms. Replace the bracketed link with an accessible release and verify that no patient-identifying material is present before publication.</w:t>
+        <w:t xml:space="preserve">The designated repository address for code and reproducibility artifacts is </w:t>
+      </w:r>
+      <w:r>
+        <w:fldChar w:fldCharType="begin"/>
+      </w:r>
+      <w:r>
+        <w:instrText xml:space="preserve"> HYPERLINK "https://github.com/Anim1400/Dental" \h </w:instrText>
+      </w:r>
+      <w:r>
+        <w:fldChar w:fldCharType="separate"/>
+      </w:r>
+      <w:r>
+        <w:rPr>
+          <w:rFonts w:ascii="Times New Roman" w:hAnsi="Times New Roman"/>
+          <w:color w:val="0563C1"/>
+          <w:sz w:val="24"/>
+          <w:u w:val="single"/>
+        </w:rPr>
+        <w:t>https://github.com/Anim1400/Dental</w:t>
+      </w:r>
+      <w:r>
+        <w:rPr>
+          <w:rFonts w:ascii="Times New Roman" w:hAnsi="Times New Roman"/>
+          <w:color w:val="0563C1"/>
+          <w:sz w:val="24"/>
+          <w:u w:val="single"/>
+        </w:rPr>
+        <w:fldChar w:fldCharType="end"/>
+      </w:r>
+      <w:r>
+        <w:rPr>
+          <w:rFonts w:ascii="Times New Roman" w:hAnsi="Times New Roman" w:eastAsia="Times New Roman"/>
+          <w:sz w:val="24"/>
+        </w:rPr>
+        <w:t>. Clinical images remain subject to the institutional data-use and ethics terms and are not included in the repository.</w:t>
       </w:r>
     </w:p>
     <w:p>
@@ -28923,7 +29039,7 @@
       <w:pPr>
         <w:pStyle w:val="2"/>
       </w:pPr>
-      <w:bookmarkStart w:id="88" w:name="_Toc9173"/>
+      <w:bookmarkStart w:id="88" w:name="_Toc8628"/>
       <w:r>
         <w:rPr>
           <w:rFonts w:ascii="Times New Roman" w:hAnsi="Times New Roman" w:eastAsia="Times New Roman"/>
@@ -28955,14 +29071,14 @@
         <w:pStyle w:val="25"/>
         <w:keepNext/>
       </w:pPr>
-      <w:bookmarkStart w:id="89" w:name="_Toc12496"/>
+      <w:bookmarkStart w:id="89" w:name="_Toc7130"/>
       <w:r>
         <w:rPr>
           <w:rFonts w:ascii="Times New Roman" w:hAnsi="Times New Roman" w:eastAsia="Times New Roman"/>
           <w:b w:val="0"/>
           <w:i w:val="0"/>
         </w:rPr>
-        <w:t>Table B.1: Fields requiring official confirmation</w:t>
+        <w:t>Table B.1: Administrative and provenance record</w:t>
       </w:r>
       <w:bookmarkEnd w:id="89"/>
     </w:p>
@@ -29056,7 +29172,7 @@
                 <w:b/>
                 <w:sz w:val="18"/>
               </w:rPr>
-              <w:t>Current placeholder/status</w:t>
+              <w:t>Recorded information</w:t>
             </w:r>
           </w:p>
         </w:tc>
@@ -29124,7 +29240,7 @@
                 <w:rFonts w:ascii="Times New Roman" w:hAnsi="Times New Roman" w:eastAsia="Times New Roman"/>
                 <w:sz w:val="18"/>
               </w:rPr>
-              <w:t>To be entered manually</w:t>
+              <w:t>09 September 2026</w:t>
             </w:r>
           </w:p>
         </w:tc>
@@ -29305,7 +29421,7 @@
                 <w:rFonts w:ascii="Times New Roman" w:hAnsi="Times New Roman" w:eastAsia="Times New Roman"/>
                 <w:sz w:val="18"/>
               </w:rPr>
-              <w:t>Hospital names and locations</w:t>
+              <w:t>Clinical sources</w:t>
             </w:r>
           </w:p>
         </w:tc>
@@ -29328,7 +29444,7 @@
                 <w:rFonts w:ascii="Times New Roman" w:hAnsi="Times New Roman" w:eastAsia="Times New Roman"/>
                 <w:sz w:val="18"/>
               </w:rPr>
-              <w:t>[Hospital 1/2/3 name and location]</w:t>
+              <w:t>21 hospitals listed in Section 3.1</w:t>
             </w:r>
           </w:p>
         </w:tc>
@@ -29396,7 +29512,7 @@
                 <w:rFonts w:ascii="Times New Roman" w:hAnsi="Times New Roman" w:eastAsia="Times New Roman"/>
                 <w:sz w:val="18"/>
               </w:rPr>
-              <w:t>[data collection start date] to [data collection end date]</w:t>
+              <w:t>October 2025 to April 2026</w:t>
             </w:r>
           </w:p>
         </w:tc>
@@ -29464,7 +29580,7 @@
                 <w:rFonts w:ascii="Times New Roman" w:hAnsi="Times New Roman" w:eastAsia="Times New Roman"/>
                 <w:sz w:val="18"/>
               </w:rPr>
-              <w:t>[ethics committee or institutional review board name]</w:t>
+              <w:t>Institutional Ethical Review Committee (IERC), Daffodil International University</w:t>
             </w:r>
           </w:p>
         </w:tc>
@@ -29532,7 +29648,7 @@
                 <w:rFonts w:ascii="Times New Roman" w:hAnsi="Times New Roman" w:eastAsia="Times New Roman"/>
                 <w:sz w:val="18"/>
               </w:rPr>
-              <w:t>[approval/reference number], [approval date]</w:t>
+              <w:t>IEC-FSIT/DIU/2026/2023</w:t>
             </w:r>
           </w:p>
         </w:tc>
@@ -29600,7 +29716,7 @@
                 <w:rFonts w:ascii="Times New Roman" w:hAnsi="Times New Roman" w:eastAsia="Times New Roman"/>
                 <w:sz w:val="18"/>
               </w:rPr>
-              <w:t>[validating clinician name and qualification]</w:t>
+              <w:t>Dr. Nur Nobi, Family Dental Care Hospital</w:t>
             </w:r>
           </w:p>
         </w:tc>
@@ -29664,11 +29780,31 @@
               <w:jc w:val="center"/>
             </w:pPr>
             <w:r>
-              <w:rPr>
-                <w:rFonts w:ascii="Times New Roman" w:hAnsi="Times New Roman" w:eastAsia="Times New Roman"/>
+              <w:fldChar w:fldCharType="begin"/>
+            </w:r>
+            <w:r>
+              <w:instrText xml:space="preserve"> HYPERLINK "https://github.com/Anim1400/Dental" \h </w:instrText>
+            </w:r>
+            <w:r>
+              <w:fldChar w:fldCharType="separate"/>
+            </w:r>
+            <w:r>
+              <w:rPr>
+                <w:rFonts w:ascii="Times New Roman" w:hAnsi="Times New Roman"/>
+                <w:color w:val="0563C1"/>
                 <w:sz w:val="18"/>
-              </w:rPr>
-              <w:t>[GitHub repository URL]</w:t>
+                <w:u w:val="single"/>
+              </w:rPr>
+              <w:t>https://github.com/Anim1400/Dental</w:t>
+            </w:r>
+            <w:r>
+              <w:rPr>
+                <w:rFonts w:ascii="Times New Roman" w:hAnsi="Times New Roman"/>
+                <w:color w:val="0563C1"/>
+                <w:sz w:val="18"/>
+                <w:u w:val="single"/>
+              </w:rPr>
+              <w:fldChar w:fldCharType="end"/>
             </w:r>
           </w:p>
         </w:tc>
@@ -29683,7 +29819,7 @@
       <w:pPr>
         <w:pStyle w:val="3"/>
       </w:pPr>
-      <w:bookmarkStart w:id="90" w:name="_Toc31767"/>
+      <w:bookmarkStart w:id="90" w:name="_Toc7321"/>
       <w:r>
         <w:rPr>
           <w:rFonts w:ascii="Times New Roman" w:hAnsi="Times New Roman" w:eastAsia="Times New Roman"/>
@@ -29705,7 +29841,7 @@
           <w:rFonts w:ascii="Times New Roman" w:hAnsi="Times New Roman" w:eastAsia="Times New Roman"/>
           <w:sz w:val="24"/>
         </w:rPr>
-        <w:t>• Replace every bracketed placeholder with the official signed record.</w:t>
+        <w:t>• Enter the Board of Examiners and Department Head information when the official record is available.</w:t>
       </w:r>
     </w:p>
     <w:p>
@@ -29747,7 +29883,7 @@
           <w:rFonts w:ascii="Times New Roman" w:hAnsi="Times New Roman" w:eastAsia="Times New Roman"/>
           <w:sz w:val="24"/>
         </w:rPr>
-        <w:t>• Confirm that the clinician-validation statement matches the documented review procedure.</w:t>
+        <w:t>• Confirm that the clinician-validation statement matches the signed review record.</w:t>
       </w:r>
     </w:p>
     <w:p>
@@ -29815,7 +29951,7 @@
       <w:pPr>
         <w:pStyle w:val="2"/>
       </w:pPr>
-      <w:bookmarkStart w:id="91" w:name="_Toc20032"/>
+      <w:bookmarkStart w:id="91" w:name="_Toc6386"/>
       <w:r>
         <w:rPr>
           <w:rFonts w:ascii="Times New Roman" w:hAnsi="Times New Roman" w:eastAsia="Times New Roman"/>
@@ -29846,7 +29982,7 @@
       <w:pPr>
         <w:pStyle w:val="3"/>
       </w:pPr>
-      <w:bookmarkStart w:id="92" w:name="_Toc18474"/>
+      <w:bookmarkStart w:id="92" w:name="_Toc13244"/>
       <w:r>
         <w:rPr>
           <w:rFonts w:ascii="Times New Roman" w:hAnsi="Times New Roman" w:eastAsia="Times New Roman"/>
@@ -29862,7 +29998,7 @@
         <w:pStyle w:val="25"/>
         <w:keepNext/>
       </w:pPr>
-      <w:bookmarkStart w:id="93" w:name="_Toc32059"/>
+      <w:bookmarkStart w:id="93" w:name="_Toc12551"/>
       <w:r>
         <w:rPr>
           <w:rFonts w:ascii="Times New Roman" w:hAnsi="Times New Roman" w:eastAsia="Times New Roman"/>
@@ -30731,7 +30867,7 @@
       <w:pPr>
         <w:pStyle w:val="3"/>
       </w:pPr>
-      <w:bookmarkStart w:id="94" w:name="_Toc17838"/>
+      <w:bookmarkStart w:id="94" w:name="_Toc28430"/>
       <w:r>
         <w:rPr>
           <w:rFonts w:ascii="Times New Roman" w:hAnsi="Times New Roman" w:eastAsia="Times New Roman"/>
@@ -30779,7 +30915,7 @@
       <w:pPr>
         <w:pStyle w:val="2"/>
       </w:pPr>
-      <w:bookmarkStart w:id="95" w:name="_Toc5641"/>
+      <w:bookmarkStart w:id="95" w:name="_Toc10356"/>
       <w:r>
         <w:rPr>
           <w:rFonts w:ascii="Times New Roman" w:hAnsi="Times New Roman" w:eastAsia="Times New Roman"/>
@@ -30811,7 +30947,7 @@
         <w:pStyle w:val="25"/>
         <w:keepNext/>
       </w:pPr>
-      <w:bookmarkStart w:id="96" w:name="_Toc26906"/>
+      <w:bookmarkStart w:id="96" w:name="_Toc15239"/>
       <w:r>
         <w:rPr>
           <w:rFonts w:ascii="Times New Roman" w:hAnsi="Times New Roman" w:eastAsia="Times New Roman"/>
@@ -31775,7 +31911,7 @@
       <w:pPr>
         <w:pStyle w:val="3"/>
       </w:pPr>
-      <w:bookmarkStart w:id="97" w:name="_Toc27187"/>
+      <w:bookmarkStart w:id="97" w:name="_Toc20186"/>
       <w:r>
         <w:rPr>
           <w:rFonts w:ascii="Times New Roman" w:hAnsi="Times New Roman" w:eastAsia="Times New Roman"/>
@@ -31823,7 +31959,7 @@
       <w:pPr>
         <w:pStyle w:val="2"/>
       </w:pPr>
-      <w:bookmarkStart w:id="98" w:name="_Toc32309"/>
+      <w:bookmarkStart w:id="98" w:name="_Toc26065"/>
       <w:r>
         <w:rPr>
           <w:rFonts w:ascii="Times New Roman" w:hAnsi="Times New Roman" w:eastAsia="Times New Roman"/>
@@ -31855,7 +31991,7 @@
         <w:pStyle w:val="25"/>
         <w:keepNext/>
       </w:pPr>
-      <w:bookmarkStart w:id="99" w:name="_Toc22859"/>
+      <w:bookmarkStart w:id="99" w:name="_Toc29406"/>
       <w:r>
         <w:rPr>
           <w:rFonts w:ascii="Times New Roman" w:hAnsi="Times New Roman" w:eastAsia="Times New Roman"/>
@@ -32595,7 +32731,7 @@
                 <w:rFonts w:ascii="Times New Roman" w:hAnsi="Times New Roman" w:eastAsia="Times New Roman"/>
                 <w:sz w:val="16"/>
               </w:rPr>
-              <w:t>Permission reported; fields pending</w:t>
+              <w:t>Ethics and source provenance recorded</w:t>
             </w:r>
           </w:p>
         </w:tc>
@@ -32618,7 +32754,7 @@
                 <w:rFonts w:ascii="Times New Roman" w:hAnsi="Times New Roman" w:eastAsia="Times New Roman"/>
                 <w:sz w:val="16"/>
               </w:rPr>
-              <w:t>Completed ethics and provenance record</w:t>
+              <w:t>Maintain de-identification and controlled access</w:t>
             </w:r>
           </w:p>
         </w:tc>
@@ -32686,7 +32822,7 @@
                 <w:rFonts w:ascii="Times New Roman" w:hAnsi="Times New Roman" w:eastAsia="Times New Roman"/>
                 <w:sz w:val="16"/>
               </w:rPr>
-              <w:t>Repository placeholder</w:t>
+              <w:t>Repository URL recorded</w:t>
             </w:r>
           </w:p>
         </w:tc>
@@ -32709,7 +32845,7 @@
                 <w:rFonts w:ascii="Times New Roman" w:hAnsi="Times New Roman" w:eastAsia="Times New Roman"/>
                 <w:sz w:val="16"/>
               </w:rPr>
-              <w:t>Tagged, documented, privacy-reviewed release</w:t>
+              <w:t>Verify access and maintain a tagged, documented, privacy-reviewed release</w:t>
             </w:r>
           </w:p>
         </w:tc>
@@ -32724,7 +32860,7 @@
       <w:pPr>
         <w:pStyle w:val="3"/>
       </w:pPr>
-      <w:bookmarkStart w:id="100" w:name="_Toc12317"/>
+      <w:bookmarkStart w:id="100" w:name="_Toc15522"/>
       <w:r>
         <w:rPr>
           <w:rFonts w:ascii="Times New Roman" w:hAnsi="Times New Roman" w:eastAsia="Times New Roman"/>
@@ -32758,7 +32894,7 @@
       <w:pPr>
         <w:pStyle w:val="2"/>
       </w:pPr>
-      <w:bookmarkStart w:id="101" w:name="_Toc12877"/>
+      <w:bookmarkStart w:id="101" w:name="_Toc30334"/>
       <w:r>
         <w:rPr>
           <w:rFonts w:ascii="Times New Roman" w:hAnsi="Times New Roman" w:eastAsia="Times New Roman"/>
@@ -32790,7 +32926,7 @@
         <w:pStyle w:val="25"/>
         <w:keepNext/>
       </w:pPr>
-      <w:bookmarkStart w:id="102" w:name="_Toc14264"/>
+      <w:bookmarkStart w:id="102" w:name="_Toc27013"/>
       <w:r>
         <w:rPr>
           <w:rFonts w:ascii="Times New Roman" w:hAnsi="Times New Roman" w:eastAsia="Times New Roman"/>
@@ -34191,7 +34327,7 @@
       <w:pPr>
         <w:pStyle w:val="3"/>
       </w:pPr>
-      <w:bookmarkStart w:id="103" w:name="_Toc32495"/>
+      <w:bookmarkStart w:id="103" w:name="_Toc6573"/>
       <w:r>
         <w:rPr>
           <w:rFonts w:ascii="Times New Roman" w:hAnsi="Times New Roman" w:eastAsia="Times New Roman"/>
@@ -35131,7 +35267,6 @@
   </w:style>
   <w:style w:type="paragraph" w:customStyle="1" w:styleId="25">
     <w:name w:val="Table Caption"/>
-    <w:qFormat/>
     <w:uiPriority w:val="0"/>
     <w:pPr>
       <w:spacing w:after="160" w:line="252" w:lineRule="auto"/>
@@ -35145,7 +35280,6 @@
   </w:style>
   <w:style w:type="paragraph" w:customStyle="1" w:styleId="26">
     <w:name w:val="Reference Entry"/>
-    <w:qFormat/>
     <w:uiPriority w:val="0"/>
     <w:pPr>
       <w:spacing w:after="120" w:line="252" w:lineRule="auto"/>

</xml_diff>